<commit_message>
UI updated - Save and Next
</commit_message>
<xml_diff>
--- a/templates/taxes/contract_template.docx
+++ b/templates/taxes/contract_template.docx
@@ -378,7 +378,43 @@
           <w:szCs w:val="20"/>
           <w:lang w:val="bg-BG"/>
         </w:rPr>
-        <w:t>{{ contract_data.first_name }} {{contract_data.family_name }}</w:t>
+        <w:t xml:space="preserve">{{ </w:t>
+      </w:r>
+      <w:r>
+        <w:rPr>
+          <w:rFonts w:asciiTheme="minorHAnsi" w:hAnsiTheme="minorHAnsi" w:cstheme="minorHAnsi"/>
+          <w:sz w:val="20"/>
+          <w:szCs w:val="20"/>
+          <w:lang w:val="bg-BG"/>
+        </w:rPr>
+        <w:t>contract_data</w:t>
+      </w:r>
+      <w:r>
+        <w:rPr>
+          <w:rFonts w:asciiTheme="minorHAnsi" w:hAnsiTheme="minorHAnsi" w:cstheme="minorHAnsi"/>
+          <w:sz w:val="20"/>
+          <w:szCs w:val="20"/>
+          <w:lang w:val="bg-BG"/>
+        </w:rPr>
+        <w:t>.first_name }} {{</w:t>
+      </w:r>
+      <w:r>
+        <w:rPr>
+          <w:rFonts w:asciiTheme="minorHAnsi" w:hAnsiTheme="minorHAnsi" w:cstheme="minorHAnsi"/>
+          <w:sz w:val="20"/>
+          <w:szCs w:val="20"/>
+          <w:lang w:val="bg-BG"/>
+        </w:rPr>
+        <w:t>contract_data</w:t>
+      </w:r>
+      <w:r>
+        <w:rPr>
+          <w:rFonts w:asciiTheme="minorHAnsi" w:hAnsiTheme="minorHAnsi" w:cstheme="minorHAnsi"/>
+          <w:sz w:val="20"/>
+          <w:szCs w:val="20"/>
+          <w:lang w:val="bg-BG"/>
+        </w:rPr>
+        <w:t>.family_name }}</w:t>
       </w:r>
       <w:r>
         <w:rPr>
@@ -420,31 +456,121 @@
           <w:szCs w:val="20"/>
           <w:lang w:val="bg-BG"/>
         </w:rPr>
-        <w:t xml:space="preserve">адрес: {{ contract_data.address }}, {{ contract_data.city }}, {{ contract_data.country }}, </w:t>
-      </w:r>
-    </w:p>
-    <w:p>
-      <w:pPr>
-        <w:pStyle w:val="Default"/>
-        <w:tabs>
-          <w:tab w:val="left" w:pos="3870"/>
-        </w:tabs>
-        <w:ind w:left="-180" w:right="-450"/>
-        <w:rPr>
-          <w:rFonts w:asciiTheme="minorHAnsi" w:hAnsiTheme="minorHAnsi" w:cstheme="minorHAnsi"/>
-          <w:sz w:val="20"/>
-          <w:szCs w:val="20"/>
-          <w:lang w:val="bg-BG"/>
-        </w:rPr>
-      </w:pPr>
-      <w:r>
-        <w:rPr>
-          <w:rFonts w:asciiTheme="minorHAnsi" w:hAnsiTheme="minorHAnsi" w:cstheme="minorHAnsi"/>
-          <w:sz w:val="20"/>
-          <w:szCs w:val="20"/>
-          <w:lang w:val="bg-BG"/>
-        </w:rPr>
-        <w:t xml:space="preserve">тел.: {{ contract_data.phone_number }}, Email: {{ contract_data.email }}, </w:t>
+        <w:t xml:space="preserve">адрес: {{ </w:t>
+      </w:r>
+      <w:r>
+        <w:rPr>
+          <w:rFonts w:asciiTheme="minorHAnsi" w:hAnsiTheme="minorHAnsi" w:cstheme="minorHAnsi"/>
+          <w:sz w:val="20"/>
+          <w:szCs w:val="20"/>
+          <w:lang w:val="bg-BG"/>
+        </w:rPr>
+        <w:t>contract_data</w:t>
+      </w:r>
+      <w:r>
+        <w:rPr>
+          <w:rFonts w:asciiTheme="minorHAnsi" w:hAnsiTheme="minorHAnsi" w:cstheme="minorHAnsi"/>
+          <w:sz w:val="20"/>
+          <w:szCs w:val="20"/>
+          <w:lang w:val="bg-BG"/>
+        </w:rPr>
+        <w:t xml:space="preserve">.address }}, {{ </w:t>
+      </w:r>
+      <w:r>
+        <w:rPr>
+          <w:rFonts w:asciiTheme="minorHAnsi" w:hAnsiTheme="minorHAnsi" w:cstheme="minorHAnsi"/>
+          <w:sz w:val="20"/>
+          <w:szCs w:val="20"/>
+          <w:lang w:val="bg-BG"/>
+        </w:rPr>
+        <w:t>contract_data</w:t>
+      </w:r>
+      <w:r>
+        <w:rPr>
+          <w:rFonts w:asciiTheme="minorHAnsi" w:hAnsiTheme="minorHAnsi" w:cstheme="minorHAnsi"/>
+          <w:sz w:val="20"/>
+          <w:szCs w:val="20"/>
+          <w:lang w:val="bg-BG"/>
+        </w:rPr>
+        <w:t xml:space="preserve">.city }}, {{ </w:t>
+      </w:r>
+      <w:r>
+        <w:rPr>
+          <w:rFonts w:asciiTheme="minorHAnsi" w:hAnsiTheme="minorHAnsi" w:cstheme="minorHAnsi"/>
+          <w:sz w:val="20"/>
+          <w:szCs w:val="20"/>
+          <w:lang w:val="bg-BG"/>
+        </w:rPr>
+        <w:t>contract_data</w:t>
+      </w:r>
+      <w:r>
+        <w:rPr>
+          <w:rFonts w:asciiTheme="minorHAnsi" w:hAnsiTheme="minorHAnsi" w:cstheme="minorHAnsi"/>
+          <w:sz w:val="20"/>
+          <w:szCs w:val="20"/>
+          <w:lang w:val="bg-BG"/>
+        </w:rPr>
+        <w:t xml:space="preserve">.country }}, </w:t>
+      </w:r>
+    </w:p>
+    <w:p>
+      <w:pPr>
+        <w:pStyle w:val="Default"/>
+        <w:tabs>
+          <w:tab w:val="left" w:pos="3870"/>
+        </w:tabs>
+        <w:ind w:left="-180" w:right="-450"/>
+        <w:rPr>
+          <w:rFonts w:asciiTheme="minorHAnsi" w:hAnsiTheme="minorHAnsi" w:cstheme="minorHAnsi"/>
+          <w:sz w:val="20"/>
+          <w:szCs w:val="20"/>
+          <w:lang w:val="bg-BG"/>
+        </w:rPr>
+      </w:pPr>
+      <w:r>
+        <w:rPr>
+          <w:rFonts w:asciiTheme="minorHAnsi" w:hAnsiTheme="minorHAnsi" w:cstheme="minorHAnsi"/>
+          <w:sz w:val="20"/>
+          <w:szCs w:val="20"/>
+          <w:lang w:val="bg-BG"/>
+        </w:rPr>
+        <w:t xml:space="preserve">тел.: {{ </w:t>
+      </w:r>
+      <w:r>
+        <w:rPr>
+          <w:rFonts w:asciiTheme="minorHAnsi" w:hAnsiTheme="minorHAnsi" w:cstheme="minorHAnsi"/>
+          <w:sz w:val="20"/>
+          <w:szCs w:val="20"/>
+          <w:lang w:val="bg-BG"/>
+        </w:rPr>
+        <w:t>contract_data</w:t>
+      </w:r>
+      <w:r>
+        <w:rPr>
+          <w:rFonts w:asciiTheme="minorHAnsi" w:hAnsiTheme="minorHAnsi" w:cstheme="minorHAnsi"/>
+          <w:sz w:val="20"/>
+          <w:szCs w:val="20"/>
+          <w:lang w:val="bg-BG"/>
+        </w:rPr>
+        <w:t xml:space="preserve">.phone_number }}, Email: {{ </w:t>
+      </w:r>
+      <w:r>
+        <w:rPr>
+          <w:rFonts w:asciiTheme="minorHAnsi" w:hAnsiTheme="minorHAnsi" w:cstheme="minorHAnsi"/>
+          <w:sz w:val="20"/>
+          <w:szCs w:val="20"/>
+          <w:lang w:val="bg-BG"/>
+        </w:rPr>
+        <w:t>contract_data</w:t>
+      </w:r>
+      <w:r>
+        <w:rPr>
+          <w:rFonts w:asciiTheme="minorHAnsi" w:hAnsiTheme="minorHAnsi" w:cstheme="minorHAnsi"/>
+          <w:sz w:val="20"/>
+          <w:szCs w:val="20"/>
+          <w:lang w:val="bg-BG"/>
+        </w:rPr>
+        <w:t xml:space="preserve">.email }}, </w:t>
       </w:r>
       <w:r>
         <w:rPr>
@@ -462,7 +588,43 @@
           <w:szCs w:val="20"/>
           <w:lang w:val="bg-BG"/>
         </w:rPr>
-        <w:t>л.к. номер {{ contract_data.id_number }} издадена {{ contract_data.issue_date }} ,</w:t>
+        <w:t xml:space="preserve">л.к. номер {{ </w:t>
+      </w:r>
+      <w:r>
+        <w:rPr>
+          <w:rFonts w:asciiTheme="minorHAnsi" w:hAnsiTheme="minorHAnsi" w:cstheme="minorHAnsi"/>
+          <w:sz w:val="20"/>
+          <w:szCs w:val="20"/>
+          <w:lang w:val="bg-BG"/>
+        </w:rPr>
+        <w:t>contract_data</w:t>
+      </w:r>
+      <w:r>
+        <w:rPr>
+          <w:rFonts w:asciiTheme="minorHAnsi" w:hAnsiTheme="minorHAnsi" w:cstheme="minorHAnsi"/>
+          <w:sz w:val="20"/>
+          <w:szCs w:val="20"/>
+          <w:lang w:val="bg-BG"/>
+        </w:rPr>
+        <w:t xml:space="preserve">.id_number }} издадена {{ </w:t>
+      </w:r>
+      <w:r>
+        <w:rPr>
+          <w:rFonts w:asciiTheme="minorHAnsi" w:hAnsiTheme="minorHAnsi" w:cstheme="minorHAnsi"/>
+          <w:sz w:val="20"/>
+          <w:szCs w:val="20"/>
+          <w:lang w:val="bg-BG"/>
+        </w:rPr>
+        <w:t>contract_data</w:t>
+      </w:r>
+      <w:r>
+        <w:rPr>
+          <w:rFonts w:asciiTheme="minorHAnsi" w:hAnsiTheme="minorHAnsi" w:cstheme="minorHAnsi"/>
+          <w:sz w:val="20"/>
+          <w:szCs w:val="20"/>
+          <w:lang w:val="bg-BG"/>
+        </w:rPr>
+        <w:t>.issue_date }} ,</w:t>
       </w:r>
     </w:p>
     <w:p>
@@ -4069,7 +4231,43 @@
           <w:szCs w:val="20"/>
           <w:lang w:val="bg-BG"/>
         </w:rPr>
-        <w:t xml:space="preserve"> {{ contract_data.first_name }} {{contract_data.family_name }}</w:t>
+        <w:t xml:space="preserve"> {{ </w:t>
+      </w:r>
+      <w:r>
+        <w:rPr>
+          <w:rFonts w:asciiTheme="minorHAnsi" w:hAnsiTheme="minorHAnsi" w:cstheme="minorHAnsi"/>
+          <w:sz w:val="20"/>
+          <w:szCs w:val="20"/>
+          <w:lang w:val="bg-BG"/>
+        </w:rPr>
+        <w:t>contract_data</w:t>
+      </w:r>
+      <w:r>
+        <w:rPr>
+          <w:rFonts w:asciiTheme="minorHAnsi" w:hAnsiTheme="minorHAnsi" w:cstheme="minorHAnsi"/>
+          <w:sz w:val="20"/>
+          <w:szCs w:val="20"/>
+          <w:lang w:val="bg-BG"/>
+        </w:rPr>
+        <w:t>.first_name }} {{</w:t>
+      </w:r>
+      <w:r>
+        <w:rPr>
+          <w:rFonts w:asciiTheme="minorHAnsi" w:hAnsiTheme="minorHAnsi" w:cstheme="minorHAnsi"/>
+          <w:sz w:val="20"/>
+          <w:szCs w:val="20"/>
+          <w:lang w:val="bg-BG"/>
+        </w:rPr>
+        <w:t>contract_data</w:t>
+      </w:r>
+      <w:r>
+        <w:rPr>
+          <w:rFonts w:asciiTheme="minorHAnsi" w:hAnsiTheme="minorHAnsi" w:cstheme="minorHAnsi"/>
+          <w:sz w:val="20"/>
+          <w:szCs w:val="20"/>
+          <w:lang w:val="bg-BG"/>
+        </w:rPr>
+        <w:t>.family_name }}</w:t>
       </w:r>
     </w:p>
     <w:p>
@@ -6036,4 +6234,16 @@
     </a:ext>
   </a:extLst>
 </a:theme>
+</file>
+
+<file path=customXml/item1.xml><?xml version="1.0" encoding="utf-8"?>
+<b:Sources xmlns:b="http://schemas.openxmlformats.org/officeDocument/2006/bibliography" xmlns="http://schemas.openxmlformats.org/officeDocument/2006/bibliography" SelectedStyle="\APASixthEditionOfficeOnline.xsl" StyleName="APA" Version="6"/>
+</file>
+
+<file path=customXml/itemProps1.xml><?xml version="1.0" encoding="utf-8"?>
+<ds:datastoreItem xmlns:ds="http://schemas.openxmlformats.org/officeDocument/2006/customXml" ds:itemID="{FF3493F4-EAFC-4F17-8071-1130137EA154}">
+  <ds:schemaRefs>
+    <ds:schemaRef ds:uri="http://schemas.openxmlformats.org/officeDocument/2006/bibliography"/>
+  </ds:schemaRefs>
+</ds:datastoreItem>
 </file>
</xml_diff>

<commit_message>
Taxes functionalite - cleaned, admin view updated statuses
</commit_message>
<xml_diff>
--- a/templates/taxes/contract_template.docx
+++ b/templates/taxes/contract_template.docx
@@ -4101,18 +4101,26 @@
     </w:p>
     <w:p>
       <w:pPr>
-        <w:pStyle w:val="Default"/>
-        <w:tabs>
-          <w:tab w:val="left" w:pos="3870"/>
-        </w:tabs>
-        <w:ind w:left="-180" w:right="-450"/>
-        <w:rPr>
-          <w:rFonts w:asciiTheme="minorHAnsi" w:hAnsiTheme="minorHAnsi" w:cstheme="minorHAnsi"/>
-          <w:sz w:val="20"/>
-          <w:szCs w:val="20"/>
-          <w:lang w:val="bg-BG"/>
-        </w:rPr>
-      </w:pPr>
+        <w:tabs>
+          <w:tab w:val="left" w:pos="3870"/>
+        </w:tabs>
+        <w:ind w:left="-180" w:right="-450"/>
+        <w:rPr>
+          <w:rFonts w:cstheme="minorHAnsi"/>
+          <w:sz w:val="20"/>
+          <w:szCs w:val="20"/>
+          <w:lang w:val="bg-BG"/>
+        </w:rPr>
+      </w:pPr>
+      <w:r>
+        <w:rPr>
+          <w:rFonts w:cstheme="minorHAnsi"/>
+          <w:sz w:val="20"/>
+          <w:szCs w:val="20"/>
+          <w:lang w:val="bg-BG"/>
+        </w:rPr>
+        <w:t>{{contract_data.sign}}</w:t>
+      </w:r>
     </w:p>
     <w:p>
       <w:pPr>
@@ -4352,49 +4360,7 @@
         <w:tabs>
           <w:tab w:val="left" w:pos="3870"/>
         </w:tabs>
-        <w:ind w:left="-180" w:right="-450"/>
-        <w:rPr>
-          <w:rFonts w:cstheme="minorHAnsi"/>
-          <w:sz w:val="20"/>
-          <w:szCs w:val="20"/>
-          <w:lang w:val="bg-BG"/>
-        </w:rPr>
-      </w:pPr>
-    </w:p>
-    <w:p>
-      <w:pPr>
-        <w:tabs>
-          <w:tab w:val="left" w:pos="3870"/>
-        </w:tabs>
-        <w:ind w:left="-180" w:right="-450"/>
-        <w:rPr>
-          <w:rFonts w:cstheme="minorHAnsi"/>
-          <w:sz w:val="20"/>
-          <w:szCs w:val="20"/>
-          <w:lang w:val="bg-BG"/>
-        </w:rPr>
-      </w:pPr>
-    </w:p>
-    <w:p>
-      <w:pPr>
-        <w:tabs>
-          <w:tab w:val="left" w:pos="3870"/>
-        </w:tabs>
-        <w:ind w:left="-180" w:right="-450"/>
-        <w:rPr>
-          <w:rFonts w:cstheme="minorHAnsi"/>
-          <w:sz w:val="20"/>
-          <w:szCs w:val="20"/>
-          <w:lang w:val="bg-BG"/>
-        </w:rPr>
-      </w:pPr>
-    </w:p>
-    <w:p>
-      <w:pPr>
-        <w:tabs>
-          <w:tab w:val="left" w:pos="3870"/>
-        </w:tabs>
-        <w:ind w:left="-180" w:right="-450"/>
+        <w:ind w:right="-450"/>
         <w:rPr>
           <w:rFonts w:cstheme="minorHAnsi"/>
           <w:sz w:val="20"/>

</xml_diff>

<commit_message>
fixed design issues, final fields set, expect few messages
</commit_message>
<xml_diff>
--- a/templates/taxes/contract_template.docx
+++ b/templates/taxes/contract_template.docx
@@ -23,16 +23,17 @@
           <w:sz w:val="28"/>
           <w:szCs w:val="28"/>
         </w:rPr>
-        <w:t xml:space="preserve">                                                                       </w:t>
-      </w:r>
-      <w:r>
-        <w:rPr>
-          <w:rFonts w:asciiTheme="minorHAnsi" w:hAnsiTheme="minorHAnsi" w:cstheme="minorHAnsi"/>
+        <w:t>**</w:t>
+      </w:r>
+      <w:r>
+        <w:rPr>
+          <w:rFonts w:asciiTheme="minorHAnsi" w:hAnsiTheme="minorHAnsi" w:cstheme="minorHAnsi"/>
+          <w:b/>
+          <w:bCs/>
           <w:sz w:val="28"/>
           <w:szCs w:val="28"/>
-          <w:lang w:val="bg-BG"/>
-        </w:rPr>
-        <w:t>Д</w:t>
+        </w:rPr>
+        <w:t xml:space="preserve">                                                    </w:t>
       </w:r>
       <w:r>
         <w:rPr>
@@ -41,7 +42,165 @@
           <w:szCs w:val="28"/>
           <w:lang w:val="bg-BG"/>
         </w:rPr>
-        <w:t>ОГОВОР</w:t>
+        <w:t>Д</w:t>
+      </w:r>
+      <w:r>
+        <w:rPr>
+          <w:rFonts w:asciiTheme="minorHAnsi" w:hAnsiTheme="minorHAnsi" w:cstheme="minorHAnsi"/>
+          <w:sz w:val="28"/>
+          <w:szCs w:val="28"/>
+        </w:rPr>
+        <w:t xml:space="preserve">  </w:t>
+      </w:r>
+      <w:r>
+        <w:rPr>
+          <w:rFonts w:asciiTheme="minorHAnsi" w:hAnsiTheme="minorHAnsi" w:cstheme="minorHAnsi"/>
+          <w:sz w:val="28"/>
+          <w:szCs w:val="28"/>
+        </w:rPr>
+        <w:t xml:space="preserve"> </w:t>
+      </w:r>
+      <w:r>
+        <w:rPr>
+          <w:rFonts w:asciiTheme="minorHAnsi" w:hAnsiTheme="minorHAnsi" w:cstheme="minorHAnsi"/>
+          <w:sz w:val="28"/>
+          <w:szCs w:val="28"/>
+          <w:lang w:val="bg-BG"/>
+        </w:rPr>
+        <w:t>О</w:t>
+      </w:r>
+      <w:r>
+        <w:rPr>
+          <w:rFonts w:asciiTheme="minorHAnsi" w:hAnsiTheme="minorHAnsi" w:cstheme="minorHAnsi"/>
+          <w:sz w:val="28"/>
+          <w:szCs w:val="28"/>
+        </w:rPr>
+        <w:t xml:space="preserve"> </w:t>
+      </w:r>
+      <w:r>
+        <w:rPr>
+          <w:rFonts w:asciiTheme="minorHAnsi" w:hAnsiTheme="minorHAnsi" w:cstheme="minorHAnsi"/>
+          <w:sz w:val="28"/>
+          <w:szCs w:val="28"/>
+        </w:rPr>
+        <w:t xml:space="preserve">  </w:t>
+      </w:r>
+      <w:r>
+        <w:rPr>
+          <w:rFonts w:asciiTheme="minorHAnsi" w:hAnsiTheme="minorHAnsi" w:cstheme="minorHAnsi"/>
+          <w:sz w:val="28"/>
+          <w:szCs w:val="28"/>
+          <w:lang w:val="bg-BG"/>
+        </w:rPr>
+        <w:t>Г</w:t>
+      </w:r>
+      <w:r>
+        <w:rPr>
+          <w:rFonts w:asciiTheme="minorHAnsi" w:hAnsiTheme="minorHAnsi" w:cstheme="minorHAnsi"/>
+          <w:sz w:val="28"/>
+          <w:szCs w:val="28"/>
+        </w:rPr>
+        <w:t xml:space="preserve">  </w:t>
+      </w:r>
+      <w:r>
+        <w:rPr>
+          <w:rFonts w:asciiTheme="minorHAnsi" w:hAnsiTheme="minorHAnsi" w:cstheme="minorHAnsi"/>
+          <w:sz w:val="28"/>
+          <w:szCs w:val="28"/>
+        </w:rPr>
+        <w:t xml:space="preserve"> </w:t>
+      </w:r>
+      <w:r>
+        <w:rPr>
+          <w:rFonts w:asciiTheme="minorHAnsi" w:hAnsiTheme="minorHAnsi" w:cstheme="minorHAnsi"/>
+          <w:sz w:val="28"/>
+          <w:szCs w:val="28"/>
+          <w:lang w:val="bg-BG"/>
+        </w:rPr>
+        <w:t>О</w:t>
+      </w:r>
+      <w:r>
+        <w:rPr>
+          <w:rFonts w:asciiTheme="minorHAnsi" w:hAnsiTheme="minorHAnsi" w:cstheme="minorHAnsi"/>
+          <w:sz w:val="28"/>
+          <w:szCs w:val="28"/>
+        </w:rPr>
+        <w:t xml:space="preserve">  </w:t>
+      </w:r>
+      <w:r>
+        <w:rPr>
+          <w:rFonts w:asciiTheme="minorHAnsi" w:hAnsiTheme="minorHAnsi" w:cstheme="minorHAnsi"/>
+          <w:sz w:val="28"/>
+          <w:szCs w:val="28"/>
+        </w:rPr>
+        <w:t xml:space="preserve"> </w:t>
+      </w:r>
+      <w:r>
+        <w:rPr>
+          <w:rFonts w:asciiTheme="minorHAnsi" w:hAnsiTheme="minorHAnsi" w:cstheme="minorHAnsi"/>
+          <w:sz w:val="28"/>
+          <w:szCs w:val="28"/>
+          <w:lang w:val="bg-BG"/>
+        </w:rPr>
+        <w:t>В</w:t>
+      </w:r>
+      <w:r>
+        <w:rPr>
+          <w:rFonts w:asciiTheme="minorHAnsi" w:hAnsiTheme="minorHAnsi" w:cstheme="minorHAnsi"/>
+          <w:sz w:val="28"/>
+          <w:szCs w:val="28"/>
+        </w:rPr>
+        <w:t xml:space="preserve">  </w:t>
+      </w:r>
+      <w:r>
+        <w:rPr>
+          <w:rFonts w:asciiTheme="minorHAnsi" w:hAnsiTheme="minorHAnsi" w:cstheme="minorHAnsi"/>
+          <w:sz w:val="28"/>
+          <w:szCs w:val="28"/>
+        </w:rPr>
+        <w:t xml:space="preserve"> </w:t>
+      </w:r>
+      <w:r>
+        <w:rPr>
+          <w:rFonts w:asciiTheme="minorHAnsi" w:hAnsiTheme="minorHAnsi" w:cstheme="minorHAnsi"/>
+          <w:sz w:val="28"/>
+          <w:szCs w:val="28"/>
+          <w:lang w:val="bg-BG"/>
+        </w:rPr>
+        <w:t>О</w:t>
+      </w:r>
+      <w:r>
+        <w:rPr>
+          <w:rFonts w:asciiTheme="minorHAnsi" w:hAnsiTheme="minorHAnsi" w:cstheme="minorHAnsi"/>
+          <w:sz w:val="28"/>
+          <w:szCs w:val="28"/>
+        </w:rPr>
+        <w:t xml:space="preserve">  </w:t>
+      </w:r>
+      <w:r>
+        <w:rPr>
+          <w:rFonts w:asciiTheme="minorHAnsi" w:hAnsiTheme="minorHAnsi" w:cstheme="minorHAnsi"/>
+          <w:sz w:val="28"/>
+          <w:szCs w:val="28"/>
+        </w:rPr>
+        <w:t xml:space="preserve"> </w:t>
+      </w:r>
+      <w:r>
+        <w:rPr>
+          <w:rFonts w:asciiTheme="minorHAnsi" w:hAnsiTheme="minorHAnsi" w:cstheme="minorHAnsi"/>
+          <w:sz w:val="28"/>
+          <w:szCs w:val="28"/>
+          <w:lang w:val="bg-BG"/>
+        </w:rPr>
+        <w:t>Р</w:t>
+      </w:r>
+      <w:r>
+        <w:rPr>
+          <w:rFonts w:asciiTheme="minorHAnsi" w:hAnsiTheme="minorHAnsi" w:cstheme="minorHAnsi"/>
+          <w:sz w:val="28"/>
+          <w:szCs w:val="28"/>
+        </w:rPr>
+        <w:t>**</w:t>
       </w:r>
     </w:p>
     <w:p>
@@ -141,7 +300,24 @@
           <w:szCs w:val="20"/>
           <w:lang w:val="bg-BG"/>
         </w:rPr>
-        <w:t xml:space="preserve"> ,между: </w:t>
+        <w:t>,</w:t>
+      </w:r>
+      <w:r>
+        <w:rPr>
+          <w:rFonts w:asciiTheme="minorHAnsi" w:hAnsiTheme="minorHAnsi" w:cstheme="minorHAnsi"/>
+          <w:sz w:val="20"/>
+          <w:szCs w:val="20"/>
+        </w:rPr>
+        <w:t xml:space="preserve"> </w:t>
+      </w:r>
+      <w:r>
+        <w:rPr>
+          <w:rFonts w:asciiTheme="minorHAnsi" w:hAnsiTheme="minorHAnsi" w:cstheme="minorHAnsi"/>
+          <w:sz w:val="20"/>
+          <w:szCs w:val="20"/>
+          <w:lang w:val="bg-BG"/>
+        </w:rPr>
+        <w:t xml:space="preserve">между: </w:t>
       </w:r>
     </w:p>
     <w:p>
@@ -288,32 +464,47 @@
           <w:szCs w:val="20"/>
           <w:lang w:val="bg-BG"/>
         </w:rPr>
-        <w:t xml:space="preserve">редставлявано от Кирил Атанасов, </w:t>
-      </w:r>
-    </w:p>
-    <w:p>
-      <w:pPr>
-        <w:pStyle w:val="Default"/>
-        <w:tabs>
-          <w:tab w:val="left" w:pos="3870"/>
-        </w:tabs>
-        <w:ind w:left="-180" w:right="-450"/>
-        <w:rPr>
-          <w:rFonts w:asciiTheme="minorHAnsi" w:hAnsiTheme="minorHAnsi" w:cstheme="minorHAnsi"/>
-          <w:sz w:val="20"/>
-          <w:szCs w:val="20"/>
-          <w:lang w:val="bg-BG"/>
-        </w:rPr>
-      </w:pPr>
-      <w:r>
-        <w:rPr>
-          <w:rFonts w:asciiTheme="minorHAnsi" w:hAnsiTheme="minorHAnsi" w:cstheme="minorHAnsi"/>
-          <w:sz w:val="20"/>
-          <w:szCs w:val="20"/>
-          <w:lang w:val="bg-BG"/>
-        </w:rPr>
-        <w:t xml:space="preserve">оттук нататък наричан ИЗПЪЛНИТЕЛ </w:t>
-      </w:r>
+        <w:t xml:space="preserve">редставлявано от </w:t>
+      </w:r>
+    </w:p>
+    <w:p>
+      <w:pPr>
+        <w:pStyle w:val="Default"/>
+        <w:tabs>
+          <w:tab w:val="left" w:pos="3870"/>
+        </w:tabs>
+        <w:ind w:left="-180" w:right="-450"/>
+        <w:rPr>
+          <w:rFonts w:asciiTheme="minorHAnsi" w:hAnsiTheme="minorHAnsi" w:cstheme="minorHAnsi"/>
+          <w:sz w:val="20"/>
+          <w:szCs w:val="20"/>
+          <w:lang w:val="bg-BG"/>
+        </w:rPr>
+      </w:pPr>
+      <w:r>
+        <w:rPr>
+          <w:rFonts w:asciiTheme="minorHAnsi" w:hAnsiTheme="minorHAnsi" w:cstheme="minorHAnsi"/>
+          <w:sz w:val="20"/>
+          <w:szCs w:val="20"/>
+          <w:lang w:val="bg-BG"/>
+        </w:rPr>
+        <w:t xml:space="preserve">Кирил Атанасов, оттук нататък наричан ИЗПЪЛНИТЕЛ </w:t>
+      </w:r>
+    </w:p>
+    <w:p>
+      <w:pPr>
+        <w:pStyle w:val="Default"/>
+        <w:tabs>
+          <w:tab w:val="left" w:pos="3870"/>
+        </w:tabs>
+        <w:ind w:left="-180" w:right="-450"/>
+        <w:rPr>
+          <w:rFonts w:asciiTheme="minorHAnsi" w:hAnsiTheme="minorHAnsi" w:cstheme="minorHAnsi"/>
+          <w:sz w:val="20"/>
+          <w:szCs w:val="20"/>
+          <w:lang w:val="bg-BG"/>
+        </w:rPr>
+      </w:pPr>
     </w:p>
     <w:p>
       <w:pPr>
@@ -792,38 +983,45 @@
           <w:szCs w:val="20"/>
           <w:lang w:val="bg-BG"/>
         </w:rPr>
-        <w:t>заплатени от</w:t>
-      </w:r>
-    </w:p>
-    <w:p>
-      <w:pPr>
-        <w:pStyle w:val="Default"/>
-        <w:tabs>
-          <w:tab w:val="left" w:pos="3870"/>
-        </w:tabs>
-        <w:ind w:left="-180" w:right="-450"/>
-        <w:rPr>
-          <w:rFonts w:asciiTheme="minorHAnsi" w:hAnsiTheme="minorHAnsi" w:cstheme="minorHAnsi"/>
-          <w:sz w:val="20"/>
-          <w:szCs w:val="20"/>
-          <w:lang w:val="bg-BG"/>
-        </w:rPr>
-      </w:pPr>
-      <w:r>
-        <w:rPr>
-          <w:rFonts w:asciiTheme="minorHAnsi" w:hAnsiTheme="minorHAnsi" w:cstheme="minorHAnsi"/>
-          <w:sz w:val="20"/>
-          <w:szCs w:val="20"/>
-          <w:lang w:val="bg-BG"/>
-        </w:rPr>
-        <w:t>ВЪЗЛОЖИТЕЛЯ в САЩ, както и комуникацията с Американските данъчни служби във връзка с тези данъци</w:t>
-      </w:r>
-      <w:r>
-        <w:rPr>
-          <w:rFonts w:asciiTheme="minorHAnsi" w:hAnsiTheme="minorHAnsi" w:cstheme="minorHAnsi"/>
-          <w:sz w:val="20"/>
-          <w:szCs w:val="20"/>
-          <w:lang w:val="bg-BG"/>
+        <w:t xml:space="preserve">заплатени </w:t>
+      </w:r>
+    </w:p>
+    <w:p>
+      <w:pPr>
+        <w:pStyle w:val="Default"/>
+        <w:tabs>
+          <w:tab w:val="left" w:pos="3870"/>
+        </w:tabs>
+        <w:ind w:left="-180" w:right="-450"/>
+        <w:rPr>
+          <w:rFonts w:asciiTheme="minorHAnsi" w:hAnsiTheme="minorHAnsi" w:cstheme="minorHAnsi"/>
+          <w:sz w:val="20"/>
+          <w:szCs w:val="20"/>
+          <w:lang w:val="bg-BG"/>
+        </w:rPr>
+      </w:pPr>
+      <w:r>
+        <w:rPr>
+          <w:rFonts w:asciiTheme="minorHAnsi" w:hAnsiTheme="minorHAnsi" w:cstheme="minorHAnsi"/>
+          <w:sz w:val="20"/>
+          <w:szCs w:val="20"/>
+        </w:rPr>
+        <w:t>o</w:t>
+      </w:r>
+      <w:r>
+        <w:rPr>
+          <w:rFonts w:asciiTheme="minorHAnsi" w:hAnsiTheme="minorHAnsi" w:cstheme="minorHAnsi"/>
+          <w:sz w:val="20"/>
+          <w:szCs w:val="20"/>
+          <w:lang w:val="bg-BG"/>
+        </w:rPr>
+        <w:t>т</w:t>
+      </w:r>
+      <w:r>
+        <w:rPr>
+          <w:rFonts w:asciiTheme="minorHAnsi" w:hAnsiTheme="minorHAnsi" w:cstheme="minorHAnsi"/>
+          <w:sz w:val="20"/>
+          <w:szCs w:val="20"/>
         </w:rPr>
         <w:t xml:space="preserve"> </w:t>
       </w:r>
@@ -834,38 +1032,55 @@
           <w:szCs w:val="20"/>
           <w:lang w:val="bg-BG"/>
         </w:rPr>
+        <w:t xml:space="preserve">ВЪЗЛОЖИТЕЛЯ в САЩ, както и комуникацията с Американските данъчни служби във връзка с тези </w:t>
+      </w:r>
+    </w:p>
+    <w:p>
+      <w:pPr>
+        <w:pStyle w:val="Default"/>
+        <w:tabs>
+          <w:tab w:val="left" w:pos="3870"/>
+        </w:tabs>
+        <w:ind w:left="-180" w:right="-450"/>
+        <w:rPr>
+          <w:rFonts w:asciiTheme="minorHAnsi" w:hAnsiTheme="minorHAnsi" w:cstheme="minorHAnsi"/>
+          <w:sz w:val="20"/>
+          <w:szCs w:val="20"/>
+          <w:lang w:val="bg-BG"/>
+        </w:rPr>
+      </w:pPr>
+      <w:r>
+        <w:rPr>
+          <w:rFonts w:asciiTheme="minorHAnsi" w:hAnsiTheme="minorHAnsi" w:cstheme="minorHAnsi"/>
+          <w:sz w:val="20"/>
+          <w:szCs w:val="20"/>
+          <w:lang w:val="bg-BG"/>
+        </w:rPr>
+        <w:t>данъци</w:t>
+      </w:r>
+      <w:r>
+        <w:rPr>
+          <w:rFonts w:asciiTheme="minorHAnsi" w:hAnsiTheme="minorHAnsi" w:cstheme="minorHAnsi"/>
+          <w:sz w:val="20"/>
+          <w:szCs w:val="20"/>
+          <w:lang w:val="bg-BG"/>
+        </w:rPr>
+        <w:t xml:space="preserve"> </w:t>
+      </w:r>
+      <w:r>
+        <w:rPr>
+          <w:rFonts w:asciiTheme="minorHAnsi" w:hAnsiTheme="minorHAnsi" w:cstheme="minorHAnsi"/>
+          <w:sz w:val="20"/>
+          <w:szCs w:val="20"/>
+          <w:lang w:val="bg-BG"/>
+        </w:rPr>
         <w:t>от името</w:t>
       </w:r>
-    </w:p>
-    <w:p>
-      <w:pPr>
-        <w:pStyle w:val="Default"/>
-        <w:tabs>
-          <w:tab w:val="left" w:pos="3870"/>
-        </w:tabs>
-        <w:ind w:left="-180" w:right="-450"/>
-        <w:rPr>
-          <w:rFonts w:asciiTheme="minorHAnsi" w:hAnsiTheme="minorHAnsi" w:cstheme="minorHAnsi"/>
-          <w:sz w:val="20"/>
-          <w:szCs w:val="20"/>
-          <w:lang w:val="bg-BG"/>
-        </w:rPr>
-      </w:pPr>
-      <w:r>
-        <w:rPr>
-          <w:rFonts w:asciiTheme="minorHAnsi" w:hAnsiTheme="minorHAnsi" w:cstheme="minorHAnsi"/>
-          <w:sz w:val="20"/>
-          <w:szCs w:val="20"/>
-          <w:lang w:val="bg-BG"/>
-        </w:rPr>
-        <w:t xml:space="preserve"> и за сметка на</w:t>
-      </w:r>
-      <w:r>
-        <w:rPr>
-          <w:rFonts w:asciiTheme="minorHAnsi" w:hAnsiTheme="minorHAnsi" w:cstheme="minorHAnsi"/>
-          <w:sz w:val="20"/>
-          <w:szCs w:val="20"/>
-          <w:lang w:val="bg-BG"/>
+      <w:r>
+        <w:rPr>
+          <w:rFonts w:asciiTheme="minorHAnsi" w:hAnsiTheme="minorHAnsi" w:cstheme="minorHAnsi"/>
+          <w:sz w:val="20"/>
+          <w:szCs w:val="20"/>
         </w:rPr>
         <w:t xml:space="preserve"> </w:t>
       </w:r>
@@ -876,31 +1091,49 @@
           <w:szCs w:val="20"/>
           <w:lang w:val="bg-BG"/>
         </w:rPr>
-        <w:t xml:space="preserve">ВЪЗЛОЖИТЕЛЯ, по начин и условия определени в този договор и съобразно Българското </w:t>
-      </w:r>
-    </w:p>
-    <w:p>
-      <w:pPr>
-        <w:pStyle w:val="Default"/>
-        <w:tabs>
-          <w:tab w:val="left" w:pos="3870"/>
-        </w:tabs>
-        <w:ind w:left="-180" w:right="-450"/>
-        <w:rPr>
-          <w:rFonts w:asciiTheme="minorHAnsi" w:hAnsiTheme="minorHAnsi" w:cstheme="minorHAnsi"/>
-          <w:sz w:val="20"/>
-          <w:szCs w:val="20"/>
-          <w:lang w:val="bg-BG"/>
-        </w:rPr>
-      </w:pPr>
-      <w:r>
-        <w:rPr>
-          <w:rFonts w:asciiTheme="minorHAnsi" w:hAnsiTheme="minorHAnsi" w:cstheme="minorHAnsi"/>
-          <w:sz w:val="20"/>
-          <w:szCs w:val="20"/>
-          <w:lang w:val="bg-BG"/>
-        </w:rPr>
-        <w:t xml:space="preserve">Законодателство. </w:t>
+        <w:t>и за сметка на</w:t>
+      </w:r>
+      <w:r>
+        <w:rPr>
+          <w:rFonts w:asciiTheme="minorHAnsi" w:hAnsiTheme="minorHAnsi" w:cstheme="minorHAnsi"/>
+          <w:sz w:val="20"/>
+          <w:szCs w:val="20"/>
+          <w:lang w:val="bg-BG"/>
+        </w:rPr>
+        <w:t xml:space="preserve"> </w:t>
+      </w:r>
+      <w:r>
+        <w:rPr>
+          <w:rFonts w:asciiTheme="minorHAnsi" w:hAnsiTheme="minorHAnsi" w:cstheme="minorHAnsi"/>
+          <w:sz w:val="20"/>
+          <w:szCs w:val="20"/>
+          <w:lang w:val="bg-BG"/>
+        </w:rPr>
+        <w:t xml:space="preserve">ВЪЗЛОЖИТЕЛЯ, по начин и условия определени в този договор и </w:t>
+      </w:r>
+    </w:p>
+    <w:p>
+      <w:pPr>
+        <w:pStyle w:val="Default"/>
+        <w:tabs>
+          <w:tab w:val="left" w:pos="3870"/>
+        </w:tabs>
+        <w:ind w:left="-180" w:right="-450"/>
+        <w:rPr>
+          <w:rFonts w:asciiTheme="minorHAnsi" w:hAnsiTheme="minorHAnsi" w:cstheme="minorHAnsi"/>
+          <w:sz w:val="20"/>
+          <w:szCs w:val="20"/>
+          <w:lang w:val="bg-BG"/>
+        </w:rPr>
+      </w:pPr>
+      <w:r>
+        <w:rPr>
+          <w:rFonts w:asciiTheme="minorHAnsi" w:hAnsiTheme="minorHAnsi" w:cstheme="minorHAnsi"/>
+          <w:sz w:val="20"/>
+          <w:szCs w:val="20"/>
+          <w:lang w:val="bg-BG"/>
+        </w:rPr>
+        <w:t xml:space="preserve">съобразно Българското Законодателство. </w:t>
       </w:r>
     </w:p>
     <w:p>
@@ -966,7 +1199,7 @@
           <w:tab w:val="left" w:pos="3870"/>
         </w:tabs>
         <w:spacing w:after="10"/>
-        <w:ind w:left="-180" w:right="-450"/>
+        <w:ind w:left="-180" w:right="90"/>
         <w:rPr>
           <w:rFonts w:asciiTheme="minorHAnsi" w:hAnsiTheme="minorHAnsi" w:cstheme="minorHAnsi"/>
           <w:sz w:val="20"/>
@@ -990,7 +1223,7 @@
           <w:szCs w:val="20"/>
           <w:lang w:val="bg-BG"/>
         </w:rPr>
-        <w:t xml:space="preserve">ИЗПЪЛНИТЕЛЯТ е длъжен да действа с целия необходим професионализъм и съобразно действащите законодателни </w:t>
+        <w:t>ИЗПЪЛНИТЕЛЯТ е длъжен да действа с целия необходим професионализъм и съобразно действащите</w:t>
       </w:r>
     </w:p>
     <w:p>
@@ -1000,22 +1233,22 @@
           <w:tab w:val="left" w:pos="3870"/>
         </w:tabs>
         <w:spacing w:after="10"/>
-        <w:ind w:left="-180" w:right="-450"/>
-        <w:rPr>
-          <w:rFonts w:asciiTheme="minorHAnsi" w:hAnsiTheme="minorHAnsi" w:cstheme="minorHAnsi"/>
-          <w:sz w:val="20"/>
-          <w:szCs w:val="20"/>
-          <w:lang w:val="bg-BG"/>
-        </w:rPr>
-      </w:pPr>
-      <w:r>
-        <w:rPr>
-          <w:rFonts w:asciiTheme="minorHAnsi" w:hAnsiTheme="minorHAnsi" w:cstheme="minorHAnsi"/>
-          <w:sz w:val="20"/>
-          <w:szCs w:val="20"/>
-          <w:lang w:val="bg-BG"/>
-        </w:rPr>
-        <w:t xml:space="preserve">норми. </w:t>
+        <w:ind w:left="-180" w:right="90"/>
+        <w:rPr>
+          <w:rFonts w:asciiTheme="minorHAnsi" w:hAnsiTheme="minorHAnsi" w:cstheme="minorHAnsi"/>
+          <w:sz w:val="20"/>
+          <w:szCs w:val="20"/>
+          <w:lang w:val="bg-BG"/>
+        </w:rPr>
+      </w:pPr>
+      <w:r>
+        <w:rPr>
+          <w:rFonts w:asciiTheme="minorHAnsi" w:hAnsiTheme="minorHAnsi" w:cstheme="minorHAnsi"/>
+          <w:sz w:val="20"/>
+          <w:szCs w:val="20"/>
+          <w:lang w:val="bg-BG"/>
+        </w:rPr>
+        <w:t xml:space="preserve">законодателни норми. </w:t>
       </w:r>
     </w:p>
     <w:p>
@@ -1025,22 +1258,22 @@
           <w:tab w:val="left" w:pos="3870"/>
         </w:tabs>
         <w:spacing w:after="10"/>
-        <w:ind w:left="-180" w:right="-450"/>
-        <w:rPr>
-          <w:rFonts w:asciiTheme="minorHAnsi" w:hAnsiTheme="minorHAnsi" w:cstheme="minorHAnsi"/>
-          <w:sz w:val="20"/>
-          <w:szCs w:val="20"/>
-          <w:lang w:val="bg-BG"/>
-        </w:rPr>
-      </w:pPr>
-      <w:r>
-        <w:rPr>
-          <w:rFonts w:asciiTheme="minorHAnsi" w:hAnsiTheme="minorHAnsi" w:cstheme="minorHAnsi"/>
-          <w:sz w:val="20"/>
-          <w:szCs w:val="20"/>
-          <w:lang w:val="bg-BG"/>
-        </w:rPr>
-        <w:t>2. ИЗПЪЛНИТЕЛЯТ е длъжен да изпълни всички действия по точка (1) и може да излезе от тези си задължения само</w:t>
+        <w:ind w:left="-187" w:right="-446"/>
+        <w:rPr>
+          <w:rFonts w:asciiTheme="minorHAnsi" w:hAnsiTheme="minorHAnsi" w:cstheme="minorHAnsi"/>
+          <w:sz w:val="20"/>
+          <w:szCs w:val="20"/>
+          <w:lang w:val="bg-BG"/>
+        </w:rPr>
+      </w:pPr>
+      <w:r>
+        <w:rPr>
+          <w:rFonts w:asciiTheme="minorHAnsi" w:hAnsiTheme="minorHAnsi" w:cstheme="minorHAnsi"/>
+          <w:sz w:val="20"/>
+          <w:szCs w:val="20"/>
+          <w:lang w:val="bg-BG"/>
+        </w:rPr>
+        <w:t xml:space="preserve">2. ИЗПЪЛНИТЕЛЯТ е длъжен да изпълни всички действия по точка (1) и може да излезе от тези си </w:t>
       </w:r>
     </w:p>
     <w:p>
@@ -1050,22 +1283,57 @@
           <w:tab w:val="left" w:pos="3870"/>
         </w:tabs>
         <w:spacing w:after="10"/>
-        <w:ind w:left="-180" w:right="-450"/>
-        <w:rPr>
-          <w:rFonts w:asciiTheme="minorHAnsi" w:hAnsiTheme="minorHAnsi" w:cstheme="minorHAnsi"/>
-          <w:sz w:val="20"/>
-          <w:szCs w:val="20"/>
-          <w:lang w:val="bg-BG"/>
-        </w:rPr>
-      </w:pPr>
-      <w:r>
-        <w:rPr>
-          <w:rFonts w:asciiTheme="minorHAnsi" w:hAnsiTheme="minorHAnsi" w:cstheme="minorHAnsi"/>
-          <w:sz w:val="20"/>
-          <w:szCs w:val="20"/>
-          <w:lang w:val="bg-BG"/>
-        </w:rPr>
-        <w:t>да защити интереса на ВЪЗЛОЖИТЕЛЯ, като е длъжен да уведоми ВЪЗЛОЖИТЕЛЯ своевременно за налагането на</w:t>
+        <w:ind w:left="-187" w:right="-446"/>
+        <w:rPr>
+          <w:rFonts w:asciiTheme="minorHAnsi" w:hAnsiTheme="minorHAnsi" w:cstheme="minorHAnsi"/>
+          <w:sz w:val="20"/>
+          <w:szCs w:val="20"/>
+          <w:lang w:val="bg-BG"/>
+        </w:rPr>
+      </w:pPr>
+      <w:r>
+        <w:rPr>
+          <w:rFonts w:asciiTheme="minorHAnsi" w:hAnsiTheme="minorHAnsi" w:cstheme="minorHAnsi"/>
+          <w:sz w:val="20"/>
+          <w:szCs w:val="20"/>
+          <w:lang w:val="bg-BG"/>
+        </w:rPr>
+        <w:t xml:space="preserve">задължения </w:t>
+      </w:r>
+      <w:r>
+        <w:rPr>
+          <w:rFonts w:asciiTheme="minorHAnsi" w:hAnsiTheme="minorHAnsi" w:cstheme="minorHAnsi"/>
+          <w:sz w:val="20"/>
+          <w:szCs w:val="20"/>
+          <w:lang w:val="bg-BG"/>
+        </w:rPr>
+        <w:t>с</w:t>
+      </w:r>
+      <w:r>
+        <w:rPr>
+          <w:rFonts w:asciiTheme="minorHAnsi" w:hAnsiTheme="minorHAnsi" w:cstheme="minorHAnsi"/>
+          <w:sz w:val="20"/>
+          <w:szCs w:val="20"/>
+          <w:lang w:val="bg-BG"/>
+        </w:rPr>
+        <w:t>амо</w:t>
+      </w:r>
+      <w:r>
+        <w:rPr>
+          <w:rFonts w:asciiTheme="minorHAnsi" w:hAnsiTheme="minorHAnsi" w:cstheme="minorHAnsi"/>
+          <w:sz w:val="20"/>
+          <w:szCs w:val="20"/>
+        </w:rPr>
+        <w:t xml:space="preserve"> </w:t>
+      </w:r>
+      <w:r>
+        <w:rPr>
+          <w:rFonts w:asciiTheme="minorHAnsi" w:hAnsiTheme="minorHAnsi" w:cstheme="minorHAnsi"/>
+          <w:sz w:val="20"/>
+          <w:szCs w:val="20"/>
+          <w:lang w:val="bg-BG"/>
+        </w:rPr>
+        <w:t xml:space="preserve">да защити интереса на ВЪЗЛОЖИТЕЛЯ, като е длъжен да уведоми ВЪЗЛОЖИТЕЛЯ </w:t>
       </w:r>
     </w:p>
     <w:p>
@@ -1075,14 +1343,31 @@
           <w:tab w:val="left" w:pos="3870"/>
         </w:tabs>
         <w:spacing w:after="10"/>
-        <w:ind w:left="-180" w:right="-450"/>
-        <w:rPr>
-          <w:rFonts w:asciiTheme="minorHAnsi" w:hAnsiTheme="minorHAnsi" w:cstheme="minorHAnsi"/>
-          <w:sz w:val="20"/>
-          <w:szCs w:val="20"/>
-          <w:lang w:val="bg-BG"/>
-        </w:rPr>
-      </w:pPr>
+        <w:ind w:left="-187" w:right="-446"/>
+        <w:rPr>
+          <w:rFonts w:asciiTheme="minorHAnsi" w:hAnsiTheme="minorHAnsi" w:cstheme="minorHAnsi"/>
+          <w:sz w:val="20"/>
+          <w:szCs w:val="20"/>
+          <w:lang w:val="bg-BG"/>
+        </w:rPr>
+      </w:pPr>
+      <w:r>
+        <w:rPr>
+          <w:rFonts w:asciiTheme="minorHAnsi" w:hAnsiTheme="minorHAnsi" w:cstheme="minorHAnsi"/>
+          <w:sz w:val="20"/>
+          <w:szCs w:val="20"/>
+          <w:lang w:val="bg-BG"/>
+        </w:rPr>
+        <w:t>своевременно за налагането на</w:t>
+      </w:r>
+      <w:r>
+        <w:rPr>
+          <w:rFonts w:asciiTheme="minorHAnsi" w:hAnsiTheme="minorHAnsi" w:cstheme="minorHAnsi"/>
+          <w:sz w:val="20"/>
+          <w:szCs w:val="20"/>
+        </w:rPr>
+        <w:t xml:space="preserve"> </w:t>
+      </w:r>
       <w:r>
         <w:rPr>
           <w:rFonts w:asciiTheme="minorHAnsi" w:hAnsiTheme="minorHAnsi" w:cstheme="minorHAnsi"/>
@@ -1115,7 +1400,16 @@
           <w:szCs w:val="20"/>
           <w:lang w:val="bg-BG"/>
         </w:rPr>
-        <w:t>3. Ако ИЗПЪЛНИТЕЛЯТ определи или се усъмни, че насоките или подадената информация от ВЪЗЛОЖИТЕЛЯ са</w:t>
+        <w:t>3. Ако ИЗПЪЛНИТЕЛЯТ определи или се усъмни, че насоките или подадената информация от ВЪЗЛОЖИ</w:t>
+      </w:r>
+      <w:r>
+        <w:rPr>
+          <w:rFonts w:asciiTheme="minorHAnsi" w:hAnsiTheme="minorHAnsi" w:cstheme="minorHAnsi"/>
+          <w:sz w:val="20"/>
+          <w:szCs w:val="20"/>
+          <w:lang w:val="bg-BG"/>
+        </w:rPr>
+        <w:t>-</w:t>
       </w:r>
     </w:p>
     <w:p>
@@ -1140,7 +1434,43 @@
           <w:szCs w:val="20"/>
           <w:lang w:val="bg-BG"/>
         </w:rPr>
-        <w:t xml:space="preserve">неправилни, неприложими, некоректни или нелигитимни, то той е длъжен да информира за това ВЪЗЛОЖИТЕЛЯ. </w:t>
+        <w:t xml:space="preserve">ТЕЛЯ </w:t>
+      </w:r>
+      <w:r>
+        <w:rPr>
+          <w:rFonts w:asciiTheme="minorHAnsi" w:hAnsiTheme="minorHAnsi" w:cstheme="minorHAnsi"/>
+          <w:sz w:val="20"/>
+          <w:szCs w:val="20"/>
+          <w:lang w:val="bg-BG"/>
+        </w:rPr>
+        <w:t>с</w:t>
+      </w:r>
+      <w:r>
+        <w:rPr>
+          <w:rFonts w:asciiTheme="minorHAnsi" w:hAnsiTheme="minorHAnsi" w:cstheme="minorHAnsi"/>
+          <w:sz w:val="20"/>
+          <w:szCs w:val="20"/>
+          <w:lang w:val="bg-BG"/>
+        </w:rPr>
+        <w:t>а</w:t>
+      </w:r>
+      <w:r>
+        <w:rPr>
+          <w:rFonts w:asciiTheme="minorHAnsi" w:hAnsiTheme="minorHAnsi" w:cstheme="minorHAnsi"/>
+          <w:sz w:val="20"/>
+          <w:szCs w:val="20"/>
+          <w:lang w:val="bg-BG"/>
+        </w:rPr>
+        <w:t xml:space="preserve"> </w:t>
+      </w:r>
+      <w:r>
+        <w:rPr>
+          <w:rFonts w:asciiTheme="minorHAnsi" w:hAnsiTheme="minorHAnsi" w:cstheme="minorHAnsi"/>
+          <w:sz w:val="20"/>
+          <w:szCs w:val="20"/>
+          <w:lang w:val="bg-BG"/>
+        </w:rPr>
+        <w:t>неправилни, неприложими, некоректни или нелигитимни, то той е длъжен да информира за това</w:t>
       </w:r>
     </w:p>
     <w:p>
@@ -1165,7 +1495,7 @@
           <w:szCs w:val="20"/>
           <w:lang w:val="bg-BG"/>
         </w:rPr>
-        <w:t xml:space="preserve">Ако ВЪЗЛОЖИТЕЛЯ настоява насоките и подадената информация да се следват, то ИЗПЪЛНИТЕЛЯТ има правото да </w:t>
+        <w:t xml:space="preserve">ВЪЗЛОЖИТЕЛЯ. Ако ВЪЗЛОЖИТЕЛЯ настоява насоките и подадената информация да се следват, то </w:t>
       </w:r>
     </w:p>
     <w:p>
@@ -1190,7 +1520,32 @@
           <w:szCs w:val="20"/>
           <w:lang w:val="bg-BG"/>
         </w:rPr>
-        <w:t>се се откаже или може да реши да продължи продължи единствено след писменото потвърждение н</w:t>
+        <w:t>ИЗПЪЛНИТЕЛЯТ има правото да се се откаже или може да реши да продължи продължи единствено след</w:t>
+      </w:r>
+    </w:p>
+    <w:p>
+      <w:pPr>
+        <w:pStyle w:val="Default"/>
+        <w:tabs>
+          <w:tab w:val="left" w:pos="3870"/>
+        </w:tabs>
+        <w:spacing w:after="10"/>
+        <w:ind w:left="-180" w:right="-450"/>
+        <w:rPr>
+          <w:rFonts w:asciiTheme="minorHAnsi" w:hAnsiTheme="minorHAnsi" w:cstheme="minorHAnsi"/>
+          <w:sz w:val="20"/>
+          <w:szCs w:val="20"/>
+          <w:lang w:val="bg-BG"/>
+        </w:rPr>
+      </w:pPr>
+      <w:r>
+        <w:rPr>
+          <w:rFonts w:asciiTheme="minorHAnsi" w:hAnsiTheme="minorHAnsi" w:cstheme="minorHAnsi"/>
+          <w:sz w:val="20"/>
+          <w:szCs w:val="20"/>
+          <w:lang w:val="bg-BG"/>
+        </w:rPr>
+        <w:t>писменото потвърждение н</w:t>
       </w:r>
       <w:r>
         <w:rPr>
@@ -1233,7 +1588,16 @@
           <w:szCs w:val="20"/>
           <w:lang w:val="bg-BG"/>
         </w:rPr>
-        <w:t>4. След изпълнението на задълженията си по точка (1) ИЗПЪЛНИТЕЛЯТ е длъжен да информира навременно</w:t>
+        <w:t>4. След изпълнението на задълженията си по точка (1) ИЗПЪЛНИТЕЛЯТ е длъжен да информира навре</w:t>
+      </w:r>
+      <w:r>
+        <w:rPr>
+          <w:rFonts w:asciiTheme="minorHAnsi" w:hAnsiTheme="minorHAnsi" w:cstheme="minorHAnsi"/>
+          <w:sz w:val="20"/>
+          <w:szCs w:val="20"/>
+          <w:lang w:val="bg-BG"/>
+        </w:rPr>
+        <w:t>-</w:t>
       </w:r>
     </w:p>
     <w:p>
@@ -1258,7 +1622,34 @@
           <w:szCs w:val="20"/>
           <w:lang w:val="bg-BG"/>
         </w:rPr>
-        <w:t>ВЪЗЛОЖИТЕЛЯ за постигнатите резултати. Междувременно ИЗПЪЛНИТЕЛЯТ получава правото на възнаграждение</w:t>
+        <w:t>м</w:t>
+      </w:r>
+      <w:r>
+        <w:rPr>
+          <w:rFonts w:asciiTheme="minorHAnsi" w:hAnsiTheme="minorHAnsi" w:cstheme="minorHAnsi"/>
+          <w:sz w:val="20"/>
+          <w:szCs w:val="20"/>
+          <w:lang w:val="bg-BG"/>
+        </w:rPr>
+        <w:t>енно</w:t>
+      </w:r>
+      <w:r>
+        <w:rPr>
+          <w:rFonts w:asciiTheme="minorHAnsi" w:hAnsiTheme="minorHAnsi" w:cstheme="minorHAnsi"/>
+          <w:sz w:val="20"/>
+          <w:szCs w:val="20"/>
+          <w:lang w:val="bg-BG"/>
+        </w:rPr>
+        <w:t xml:space="preserve"> </w:t>
+      </w:r>
+      <w:r>
+        <w:rPr>
+          <w:rFonts w:asciiTheme="minorHAnsi" w:hAnsiTheme="minorHAnsi" w:cstheme="minorHAnsi"/>
+          <w:sz w:val="20"/>
+          <w:szCs w:val="20"/>
+          <w:lang w:val="bg-BG"/>
+        </w:rPr>
+        <w:t xml:space="preserve">ВЪЗЛОЖИТЕЛЯ за постигнатите резултати. Междувременно ИЗПЪЛНИТЕЛЯТ получава правото на </w:t>
       </w:r>
     </w:p>
     <w:p>
@@ -1283,7 +1674,34 @@
           <w:szCs w:val="20"/>
           <w:lang w:val="bg-BG"/>
         </w:rPr>
-        <w:t>и възстановявяне на направените разходи описани в точка 5 и точка 6 от този договор. ИЗПЪЛНИТЕЛЯТ получава</w:t>
+        <w:t>в</w:t>
+      </w:r>
+      <w:r>
+        <w:rPr>
+          <w:rFonts w:asciiTheme="minorHAnsi" w:hAnsiTheme="minorHAnsi" w:cstheme="minorHAnsi"/>
+          <w:sz w:val="20"/>
+          <w:szCs w:val="20"/>
+          <w:lang w:val="bg-BG"/>
+        </w:rPr>
+        <w:t>ъзнаграждение</w:t>
+      </w:r>
+      <w:r>
+        <w:rPr>
+          <w:rFonts w:asciiTheme="minorHAnsi" w:hAnsiTheme="minorHAnsi" w:cstheme="minorHAnsi"/>
+          <w:sz w:val="20"/>
+          <w:szCs w:val="20"/>
+          <w:lang w:val="bg-BG"/>
+        </w:rPr>
+        <w:t xml:space="preserve"> </w:t>
+      </w:r>
+      <w:r>
+        <w:rPr>
+          <w:rFonts w:asciiTheme="minorHAnsi" w:hAnsiTheme="minorHAnsi" w:cstheme="minorHAnsi"/>
+          <w:sz w:val="20"/>
+          <w:szCs w:val="20"/>
+          <w:lang w:val="bg-BG"/>
+        </w:rPr>
+        <w:t>и възстановявяне на направените разходи описани в точка 5 и точка 6 от този договор.</w:t>
       </w:r>
     </w:p>
     <w:p>
@@ -1308,7 +1726,25 @@
           <w:szCs w:val="20"/>
           <w:lang w:val="bg-BG"/>
         </w:rPr>
-        <w:t>правото да си удържи въпросните суми без да е задължен да направи това лично и може да упълномощава трети</w:t>
+        <w:t>ИЗПЪЛНИТЕЛЯТ получава</w:t>
+      </w:r>
+      <w:r>
+        <w:rPr>
+          <w:rFonts w:asciiTheme="minorHAnsi" w:hAnsiTheme="minorHAnsi" w:cstheme="minorHAnsi"/>
+          <w:sz w:val="20"/>
+          <w:szCs w:val="20"/>
+          <w:lang w:val="bg-BG"/>
+        </w:rPr>
+        <w:t xml:space="preserve"> </w:t>
+      </w:r>
+      <w:r>
+        <w:rPr>
+          <w:rFonts w:asciiTheme="minorHAnsi" w:hAnsiTheme="minorHAnsi" w:cstheme="minorHAnsi"/>
+          <w:sz w:val="20"/>
+          <w:szCs w:val="20"/>
+          <w:lang w:val="bg-BG"/>
+        </w:rPr>
+        <w:t xml:space="preserve">правото да си удържи въпросните суми без да е задължен да направи това </w:t>
       </w:r>
     </w:p>
     <w:p>
@@ -1333,6 +1769,24 @@
           <w:szCs w:val="20"/>
           <w:lang w:val="bg-BG"/>
         </w:rPr>
+        <w:t>лично и може да упълномощава трети</w:t>
+      </w:r>
+      <w:r>
+        <w:rPr>
+          <w:rFonts w:asciiTheme="minorHAnsi" w:hAnsiTheme="minorHAnsi" w:cstheme="minorHAnsi"/>
+          <w:sz w:val="20"/>
+          <w:szCs w:val="20"/>
+          <w:lang w:val="bg-BG"/>
+        </w:rPr>
+        <w:t xml:space="preserve"> </w:t>
+      </w:r>
+      <w:r>
+        <w:rPr>
+          <w:rFonts w:asciiTheme="minorHAnsi" w:hAnsiTheme="minorHAnsi" w:cstheme="minorHAnsi"/>
+          <w:sz w:val="20"/>
+          <w:szCs w:val="20"/>
+          <w:lang w:val="bg-BG"/>
+        </w:rPr>
         <w:t xml:space="preserve">лица за това. </w:t>
       </w:r>
     </w:p>
@@ -1358,7 +1812,7 @@
           <w:szCs w:val="20"/>
           <w:lang w:val="bg-BG"/>
         </w:rPr>
-        <w:t>5. ИЗПЪЛНИТЕЛЯТ не е длъжен да проучва и не носи отговорност за легитимността на иска на ВЪЗЛОЖИТЕЛЯ към</w:t>
+        <w:t xml:space="preserve">5. ИЗПЪЛНИТЕЛЯТ не е длъжен да проучва и не носи отговорност за легитимността на иска на </w:t>
       </w:r>
     </w:p>
     <w:p>
@@ -1383,7 +1837,7 @@
           <w:szCs w:val="20"/>
           <w:lang w:val="bg-BG"/>
         </w:rPr>
-        <w:t xml:space="preserve"> американските данъчни власти, доколкото се отнася до неговия произход и размер. ИЗПЪЛНИТЕЛЯТ не е длъжен</w:t>
+        <w:t>ВЪЗЛОЖИТЕЛЯ към американските данъчни власти, доколкото се отнася до неговия произход и размер.</w:t>
       </w:r>
     </w:p>
     <w:p>
@@ -1408,7 +1862,43 @@
           <w:szCs w:val="20"/>
           <w:lang w:val="bg-BG"/>
         </w:rPr>
-        <w:t xml:space="preserve"> да проучва достоверността на документите и надеждността на информацията, които получава от ВЪЗЛОЖИТЕЛЯ с</w:t>
+        <w:t>ИЗПЪЛНИТЕЛЯТ не е</w:t>
+      </w:r>
+      <w:r>
+        <w:rPr>
+          <w:rFonts w:asciiTheme="minorHAnsi" w:hAnsiTheme="minorHAnsi" w:cstheme="minorHAnsi"/>
+          <w:sz w:val="20"/>
+          <w:szCs w:val="20"/>
+          <w:lang w:val="bg-BG"/>
+        </w:rPr>
+        <w:t xml:space="preserve"> </w:t>
+      </w:r>
+      <w:r>
+        <w:rPr>
+          <w:rFonts w:asciiTheme="minorHAnsi" w:hAnsiTheme="minorHAnsi" w:cstheme="minorHAnsi"/>
+          <w:sz w:val="20"/>
+          <w:szCs w:val="20"/>
+          <w:lang w:val="bg-BG"/>
+        </w:rPr>
+        <w:t>длъжен</w:t>
+      </w:r>
+      <w:r>
+        <w:rPr>
+          <w:rFonts w:asciiTheme="minorHAnsi" w:hAnsiTheme="minorHAnsi" w:cstheme="minorHAnsi"/>
+          <w:sz w:val="20"/>
+          <w:szCs w:val="20"/>
+          <w:lang w:val="bg-BG"/>
+        </w:rPr>
+        <w:t xml:space="preserve"> </w:t>
+      </w:r>
+      <w:r>
+        <w:rPr>
+          <w:rFonts w:asciiTheme="minorHAnsi" w:hAnsiTheme="minorHAnsi" w:cstheme="minorHAnsi"/>
+          <w:sz w:val="20"/>
+          <w:szCs w:val="20"/>
+          <w:lang w:val="bg-BG"/>
+        </w:rPr>
+        <w:t>да проучва достоверността на документите и надеждността на информацията,</w:t>
       </w:r>
     </w:p>
     <w:p>
@@ -1433,7 +1923,34 @@
           <w:szCs w:val="20"/>
           <w:lang w:val="bg-BG"/>
         </w:rPr>
-        <w:t xml:space="preserve"> цел уреждане на въпросите, съгласно този договор. По същия начин ИЗПЪЛНИТЕЛЯТ не е отговорен за</w:t>
+        <w:t>които получава от</w:t>
+      </w:r>
+      <w:r>
+        <w:rPr>
+          <w:rFonts w:asciiTheme="minorHAnsi" w:hAnsiTheme="minorHAnsi" w:cstheme="minorHAnsi"/>
+          <w:sz w:val="20"/>
+          <w:szCs w:val="20"/>
+          <w:lang w:val="bg-BG"/>
+        </w:rPr>
+        <w:t xml:space="preserve"> </w:t>
+      </w:r>
+      <w:r>
+        <w:rPr>
+          <w:rFonts w:asciiTheme="minorHAnsi" w:hAnsiTheme="minorHAnsi" w:cstheme="minorHAnsi"/>
+          <w:sz w:val="20"/>
+          <w:szCs w:val="20"/>
+          <w:lang w:val="bg-BG"/>
+        </w:rPr>
+        <w:t>ВЪЗЛОЖИТЕЛЯ с цел уреждане на въпросите, съгласно този договор. По същия начин</w:t>
+      </w:r>
+      <w:r>
+        <w:rPr>
+          <w:rFonts w:asciiTheme="minorHAnsi" w:hAnsiTheme="minorHAnsi" w:cstheme="minorHAnsi"/>
+          <w:sz w:val="20"/>
+          <w:szCs w:val="20"/>
+          <w:lang w:val="bg-BG"/>
+        </w:rPr>
+        <w:t xml:space="preserve"> </w:t>
       </w:r>
     </w:p>
     <w:p>
@@ -1458,7 +1975,25 @@
           <w:szCs w:val="20"/>
           <w:lang w:val="bg-BG"/>
         </w:rPr>
-        <w:t xml:space="preserve"> последствията от предоставяне на невярна, непълна или неточна информация от страна на ВЪЗЛОЖИТЕЛЯ в хода</w:t>
+        <w:t>ИЗПЪЛНИТЕЛЯТ не е</w:t>
+      </w:r>
+      <w:r>
+        <w:rPr>
+          <w:rFonts w:asciiTheme="minorHAnsi" w:hAnsiTheme="minorHAnsi" w:cstheme="minorHAnsi"/>
+          <w:sz w:val="20"/>
+          <w:szCs w:val="20"/>
+          <w:lang w:val="bg-BG"/>
+        </w:rPr>
+        <w:t xml:space="preserve"> </w:t>
+      </w:r>
+      <w:r>
+        <w:rPr>
+          <w:rFonts w:asciiTheme="minorHAnsi" w:hAnsiTheme="minorHAnsi" w:cstheme="minorHAnsi"/>
+          <w:sz w:val="20"/>
+          <w:szCs w:val="20"/>
+          <w:lang w:val="bg-BG"/>
+        </w:rPr>
+        <w:t xml:space="preserve">отговорен за последствията от предоставяне на невярна, непълна или неточна </w:t>
       </w:r>
     </w:p>
     <w:p>
@@ -1483,7 +2018,52 @@
           <w:szCs w:val="20"/>
           <w:lang w:val="bg-BG"/>
         </w:rPr>
-        <w:t xml:space="preserve"> на уреждането на бизнес делата. Това се отнася за информацията, предоставена от Доверителя в хода на</w:t>
+        <w:t>и</w:t>
+      </w:r>
+      <w:r>
+        <w:rPr>
+          <w:rFonts w:asciiTheme="minorHAnsi" w:hAnsiTheme="minorHAnsi" w:cstheme="minorHAnsi"/>
+          <w:sz w:val="20"/>
+          <w:szCs w:val="20"/>
+          <w:lang w:val="bg-BG"/>
+        </w:rPr>
+        <w:t>нформация</w:t>
+      </w:r>
+      <w:r>
+        <w:rPr>
+          <w:rFonts w:asciiTheme="minorHAnsi" w:hAnsiTheme="minorHAnsi" w:cstheme="minorHAnsi"/>
+          <w:sz w:val="20"/>
+          <w:szCs w:val="20"/>
+          <w:lang w:val="bg-BG"/>
+        </w:rPr>
+        <w:t xml:space="preserve"> </w:t>
+      </w:r>
+      <w:r>
+        <w:rPr>
+          <w:rFonts w:asciiTheme="minorHAnsi" w:hAnsiTheme="minorHAnsi" w:cstheme="minorHAnsi"/>
+          <w:sz w:val="20"/>
+          <w:szCs w:val="20"/>
+          <w:lang w:val="bg-BG"/>
+        </w:rPr>
+        <w:t>от страна на</w:t>
+      </w:r>
+      <w:r>
+        <w:rPr>
+          <w:rFonts w:asciiTheme="minorHAnsi" w:hAnsiTheme="minorHAnsi" w:cstheme="minorHAnsi"/>
+          <w:sz w:val="20"/>
+          <w:szCs w:val="20"/>
+          <w:lang w:val="bg-BG"/>
+        </w:rPr>
+        <w:t xml:space="preserve"> </w:t>
+      </w:r>
+      <w:r>
+        <w:rPr>
+          <w:rFonts w:asciiTheme="minorHAnsi" w:hAnsiTheme="minorHAnsi" w:cstheme="minorHAnsi"/>
+          <w:sz w:val="20"/>
+          <w:szCs w:val="20"/>
+          <w:lang w:val="bg-BG"/>
+        </w:rPr>
+        <w:t>ВЪЗЛОЖИТЕЛЯ в хода на уреждането на бизнес делата. Това се отнася за</w:t>
       </w:r>
     </w:p>
     <w:p>
@@ -1508,7 +2088,43 @@
           <w:szCs w:val="20"/>
           <w:lang w:val="bg-BG"/>
         </w:rPr>
-        <w:t xml:space="preserve"> регистрацията. </w:t>
+        <w:t>информацията,</w:t>
+      </w:r>
+      <w:r>
+        <w:rPr>
+          <w:rFonts w:asciiTheme="minorHAnsi" w:hAnsiTheme="minorHAnsi" w:cstheme="minorHAnsi"/>
+          <w:sz w:val="20"/>
+          <w:szCs w:val="20"/>
+          <w:lang w:val="bg-BG"/>
+        </w:rPr>
+        <w:t xml:space="preserve"> </w:t>
+      </w:r>
+      <w:r>
+        <w:rPr>
+          <w:rFonts w:asciiTheme="minorHAnsi" w:hAnsiTheme="minorHAnsi" w:cstheme="minorHAnsi"/>
+          <w:sz w:val="20"/>
+          <w:szCs w:val="20"/>
+          <w:lang w:val="bg-BG"/>
+        </w:rPr>
+        <w:t>предоставена от</w:t>
+      </w:r>
+      <w:r>
+        <w:rPr>
+          <w:rFonts w:asciiTheme="minorHAnsi" w:hAnsiTheme="minorHAnsi" w:cstheme="minorHAnsi"/>
+          <w:sz w:val="20"/>
+          <w:szCs w:val="20"/>
+          <w:lang w:val="bg-BG"/>
+        </w:rPr>
+        <w:t xml:space="preserve"> </w:t>
+      </w:r>
+      <w:r>
+        <w:rPr>
+          <w:rFonts w:asciiTheme="minorHAnsi" w:hAnsiTheme="minorHAnsi" w:cstheme="minorHAnsi"/>
+          <w:sz w:val="20"/>
+          <w:szCs w:val="20"/>
+          <w:lang w:val="bg-BG"/>
+        </w:rPr>
+        <w:t xml:space="preserve">Доверителя в хода на регистрацията. </w:t>
       </w:r>
     </w:p>
     <w:p>
@@ -1533,7 +2149,7 @@
           <w:szCs w:val="20"/>
           <w:lang w:val="bg-BG"/>
         </w:rPr>
-        <w:t>6. ИЗПЪЛНИТЕЛЯТ не носи отговорност ,ако поради други задължения на доверителя към Американските власти</w:t>
+        <w:t xml:space="preserve">6. ИЗПЪЛНИТЕЛЯТ не носи отговорност ,ако поради други задължения на доверителя към Американските </w:t>
       </w:r>
     </w:p>
     <w:p>
@@ -1558,7 +2174,7 @@
           <w:szCs w:val="20"/>
           <w:lang w:val="bg-BG"/>
         </w:rPr>
-        <w:t xml:space="preserve"> или настъпили промени в тяхното законодателство, извършването на услугата стане невъзможно или доведе до</w:t>
+        <w:t>власти или настъпили промени в тяхното законодателство, извършването на услугата стане невъзможно</w:t>
       </w:r>
     </w:p>
     <w:p>
@@ -1583,79 +2199,97 @@
           <w:szCs w:val="20"/>
           <w:lang w:val="bg-BG"/>
         </w:rPr>
-        <w:t xml:space="preserve"> промяна в размерът или срокът на възстановените данъци. </w:t>
-      </w:r>
-    </w:p>
-    <w:p>
-      <w:pPr>
-        <w:pStyle w:val="Default"/>
-        <w:tabs>
-          <w:tab w:val="left" w:pos="3870"/>
-        </w:tabs>
-        <w:ind w:left="-180" w:right="-450"/>
-        <w:rPr>
-          <w:rFonts w:asciiTheme="minorHAnsi" w:hAnsiTheme="minorHAnsi" w:cstheme="minorHAnsi"/>
-          <w:sz w:val="20"/>
-          <w:szCs w:val="20"/>
-          <w:lang w:val="bg-BG"/>
-        </w:rPr>
-      </w:pPr>
-      <w:r>
-        <w:rPr>
-          <w:rFonts w:asciiTheme="minorHAnsi" w:hAnsiTheme="minorHAnsi" w:cstheme="minorHAnsi"/>
-          <w:sz w:val="20"/>
-          <w:szCs w:val="20"/>
-          <w:lang w:val="bg-BG"/>
-        </w:rPr>
-        <w:t>7. ИЗПЪЛНИТЕЛЯТ има право да се оттегли от този договор, в случаите упоменати в точка 2.5, като не носи никаква</w:t>
-      </w:r>
-    </w:p>
-    <w:p>
-      <w:pPr>
-        <w:pStyle w:val="Default"/>
-        <w:tabs>
-          <w:tab w:val="left" w:pos="3870"/>
-        </w:tabs>
-        <w:ind w:left="-180" w:right="-450"/>
-        <w:rPr>
-          <w:rFonts w:asciiTheme="minorHAnsi" w:hAnsiTheme="minorHAnsi" w:cstheme="minorHAnsi"/>
-          <w:sz w:val="20"/>
-          <w:szCs w:val="20"/>
-          <w:lang w:val="bg-BG"/>
-        </w:rPr>
-      </w:pPr>
-      <w:r>
-        <w:rPr>
-          <w:rFonts w:asciiTheme="minorHAnsi" w:hAnsiTheme="minorHAnsi" w:cstheme="minorHAnsi"/>
-          <w:sz w:val="20"/>
-          <w:szCs w:val="20"/>
-          <w:lang w:val="bg-BG"/>
-        </w:rPr>
-        <w:t xml:space="preserve"> отговорност за финансови или други действия, предприети срещу ВЪЗЛОЖИТЕЛЯ от властите в САЩ, Република</w:t>
-      </w:r>
-    </w:p>
-    <w:p>
-      <w:pPr>
-        <w:pStyle w:val="Default"/>
-        <w:tabs>
-          <w:tab w:val="left" w:pos="3870"/>
-        </w:tabs>
-        <w:ind w:left="-180" w:right="-450"/>
-        <w:rPr>
-          <w:rFonts w:asciiTheme="minorHAnsi" w:hAnsiTheme="minorHAnsi" w:cstheme="minorHAnsi"/>
-          <w:sz w:val="20"/>
-          <w:szCs w:val="20"/>
-          <w:lang w:val="bg-BG"/>
-        </w:rPr>
-      </w:pPr>
-      <w:r>
-        <w:rPr>
-          <w:rFonts w:asciiTheme="minorHAnsi" w:hAnsiTheme="minorHAnsi" w:cstheme="minorHAnsi"/>
-          <w:sz w:val="20"/>
-          <w:szCs w:val="20"/>
-          <w:lang w:val="bg-BG"/>
-        </w:rPr>
-        <w:t xml:space="preserve"> България или други страни. Това не засяга предвиденото по точка 3.4. </w:t>
+        <w:t>или</w:t>
+      </w:r>
+      <w:r>
+        <w:rPr>
+          <w:rFonts w:asciiTheme="minorHAnsi" w:hAnsiTheme="minorHAnsi" w:cstheme="minorHAnsi"/>
+          <w:sz w:val="20"/>
+          <w:szCs w:val="20"/>
+          <w:lang w:val="bg-BG"/>
+        </w:rPr>
+        <w:t xml:space="preserve"> д</w:t>
+      </w:r>
+      <w:r>
+        <w:rPr>
+          <w:rFonts w:asciiTheme="minorHAnsi" w:hAnsiTheme="minorHAnsi" w:cstheme="minorHAnsi"/>
+          <w:sz w:val="20"/>
+          <w:szCs w:val="20"/>
+          <w:lang w:val="bg-BG"/>
+        </w:rPr>
+        <w:t xml:space="preserve">оведе до промяна в размерът или срокът на възстановените данъци. </w:t>
+      </w:r>
+    </w:p>
+    <w:p>
+      <w:pPr>
+        <w:pStyle w:val="Default"/>
+        <w:tabs>
+          <w:tab w:val="left" w:pos="3870"/>
+        </w:tabs>
+        <w:ind w:left="-180" w:right="-450"/>
+        <w:rPr>
+          <w:rFonts w:asciiTheme="minorHAnsi" w:hAnsiTheme="minorHAnsi" w:cstheme="minorHAnsi"/>
+          <w:sz w:val="20"/>
+          <w:szCs w:val="20"/>
+          <w:lang w:val="bg-BG"/>
+        </w:rPr>
+      </w:pPr>
+      <w:r>
+        <w:rPr>
+          <w:rFonts w:asciiTheme="minorHAnsi" w:hAnsiTheme="minorHAnsi" w:cstheme="minorHAnsi"/>
+          <w:sz w:val="20"/>
+          <w:szCs w:val="20"/>
+          <w:lang w:val="bg-BG"/>
+        </w:rPr>
+        <w:t xml:space="preserve">7. ИЗПЪЛНИТЕЛЯТ има право да се оттегли от този договор, в случаите упоменати в точка 2.5, като не носи </w:t>
+      </w:r>
+    </w:p>
+    <w:p>
+      <w:pPr>
+        <w:pStyle w:val="Default"/>
+        <w:tabs>
+          <w:tab w:val="left" w:pos="3870"/>
+        </w:tabs>
+        <w:ind w:left="-180" w:right="-450"/>
+        <w:rPr>
+          <w:rFonts w:asciiTheme="minorHAnsi" w:hAnsiTheme="minorHAnsi" w:cstheme="minorHAnsi"/>
+          <w:sz w:val="20"/>
+          <w:szCs w:val="20"/>
+          <w:lang w:val="bg-BG"/>
+        </w:rPr>
+      </w:pPr>
+      <w:r>
+        <w:rPr>
+          <w:rFonts w:asciiTheme="minorHAnsi" w:hAnsiTheme="minorHAnsi" w:cstheme="minorHAnsi"/>
+          <w:sz w:val="20"/>
+          <w:szCs w:val="20"/>
+          <w:lang w:val="bg-BG"/>
+        </w:rPr>
+        <w:t xml:space="preserve">никаква отговорност за финансови или други действия, предприети срещу ВЪЗЛОЖИТЕЛЯ от властите в </w:t>
+      </w:r>
+    </w:p>
+    <w:p>
+      <w:pPr>
+        <w:pStyle w:val="Default"/>
+        <w:tabs>
+          <w:tab w:val="left" w:pos="3870"/>
+        </w:tabs>
+        <w:ind w:left="-180" w:right="-450"/>
+        <w:rPr>
+          <w:rFonts w:asciiTheme="minorHAnsi" w:hAnsiTheme="minorHAnsi" w:cstheme="minorHAnsi"/>
+          <w:sz w:val="20"/>
+          <w:szCs w:val="20"/>
+          <w:lang w:val="bg-BG"/>
+        </w:rPr>
+      </w:pPr>
+      <w:r>
+        <w:rPr>
+          <w:rFonts w:asciiTheme="minorHAnsi" w:hAnsiTheme="minorHAnsi" w:cstheme="minorHAnsi"/>
+          <w:sz w:val="20"/>
+          <w:szCs w:val="20"/>
+          <w:lang w:val="bg-BG"/>
+        </w:rPr>
+        <w:t xml:space="preserve">САЩ,Република България или други страни. Това не засяга предвиденото по точка 3.4. </w:t>
       </w:r>
     </w:p>
     <w:p>
@@ -1713,15 +2347,6 @@
           <w:lang w:val="bg-BG"/>
         </w:rPr>
       </w:pPr>
-      <w:r>
-        <w:rPr>
-          <w:rFonts w:asciiTheme="minorHAnsi" w:hAnsiTheme="minorHAnsi" w:cstheme="minorHAnsi"/>
-          <w:sz w:val="20"/>
-          <w:szCs w:val="20"/>
-          <w:lang w:val="bg-BG"/>
-        </w:rPr>
-        <w:t>1. ВЪЗЛОЖИТЕЛЯ е длъжен да попълни с коректно съдържание и предаде на ИЗПЪЛНИТЕЛЯТ всички документи и</w:t>
-      </w:r>
     </w:p>
     <w:p>
       <w:pPr>
@@ -1746,7 +2371,7 @@
           <w:lang w:val="bg-BG"/>
         </w:rPr>
         <w:lastRenderedPageBreak/>
-        <w:t>информация, които са важни за уреждането на упоменатите въпроси, при подписване на този договор. Това се</w:t>
+        <w:t xml:space="preserve">1. ВЪЗЛОЖИТЕЛЯ е длъжен да попълни с коректно съдържание и предаде на ИЗПЪЛНИТЕЛЯТ всички </w:t>
       </w:r>
     </w:p>
     <w:p>
@@ -1771,7 +2396,25 @@
           <w:szCs w:val="20"/>
           <w:lang w:val="bg-BG"/>
         </w:rPr>
-        <w:t xml:space="preserve"> отнася именно за документи, удостоверяващи правните основания, сумата и валидното съществуване на иска на</w:t>
+        <w:t>документи и</w:t>
+      </w:r>
+      <w:r>
+        <w:rPr>
+          <w:rFonts w:asciiTheme="minorHAnsi" w:hAnsiTheme="minorHAnsi" w:cstheme="minorHAnsi"/>
+          <w:sz w:val="20"/>
+          <w:szCs w:val="20"/>
+          <w:lang w:val="bg-BG"/>
+        </w:rPr>
+        <w:t xml:space="preserve"> </w:t>
+      </w:r>
+      <w:r>
+        <w:rPr>
+          <w:rFonts w:asciiTheme="minorHAnsi" w:hAnsiTheme="minorHAnsi" w:cstheme="minorHAnsi"/>
+          <w:sz w:val="20"/>
+          <w:szCs w:val="20"/>
+          <w:lang w:val="bg-BG"/>
+        </w:rPr>
+        <w:t xml:space="preserve">информация, които са важни за уреждането на упоменатите въпроси, при подписване на </w:t>
       </w:r>
     </w:p>
     <w:p>
@@ -1796,7 +2439,25 @@
           <w:szCs w:val="20"/>
           <w:lang w:val="bg-BG"/>
         </w:rPr>
-        <w:t xml:space="preserve"> ВЪЗЛОЖИТЕЛЯ към американските данъчни власти, по-конкретно три оригинални извлечения от формуляр “Form</w:t>
+        <w:t>този</w:t>
+      </w:r>
+      <w:r>
+        <w:rPr>
+          <w:rFonts w:asciiTheme="minorHAnsi" w:hAnsiTheme="minorHAnsi" w:cstheme="minorHAnsi"/>
+          <w:sz w:val="20"/>
+          <w:szCs w:val="20"/>
+          <w:lang w:val="bg-BG"/>
+        </w:rPr>
+        <w:t xml:space="preserve"> </w:t>
+      </w:r>
+      <w:r>
+        <w:rPr>
+          <w:rFonts w:asciiTheme="minorHAnsi" w:hAnsiTheme="minorHAnsi" w:cstheme="minorHAnsi"/>
+          <w:sz w:val="20"/>
+          <w:szCs w:val="20"/>
+          <w:lang w:val="bg-BG"/>
+        </w:rPr>
+        <w:t xml:space="preserve">договор. Това се отнася именно за документи, удостоверяващи правните основания, сумата и </w:t>
       </w:r>
     </w:p>
     <w:p>
@@ -1821,7 +2482,25 @@
           <w:szCs w:val="20"/>
           <w:lang w:val="bg-BG"/>
         </w:rPr>
-        <w:t xml:space="preserve"> W2 Wage and Tax Statement” (наричан подолу “формуляр W2”) от всеки работодател, при който е работил по</w:t>
+        <w:t>валидното</w:t>
+      </w:r>
+      <w:r>
+        <w:rPr>
+          <w:rFonts w:asciiTheme="minorHAnsi" w:hAnsiTheme="minorHAnsi" w:cstheme="minorHAnsi"/>
+          <w:sz w:val="20"/>
+          <w:szCs w:val="20"/>
+          <w:lang w:val="bg-BG"/>
+        </w:rPr>
+        <w:t xml:space="preserve"> </w:t>
+      </w:r>
+      <w:r>
+        <w:rPr>
+          <w:rFonts w:asciiTheme="minorHAnsi" w:hAnsiTheme="minorHAnsi" w:cstheme="minorHAnsi"/>
+          <w:sz w:val="20"/>
+          <w:szCs w:val="20"/>
+          <w:lang w:val="bg-BG"/>
+        </w:rPr>
+        <w:t xml:space="preserve">съществуване на иска на ВЪЗЛОЖИТЕЛЯ към американските данъчни власти, по-конкретно </w:t>
       </w:r>
     </w:p>
     <w:p>
@@ -1846,7 +2525,25 @@
           <w:szCs w:val="20"/>
           <w:lang w:val="bg-BG"/>
         </w:rPr>
-        <w:t xml:space="preserve"> време на престоя си в САЩ и документите изисквани при регистрация. </w:t>
+        <w:t>три оригинални</w:t>
+      </w:r>
+      <w:r>
+        <w:rPr>
+          <w:rFonts w:asciiTheme="minorHAnsi" w:hAnsiTheme="minorHAnsi" w:cstheme="minorHAnsi"/>
+          <w:sz w:val="20"/>
+          <w:szCs w:val="20"/>
+          <w:lang w:val="bg-BG"/>
+        </w:rPr>
+        <w:t xml:space="preserve"> </w:t>
+      </w:r>
+      <w:r>
+        <w:rPr>
+          <w:rFonts w:asciiTheme="minorHAnsi" w:hAnsiTheme="minorHAnsi" w:cstheme="minorHAnsi"/>
+          <w:sz w:val="20"/>
+          <w:szCs w:val="20"/>
+          <w:lang w:val="bg-BG"/>
+        </w:rPr>
+        <w:t xml:space="preserve">извлечения от формуляр “Form W2 Wage and Tax Statement” (наричан подолу </w:t>
       </w:r>
     </w:p>
     <w:p>
@@ -1871,7 +2568,25 @@
           <w:szCs w:val="20"/>
           <w:lang w:val="bg-BG"/>
         </w:rPr>
-        <w:t>2. КЛИЕНТЪТ е длъжен да информира ИЗПЪЛНИТЕЛЯ за всички факти, които могат да повлияят на иска и тези факти</w:t>
+        <w:t>“формуляр W2”) от всеки</w:t>
+      </w:r>
+      <w:r>
+        <w:rPr>
+          <w:rFonts w:asciiTheme="minorHAnsi" w:hAnsiTheme="minorHAnsi" w:cstheme="minorHAnsi"/>
+          <w:sz w:val="20"/>
+          <w:szCs w:val="20"/>
+          <w:lang w:val="bg-BG"/>
+        </w:rPr>
+        <w:t xml:space="preserve"> </w:t>
+      </w:r>
+      <w:r>
+        <w:rPr>
+          <w:rFonts w:asciiTheme="minorHAnsi" w:hAnsiTheme="minorHAnsi" w:cstheme="minorHAnsi"/>
+          <w:sz w:val="20"/>
+          <w:szCs w:val="20"/>
+          <w:lang w:val="bg-BG"/>
+        </w:rPr>
+        <w:t>работодател, при който е работил по време на престоя си в САЩ и документите</w:t>
       </w:r>
     </w:p>
     <w:p>
@@ -1896,7 +2611,7 @@
           <w:szCs w:val="20"/>
           <w:lang w:val="bg-BG"/>
         </w:rPr>
-        <w:t xml:space="preserve"> трябва своевременно да си отнесат към информацията подадена още с регистрацията. Ако ВЪЗЛОЖИТЕЛЯТ</w:t>
+        <w:t xml:space="preserve">изисквани при регистрация. </w:t>
       </w:r>
     </w:p>
     <w:p>
@@ -1921,7 +2636,7 @@
           <w:szCs w:val="20"/>
           <w:lang w:val="bg-BG"/>
         </w:rPr>
-        <w:t xml:space="preserve"> наруши това си задължение или осуети услията на ИЗПЪЛНИТЕЛЯ да уреди иска, то ИЗПЪЛНИТЕЛЯТ е в правото си</w:t>
+        <w:t xml:space="preserve">2. КЛИЕНТЪТ е длъжен да информира ИЗПЪЛНИТЕЛЯ за всички факти, които могат да повлияят на иска и </w:t>
       </w:r>
     </w:p>
     <w:p>
@@ -1946,7 +2661,34 @@
           <w:szCs w:val="20"/>
           <w:lang w:val="bg-BG"/>
         </w:rPr>
-        <w:t xml:space="preserve"> да се откаже. </w:t>
+        <w:t>т</w:t>
+      </w:r>
+      <w:r>
+        <w:rPr>
+          <w:rFonts w:asciiTheme="minorHAnsi" w:hAnsiTheme="minorHAnsi" w:cstheme="minorHAnsi"/>
+          <w:sz w:val="20"/>
+          <w:szCs w:val="20"/>
+          <w:lang w:val="bg-BG"/>
+        </w:rPr>
+        <w:t>ези</w:t>
+      </w:r>
+      <w:r>
+        <w:rPr>
+          <w:rFonts w:asciiTheme="minorHAnsi" w:hAnsiTheme="minorHAnsi" w:cstheme="minorHAnsi"/>
+          <w:sz w:val="20"/>
+          <w:szCs w:val="20"/>
+          <w:lang w:val="bg-BG"/>
+        </w:rPr>
+        <w:t xml:space="preserve"> </w:t>
+      </w:r>
+      <w:r>
+        <w:rPr>
+          <w:rFonts w:asciiTheme="minorHAnsi" w:hAnsiTheme="minorHAnsi" w:cstheme="minorHAnsi"/>
+          <w:sz w:val="20"/>
+          <w:szCs w:val="20"/>
+          <w:lang w:val="bg-BG"/>
+        </w:rPr>
+        <w:t xml:space="preserve">факти трябва своевременно да си отнесат към информацията подадена още с регистрацията. Ако </w:t>
       </w:r>
     </w:p>
     <w:p>
@@ -1971,7 +2713,25 @@
           <w:szCs w:val="20"/>
           <w:lang w:val="bg-BG"/>
         </w:rPr>
-        <w:t>3. ИЗПЪЛНИТЕЛЯТ има право да изиска по всяко време от КЛИЕНТА, а той е длъжен да допълни или изясни всички</w:t>
+        <w:t>ВЪЗЛОЖИТЕЛЯТ</w:t>
+      </w:r>
+      <w:r>
+        <w:rPr>
+          <w:rFonts w:asciiTheme="minorHAnsi" w:hAnsiTheme="minorHAnsi" w:cstheme="minorHAnsi"/>
+          <w:sz w:val="20"/>
+          <w:szCs w:val="20"/>
+          <w:lang w:val="bg-BG"/>
+        </w:rPr>
+        <w:t xml:space="preserve"> </w:t>
+      </w:r>
+      <w:r>
+        <w:rPr>
+          <w:rFonts w:asciiTheme="minorHAnsi" w:hAnsiTheme="minorHAnsi" w:cstheme="minorHAnsi"/>
+          <w:sz w:val="20"/>
+          <w:szCs w:val="20"/>
+          <w:lang w:val="bg-BG"/>
+        </w:rPr>
+        <w:t xml:space="preserve">наруши това си задължение или осуети услията на ИЗПЪЛНИТЕЛЯ да уреди иска, то </w:t>
       </w:r>
     </w:p>
     <w:p>
@@ -1996,7 +2756,25 @@
           <w:szCs w:val="20"/>
           <w:lang w:val="bg-BG"/>
         </w:rPr>
-        <w:t xml:space="preserve"> подробности, необходими за надлежното изпълнение на предмета на този договор, като Доверителят е длъжен да</w:t>
+        <w:t>ИЗПЪЛНИТЕЛЯТ е в</w:t>
+      </w:r>
+      <w:r>
+        <w:rPr>
+          <w:rFonts w:asciiTheme="minorHAnsi" w:hAnsiTheme="minorHAnsi" w:cstheme="minorHAnsi"/>
+          <w:sz w:val="20"/>
+          <w:szCs w:val="20"/>
+          <w:lang w:val="bg-BG"/>
+        </w:rPr>
+        <w:t xml:space="preserve"> </w:t>
+      </w:r>
+      <w:r>
+        <w:rPr>
+          <w:rFonts w:asciiTheme="minorHAnsi" w:hAnsiTheme="minorHAnsi" w:cstheme="minorHAnsi"/>
+          <w:sz w:val="20"/>
+          <w:szCs w:val="20"/>
+          <w:lang w:val="bg-BG"/>
+        </w:rPr>
+        <w:t xml:space="preserve">правото си да се откаже. </w:t>
       </w:r>
     </w:p>
     <w:p>
@@ -2021,7 +2799,7 @@
           <w:szCs w:val="20"/>
           <w:lang w:val="bg-BG"/>
         </w:rPr>
-        <w:t xml:space="preserve"> предостави тази информация без закъснение. </w:t>
+        <w:t xml:space="preserve">3. ИЗПЪЛНИТЕЛЯТ има право да изиска по всяко време от КЛИЕНТА, а той е длъжен да допълни или </w:t>
       </w:r>
     </w:p>
     <w:p>
@@ -2046,6 +2824,119 @@
           <w:szCs w:val="20"/>
           <w:lang w:val="bg-BG"/>
         </w:rPr>
+        <w:t>И</w:t>
+      </w:r>
+      <w:r>
+        <w:rPr>
+          <w:rFonts w:asciiTheme="minorHAnsi" w:hAnsiTheme="minorHAnsi" w:cstheme="minorHAnsi"/>
+          <w:sz w:val="20"/>
+          <w:szCs w:val="20"/>
+          <w:lang w:val="bg-BG"/>
+        </w:rPr>
+        <w:t>зясни</w:t>
+      </w:r>
+      <w:r>
+        <w:rPr>
+          <w:rFonts w:asciiTheme="minorHAnsi" w:hAnsiTheme="minorHAnsi" w:cstheme="minorHAnsi"/>
+          <w:sz w:val="20"/>
+          <w:szCs w:val="20"/>
+          <w:lang w:val="bg-BG"/>
+        </w:rPr>
+        <w:t xml:space="preserve"> </w:t>
+      </w:r>
+      <w:r>
+        <w:rPr>
+          <w:rFonts w:asciiTheme="minorHAnsi" w:hAnsiTheme="minorHAnsi" w:cstheme="minorHAnsi"/>
+          <w:sz w:val="20"/>
+          <w:szCs w:val="20"/>
+          <w:lang w:val="bg-BG"/>
+        </w:rPr>
+        <w:t>всички</w:t>
+      </w:r>
+      <w:r>
+        <w:rPr>
+          <w:rFonts w:asciiTheme="minorHAnsi" w:hAnsiTheme="minorHAnsi" w:cstheme="minorHAnsi"/>
+          <w:sz w:val="20"/>
+          <w:szCs w:val="20"/>
+          <w:lang w:val="bg-BG"/>
+        </w:rPr>
+        <w:t xml:space="preserve"> </w:t>
+      </w:r>
+      <w:r>
+        <w:rPr>
+          <w:rFonts w:asciiTheme="minorHAnsi" w:hAnsiTheme="minorHAnsi" w:cstheme="minorHAnsi"/>
+          <w:sz w:val="20"/>
+          <w:szCs w:val="20"/>
+          <w:lang w:val="bg-BG"/>
+        </w:rPr>
+        <w:t>подробности, необходими за надлежното изпълнение на предмета на този договор, като</w:t>
+      </w:r>
+    </w:p>
+    <w:p>
+      <w:pPr>
+        <w:pStyle w:val="Default"/>
+        <w:tabs>
+          <w:tab w:val="left" w:pos="3870"/>
+        </w:tabs>
+        <w:spacing w:after="15"/>
+        <w:ind w:left="-180" w:right="-450"/>
+        <w:rPr>
+          <w:rFonts w:asciiTheme="minorHAnsi" w:hAnsiTheme="minorHAnsi" w:cstheme="minorHAnsi"/>
+          <w:sz w:val="20"/>
+          <w:szCs w:val="20"/>
+          <w:lang w:val="bg-BG"/>
+        </w:rPr>
+      </w:pPr>
+      <w:r>
+        <w:rPr>
+          <w:rFonts w:asciiTheme="minorHAnsi" w:hAnsiTheme="minorHAnsi" w:cstheme="minorHAnsi"/>
+          <w:sz w:val="20"/>
+          <w:szCs w:val="20"/>
+          <w:lang w:val="bg-BG"/>
+        </w:rPr>
+        <w:t>Доверителят</w:t>
+      </w:r>
+      <w:r>
+        <w:rPr>
+          <w:rFonts w:asciiTheme="minorHAnsi" w:hAnsiTheme="minorHAnsi" w:cstheme="minorHAnsi"/>
+          <w:sz w:val="20"/>
+          <w:szCs w:val="20"/>
+          <w:lang w:val="bg-BG"/>
+        </w:rPr>
+        <w:t xml:space="preserve"> </w:t>
+      </w:r>
+      <w:r>
+        <w:rPr>
+          <w:rFonts w:asciiTheme="minorHAnsi" w:hAnsiTheme="minorHAnsi" w:cstheme="minorHAnsi"/>
+          <w:sz w:val="20"/>
+          <w:szCs w:val="20"/>
+          <w:lang w:val="bg-BG"/>
+        </w:rPr>
+        <w:t xml:space="preserve">е длъжен да предостави тази информация без закъснение. </w:t>
+      </w:r>
+    </w:p>
+    <w:p>
+      <w:pPr>
+        <w:pStyle w:val="Default"/>
+        <w:tabs>
+          <w:tab w:val="left" w:pos="3870"/>
+        </w:tabs>
+        <w:spacing w:after="15"/>
+        <w:ind w:left="-180" w:right="-450"/>
+        <w:rPr>
+          <w:rFonts w:asciiTheme="minorHAnsi" w:hAnsiTheme="minorHAnsi" w:cstheme="minorHAnsi"/>
+          <w:sz w:val="20"/>
+          <w:szCs w:val="20"/>
+          <w:lang w:val="bg-BG"/>
+        </w:rPr>
+      </w:pPr>
+      <w:r>
+        <w:rPr>
+          <w:rFonts w:asciiTheme="minorHAnsi" w:hAnsiTheme="minorHAnsi" w:cstheme="minorHAnsi"/>
+          <w:sz w:val="20"/>
+          <w:szCs w:val="20"/>
+          <w:lang w:val="bg-BG"/>
+        </w:rPr>
         <w:t>4. В случай на предизвикано оттегляне на ИЗПЪЛНИТЕЛЯ съгласно точка 2.3; 2.6; 3.2; 3.6 от този договор,</w:t>
       </w:r>
     </w:p>
@@ -2071,7 +2962,7 @@
           <w:szCs w:val="20"/>
           <w:lang w:val="bg-BG"/>
         </w:rPr>
-        <w:t xml:space="preserve"> ВЪЗЛОЖИТЕЛЯ е длъжен да възстанови на ИЗПЪЛНИТЕЛЯ всички разходи, понесени във връзка с уреждането на</w:t>
+        <w:t xml:space="preserve"> ВЪЗЛОЖИТЕЛЯ е длъжен да възстанови на ИЗПЪЛНИТЕЛЯ всички разходи, понесени във връзка с</w:t>
       </w:r>
     </w:p>
     <w:p>
@@ -2096,7 +2987,43 @@
           <w:szCs w:val="20"/>
           <w:lang w:val="bg-BG"/>
         </w:rPr>
-        <w:t xml:space="preserve"> въпросите до влизането в сила на това прекратяване, както и съответната сума по възнаграждението, в случай че</w:t>
+        <w:t>урежда</w:t>
+      </w:r>
+      <w:r>
+        <w:rPr>
+          <w:rFonts w:asciiTheme="minorHAnsi" w:hAnsiTheme="minorHAnsi" w:cstheme="minorHAnsi"/>
+          <w:sz w:val="20"/>
+          <w:szCs w:val="20"/>
+          <w:lang w:val="bg-BG"/>
+        </w:rPr>
+        <w:t>н</w:t>
+      </w:r>
+      <w:r>
+        <w:rPr>
+          <w:rFonts w:asciiTheme="minorHAnsi" w:hAnsiTheme="minorHAnsi" w:cstheme="minorHAnsi"/>
+          <w:sz w:val="20"/>
+          <w:szCs w:val="20"/>
+          <w:lang w:val="bg-BG"/>
+        </w:rPr>
+        <w:t>ето</w:t>
+      </w:r>
+      <w:r>
+        <w:rPr>
+          <w:rFonts w:asciiTheme="minorHAnsi" w:hAnsiTheme="minorHAnsi" w:cstheme="minorHAnsi"/>
+          <w:sz w:val="20"/>
+          <w:szCs w:val="20"/>
+          <w:lang w:val="bg-BG"/>
+        </w:rPr>
+        <w:t xml:space="preserve"> </w:t>
+      </w:r>
+      <w:r>
+        <w:rPr>
+          <w:rFonts w:asciiTheme="minorHAnsi" w:hAnsiTheme="minorHAnsi" w:cstheme="minorHAnsi"/>
+          <w:sz w:val="20"/>
+          <w:szCs w:val="20"/>
+          <w:lang w:val="bg-BG"/>
+        </w:rPr>
+        <w:t>на въпросите до влизането в сила на това прекратяване, както и съответната сума по</w:t>
       </w:r>
     </w:p>
     <w:p>
@@ -2121,7 +3048,43 @@
           <w:szCs w:val="20"/>
           <w:lang w:val="bg-BG"/>
         </w:rPr>
-        <w:t xml:space="preserve"> ИЗПЪЛНИТЕЛЯТ е започнал процедура по Връщането на данъците. </w:t>
+        <w:t>възнаграждението</w:t>
+      </w:r>
+      <w:r>
+        <w:rPr>
+          <w:rFonts w:asciiTheme="minorHAnsi" w:hAnsiTheme="minorHAnsi" w:cstheme="minorHAnsi"/>
+          <w:sz w:val="20"/>
+          <w:szCs w:val="20"/>
+          <w:lang w:val="bg-BG"/>
+        </w:rPr>
+        <w:t xml:space="preserve">, </w:t>
+      </w:r>
+      <w:r>
+        <w:rPr>
+          <w:rFonts w:asciiTheme="minorHAnsi" w:hAnsiTheme="minorHAnsi" w:cstheme="minorHAnsi"/>
+          <w:sz w:val="20"/>
+          <w:szCs w:val="20"/>
+          <w:lang w:val="bg-BG"/>
+        </w:rPr>
+        <w:t>в случай</w:t>
+      </w:r>
+      <w:r>
+        <w:rPr>
+          <w:rFonts w:asciiTheme="minorHAnsi" w:hAnsiTheme="minorHAnsi" w:cstheme="minorHAnsi"/>
+          <w:sz w:val="20"/>
+          <w:szCs w:val="20"/>
+          <w:lang w:val="bg-BG"/>
+        </w:rPr>
+        <w:t xml:space="preserve"> </w:t>
+      </w:r>
+      <w:r>
+        <w:rPr>
+          <w:rFonts w:asciiTheme="minorHAnsi" w:hAnsiTheme="minorHAnsi" w:cstheme="minorHAnsi"/>
+          <w:sz w:val="20"/>
+          <w:szCs w:val="20"/>
+          <w:lang w:val="bg-BG"/>
+        </w:rPr>
+        <w:t xml:space="preserve">че ИЗПЪЛНИТЕЛЯТ е започнал процедура по Връщането на данъците. </w:t>
       </w:r>
     </w:p>
     <w:p>
@@ -2146,7 +3109,7 @@
           <w:szCs w:val="20"/>
           <w:lang w:val="bg-BG"/>
         </w:rPr>
-        <w:t>5. Съгласно Закона за защита на личните данни, при сключването на този договор ВЪЗЛОЖИТЕЛЯ дава своето</w:t>
+        <w:t xml:space="preserve">5. Съгласно Закона за защита на личните данни, при сключването на този договор ВЪЗЛОЖИТЕЛЯ дава </w:t>
       </w:r>
     </w:p>
     <w:p>
@@ -2171,7 +3134,34 @@
           <w:szCs w:val="20"/>
           <w:lang w:val="bg-BG"/>
         </w:rPr>
-        <w:t xml:space="preserve"> съгласие за ползване и обработване на данните, предадени по време на регистрацията и дава съгласието си за</w:t>
+        <w:t>с</w:t>
+      </w:r>
+      <w:r>
+        <w:rPr>
+          <w:rFonts w:asciiTheme="minorHAnsi" w:hAnsiTheme="minorHAnsi" w:cstheme="minorHAnsi"/>
+          <w:sz w:val="20"/>
+          <w:szCs w:val="20"/>
+          <w:lang w:val="bg-BG"/>
+        </w:rPr>
+        <w:t>воето</w:t>
+      </w:r>
+      <w:r>
+        <w:rPr>
+          <w:rFonts w:asciiTheme="minorHAnsi" w:hAnsiTheme="minorHAnsi" w:cstheme="minorHAnsi"/>
+          <w:sz w:val="20"/>
+          <w:szCs w:val="20"/>
+          <w:lang w:val="bg-BG"/>
+        </w:rPr>
+        <w:t xml:space="preserve"> </w:t>
+      </w:r>
+      <w:r>
+        <w:rPr>
+          <w:rFonts w:asciiTheme="minorHAnsi" w:hAnsiTheme="minorHAnsi" w:cstheme="minorHAnsi"/>
+          <w:sz w:val="20"/>
+          <w:szCs w:val="20"/>
+          <w:lang w:val="bg-BG"/>
+        </w:rPr>
+        <w:t xml:space="preserve">съгласие за ползване и обработване на данните, предадени по време на регистрацията и дава </w:t>
       </w:r>
     </w:p>
     <w:p>
@@ -2196,7 +3186,25 @@
           <w:szCs w:val="20"/>
           <w:lang w:val="bg-BG"/>
         </w:rPr>
-        <w:t xml:space="preserve"> последващото й изпращане до САЩ в хода на осъществяване предмета на този договор. Съгласието се дава за срок</w:t>
+        <w:t>съгласието си за</w:t>
+      </w:r>
+      <w:r>
+        <w:rPr>
+          <w:rFonts w:asciiTheme="minorHAnsi" w:hAnsiTheme="minorHAnsi" w:cstheme="minorHAnsi"/>
+          <w:sz w:val="20"/>
+          <w:szCs w:val="20"/>
+          <w:lang w:val="bg-BG"/>
+        </w:rPr>
+        <w:t xml:space="preserve"> </w:t>
+      </w:r>
+      <w:r>
+        <w:rPr>
+          <w:rFonts w:asciiTheme="minorHAnsi" w:hAnsiTheme="minorHAnsi" w:cstheme="minorHAnsi"/>
+          <w:sz w:val="20"/>
+          <w:szCs w:val="20"/>
+          <w:lang w:val="bg-BG"/>
+        </w:rPr>
+        <w:t>последващото й изпращане до САЩ в хода на осъществяване предмета на този договор.</w:t>
       </w:r>
     </w:p>
     <w:p>
@@ -2221,79 +3229,106 @@
           <w:szCs w:val="20"/>
           <w:lang w:val="bg-BG"/>
         </w:rPr>
-        <w:t xml:space="preserve"> от 3 години от датата на подписване на настоящия договор. </w:t>
-      </w:r>
-    </w:p>
-    <w:p>
-      <w:pPr>
-        <w:pStyle w:val="Default"/>
-        <w:tabs>
-          <w:tab w:val="left" w:pos="3870"/>
-        </w:tabs>
-        <w:ind w:left="-180" w:right="-450"/>
-        <w:rPr>
-          <w:rFonts w:asciiTheme="minorHAnsi" w:hAnsiTheme="minorHAnsi" w:cstheme="minorHAnsi"/>
-          <w:sz w:val="20"/>
-          <w:szCs w:val="20"/>
-          <w:lang w:val="bg-BG"/>
-        </w:rPr>
-      </w:pPr>
-      <w:r>
-        <w:rPr>
-          <w:rFonts w:asciiTheme="minorHAnsi" w:hAnsiTheme="minorHAnsi" w:cstheme="minorHAnsi"/>
-          <w:sz w:val="20"/>
-          <w:szCs w:val="20"/>
-          <w:lang w:val="bg-BG"/>
-        </w:rPr>
-        <w:t>6. С подписването на договора, ВЪЗЛОЖИТЕЛЯТ се съгласява да не възлага на трети страни и да не подписва</w:t>
-      </w:r>
-    </w:p>
-    <w:p>
-      <w:pPr>
-        <w:pStyle w:val="Default"/>
-        <w:tabs>
-          <w:tab w:val="left" w:pos="3870"/>
-        </w:tabs>
-        <w:ind w:left="-180" w:right="-450"/>
-        <w:rPr>
-          <w:rFonts w:asciiTheme="minorHAnsi" w:hAnsiTheme="minorHAnsi" w:cstheme="minorHAnsi"/>
-          <w:sz w:val="20"/>
-          <w:szCs w:val="20"/>
-          <w:lang w:val="bg-BG"/>
-        </w:rPr>
-      </w:pPr>
-      <w:r>
-        <w:rPr>
-          <w:rFonts w:asciiTheme="minorHAnsi" w:hAnsiTheme="minorHAnsi" w:cstheme="minorHAnsi"/>
-          <w:sz w:val="20"/>
-          <w:szCs w:val="20"/>
-          <w:lang w:val="bg-BG"/>
-        </w:rPr>
-        <w:t xml:space="preserve"> договори, чиито предмет е същият или подобен на предмета на настоящия договор. Ако такива договорености са</w:t>
-      </w:r>
-    </w:p>
-    <w:p>
-      <w:pPr>
-        <w:pStyle w:val="Default"/>
-        <w:tabs>
-          <w:tab w:val="left" w:pos="3870"/>
-        </w:tabs>
-        <w:ind w:left="-180" w:right="-450"/>
-        <w:rPr>
-          <w:rFonts w:asciiTheme="minorHAnsi" w:hAnsiTheme="minorHAnsi" w:cstheme="minorHAnsi"/>
-          <w:sz w:val="20"/>
-          <w:szCs w:val="20"/>
-          <w:lang w:val="bg-BG"/>
-        </w:rPr>
-      </w:pPr>
-      <w:r>
-        <w:rPr>
-          <w:rFonts w:asciiTheme="minorHAnsi" w:hAnsiTheme="minorHAnsi" w:cstheme="minorHAnsi"/>
-          <w:sz w:val="20"/>
-          <w:szCs w:val="20"/>
-          <w:lang w:val="bg-BG"/>
-        </w:rPr>
-        <w:t xml:space="preserve"> направени, </w:t>
+        <w:t xml:space="preserve">Съгласието се дава за срок от 3 години от датата на подписване на настоящия договор. </w:t>
+      </w:r>
+    </w:p>
+    <w:p>
+      <w:pPr>
+        <w:pStyle w:val="Default"/>
+        <w:tabs>
+          <w:tab w:val="left" w:pos="3870"/>
+        </w:tabs>
+        <w:ind w:left="-180" w:right="-450"/>
+        <w:rPr>
+          <w:rFonts w:asciiTheme="minorHAnsi" w:hAnsiTheme="minorHAnsi" w:cstheme="minorHAnsi"/>
+          <w:sz w:val="20"/>
+          <w:szCs w:val="20"/>
+          <w:lang w:val="bg-BG"/>
+        </w:rPr>
+      </w:pPr>
+      <w:r>
+        <w:rPr>
+          <w:rFonts w:asciiTheme="minorHAnsi" w:hAnsiTheme="minorHAnsi" w:cstheme="minorHAnsi"/>
+          <w:sz w:val="20"/>
+          <w:szCs w:val="20"/>
+          <w:lang w:val="bg-BG"/>
+        </w:rPr>
+        <w:t xml:space="preserve">6. С подписването на договора, ВЪЗЛОЖИТЕЛЯТ се съгласява да не възлага на трети страни и да не </w:t>
+      </w:r>
+    </w:p>
+    <w:p>
+      <w:pPr>
+        <w:pStyle w:val="Default"/>
+        <w:tabs>
+          <w:tab w:val="left" w:pos="3870"/>
+        </w:tabs>
+        <w:ind w:left="-180" w:right="-450"/>
+        <w:rPr>
+          <w:rFonts w:asciiTheme="minorHAnsi" w:hAnsiTheme="minorHAnsi" w:cstheme="minorHAnsi"/>
+          <w:sz w:val="20"/>
+          <w:szCs w:val="20"/>
+          <w:lang w:val="bg-BG"/>
+        </w:rPr>
+      </w:pPr>
+      <w:r>
+        <w:rPr>
+          <w:rFonts w:asciiTheme="minorHAnsi" w:hAnsiTheme="minorHAnsi" w:cstheme="minorHAnsi"/>
+          <w:sz w:val="20"/>
+          <w:szCs w:val="20"/>
+          <w:lang w:val="bg-BG"/>
+        </w:rPr>
+        <w:t>п</w:t>
+      </w:r>
+      <w:r>
+        <w:rPr>
+          <w:rFonts w:asciiTheme="minorHAnsi" w:hAnsiTheme="minorHAnsi" w:cstheme="minorHAnsi"/>
+          <w:sz w:val="20"/>
+          <w:szCs w:val="20"/>
+          <w:lang w:val="bg-BG"/>
+        </w:rPr>
+        <w:t>одписва</w:t>
+      </w:r>
+      <w:r>
+        <w:rPr>
+          <w:rFonts w:asciiTheme="minorHAnsi" w:hAnsiTheme="minorHAnsi" w:cstheme="minorHAnsi"/>
+          <w:sz w:val="20"/>
+          <w:szCs w:val="20"/>
+          <w:lang w:val="bg-BG"/>
+        </w:rPr>
+        <w:t xml:space="preserve"> </w:t>
+      </w:r>
+      <w:r>
+        <w:rPr>
+          <w:rFonts w:asciiTheme="minorHAnsi" w:hAnsiTheme="minorHAnsi" w:cstheme="minorHAnsi"/>
+          <w:sz w:val="20"/>
+          <w:szCs w:val="20"/>
+          <w:lang w:val="bg-BG"/>
+        </w:rPr>
+        <w:t>договори, чиито предмет е същият или подобен на предмета на настоящия договор. Ако такива</w:t>
+      </w:r>
+    </w:p>
+    <w:p>
+      <w:pPr>
+        <w:pStyle w:val="Default"/>
+        <w:tabs>
+          <w:tab w:val="left" w:pos="3870"/>
+        </w:tabs>
+        <w:ind w:left="-180" w:right="-450"/>
+        <w:rPr>
+          <w:rFonts w:asciiTheme="minorHAnsi" w:hAnsiTheme="minorHAnsi" w:cstheme="minorHAnsi"/>
+          <w:sz w:val="20"/>
+          <w:szCs w:val="20"/>
+          <w:lang w:val="bg-BG"/>
+        </w:rPr>
+      </w:pPr>
+      <w:r>
+        <w:rPr>
+          <w:rFonts w:asciiTheme="minorHAnsi" w:hAnsiTheme="minorHAnsi" w:cstheme="minorHAnsi"/>
+          <w:sz w:val="20"/>
+          <w:szCs w:val="20"/>
+          <w:lang w:val="bg-BG"/>
+        </w:rPr>
+        <w:t xml:space="preserve">договорености са направени, </w:t>
       </w:r>
     </w:p>
     <w:p>
@@ -2318,7 +3353,7 @@
           <w:szCs w:val="20"/>
           <w:lang w:val="bg-BG"/>
         </w:rPr>
-        <w:t>7. И двете страни приемат да пазят съдържанието на този договор строго поверително, което се отнася до всички</w:t>
+        <w:t>7. И двете страни приемат да пазят съдържанието на този договор строго поверително, което се отнася до</w:t>
       </w:r>
     </w:p>
     <w:p>
@@ -2343,151 +3378,178 @@
           <w:szCs w:val="20"/>
           <w:lang w:val="bg-BG"/>
         </w:rPr>
-        <w:t xml:space="preserve"> негови партньори, сътрудници или трети лица, с които двете страни по договора влизат в контакт. </w:t>
-      </w:r>
-    </w:p>
-    <w:p>
-      <w:pPr>
-        <w:pStyle w:val="Default"/>
-        <w:tabs>
-          <w:tab w:val="left" w:pos="3870"/>
-        </w:tabs>
-        <w:ind w:left="-180" w:right="-450"/>
-        <w:rPr>
-          <w:rFonts w:asciiTheme="minorHAnsi" w:hAnsiTheme="minorHAnsi" w:cstheme="minorHAnsi"/>
-          <w:sz w:val="20"/>
-          <w:szCs w:val="20"/>
-          <w:lang w:val="bg-BG"/>
-        </w:rPr>
-      </w:pPr>
-      <w:r>
-        <w:rPr>
-          <w:rFonts w:asciiTheme="minorHAnsi" w:hAnsiTheme="minorHAnsi" w:cstheme="minorHAnsi"/>
-          <w:sz w:val="20"/>
-          <w:szCs w:val="20"/>
-          <w:lang w:val="bg-BG"/>
-        </w:rPr>
-        <w:t>8. С настоящия договор ВЪЗЛОЖИТЕЛЯТ писмено упълномощява ИЗПЪЛНИТЕЛЯ да извърши всички действия</w:t>
-      </w:r>
-    </w:p>
-    <w:p>
-      <w:pPr>
-        <w:pStyle w:val="Default"/>
-        <w:tabs>
-          <w:tab w:val="left" w:pos="3870"/>
-        </w:tabs>
-        <w:ind w:left="-180" w:right="-450"/>
-        <w:rPr>
-          <w:rFonts w:asciiTheme="minorHAnsi" w:hAnsiTheme="minorHAnsi" w:cstheme="minorHAnsi"/>
-          <w:sz w:val="20"/>
-          <w:szCs w:val="20"/>
-          <w:lang w:val="bg-BG"/>
-        </w:rPr>
-      </w:pPr>
-      <w:r>
-        <w:rPr>
-          <w:rFonts w:asciiTheme="minorHAnsi" w:hAnsiTheme="minorHAnsi" w:cstheme="minorHAnsi"/>
-          <w:sz w:val="20"/>
-          <w:szCs w:val="20"/>
-          <w:lang w:val="bg-BG"/>
-        </w:rPr>
-        <w:t xml:space="preserve"> свързани с предмета и изпълнението да възложената услуга. действията на клиента ще се третират като сериозно</w:t>
-      </w:r>
-    </w:p>
-    <w:p>
-      <w:pPr>
-        <w:pStyle w:val="Default"/>
-        <w:tabs>
-          <w:tab w:val="left" w:pos="3870"/>
-        </w:tabs>
-        <w:ind w:left="-180" w:right="-450"/>
-        <w:rPr>
-          <w:rFonts w:asciiTheme="minorHAnsi" w:hAnsiTheme="minorHAnsi" w:cstheme="minorHAnsi"/>
-          <w:sz w:val="20"/>
-          <w:szCs w:val="20"/>
-          <w:lang w:val="bg-BG"/>
-        </w:rPr>
-      </w:pPr>
-      <w:r>
-        <w:rPr>
-          <w:rFonts w:asciiTheme="minorHAnsi" w:hAnsiTheme="minorHAnsi" w:cstheme="minorHAnsi"/>
-          <w:sz w:val="20"/>
-          <w:szCs w:val="20"/>
-          <w:lang w:val="bg-BG"/>
-        </w:rPr>
-        <w:t xml:space="preserve"> нарушение на настоящият договор и ИЗПЪЛНИТЕЛЯТ има правото да се откаже като получи еквивалента на 50% от</w:t>
-      </w:r>
-    </w:p>
-    <w:p>
-      <w:pPr>
-        <w:pStyle w:val="Default"/>
-        <w:tabs>
-          <w:tab w:val="left" w:pos="3870"/>
-        </w:tabs>
-        <w:ind w:left="-180" w:right="-450"/>
-        <w:rPr>
-          <w:rFonts w:asciiTheme="minorHAnsi" w:hAnsiTheme="minorHAnsi" w:cstheme="minorHAnsi"/>
-          <w:sz w:val="20"/>
-          <w:szCs w:val="20"/>
-          <w:lang w:val="bg-BG"/>
-        </w:rPr>
-      </w:pPr>
-      <w:r>
-        <w:rPr>
-          <w:rFonts w:asciiTheme="minorHAnsi" w:hAnsiTheme="minorHAnsi" w:cstheme="minorHAnsi"/>
-          <w:sz w:val="20"/>
-          <w:szCs w:val="20"/>
-          <w:lang w:val="bg-BG"/>
-        </w:rPr>
-        <w:t xml:space="preserve"> Федералния Данък, платен от ВЪЗЛОЖИТЕЛЯ, както е упомената по W2 формата. Плащането на тази неустойка не е</w:t>
-      </w:r>
-    </w:p>
-    <w:p>
-      <w:pPr>
-        <w:pStyle w:val="Default"/>
-        <w:tabs>
-          <w:tab w:val="left" w:pos="3870"/>
-        </w:tabs>
-        <w:ind w:left="-180" w:right="-450"/>
-        <w:rPr>
-          <w:rFonts w:asciiTheme="minorHAnsi" w:hAnsiTheme="minorHAnsi" w:cstheme="minorHAnsi"/>
-          <w:sz w:val="20"/>
-          <w:szCs w:val="20"/>
-          <w:lang w:val="bg-BG"/>
-        </w:rPr>
-      </w:pPr>
-      <w:r>
-        <w:rPr>
-          <w:rFonts w:asciiTheme="minorHAnsi" w:hAnsiTheme="minorHAnsi" w:cstheme="minorHAnsi"/>
-          <w:sz w:val="20"/>
-          <w:szCs w:val="20"/>
-          <w:lang w:val="bg-BG"/>
-        </w:rPr>
-        <w:t xml:space="preserve"> за сметка на плащането на съответното възнаграждение и възстановяване на разходите както са описани в точка</w:t>
-      </w:r>
-    </w:p>
-    <w:p>
-      <w:pPr>
-        <w:pStyle w:val="Default"/>
-        <w:tabs>
-          <w:tab w:val="left" w:pos="3870"/>
-        </w:tabs>
-        <w:ind w:left="-180" w:right="-450"/>
-        <w:rPr>
-          <w:rFonts w:asciiTheme="minorHAnsi" w:hAnsiTheme="minorHAnsi" w:cstheme="minorHAnsi"/>
-          <w:sz w:val="20"/>
-          <w:szCs w:val="20"/>
-          <w:lang w:val="bg-BG"/>
-        </w:rPr>
-      </w:pPr>
-      <w:r>
-        <w:rPr>
-          <w:rFonts w:asciiTheme="minorHAnsi" w:hAnsiTheme="minorHAnsi" w:cstheme="minorHAnsi"/>
-          <w:sz w:val="20"/>
-          <w:szCs w:val="20"/>
-          <w:lang w:val="bg-BG"/>
-        </w:rPr>
-        <w:t xml:space="preserve"> (4) и точка(5) от настоящия договор. </w:t>
+        <w:t xml:space="preserve">всички негови партньори, сътрудници или трети лица, с които двете страни по договора влизат в контакт. </w:t>
+      </w:r>
+    </w:p>
+    <w:p>
+      <w:pPr>
+        <w:pStyle w:val="Default"/>
+        <w:tabs>
+          <w:tab w:val="left" w:pos="3870"/>
+        </w:tabs>
+        <w:ind w:left="-180" w:right="-450"/>
+        <w:rPr>
+          <w:rFonts w:asciiTheme="minorHAnsi" w:hAnsiTheme="minorHAnsi" w:cstheme="minorHAnsi"/>
+          <w:sz w:val="20"/>
+          <w:szCs w:val="20"/>
+          <w:lang w:val="bg-BG"/>
+        </w:rPr>
+      </w:pPr>
+      <w:r>
+        <w:rPr>
+          <w:rFonts w:asciiTheme="minorHAnsi" w:hAnsiTheme="minorHAnsi" w:cstheme="minorHAnsi"/>
+          <w:sz w:val="20"/>
+          <w:szCs w:val="20"/>
+          <w:lang w:val="bg-BG"/>
+        </w:rPr>
+        <w:t xml:space="preserve">8. С настоящия договор ВЪЗЛОЖИТЕЛЯТ писмено упълномощява ИЗПЪЛНИТЕЛЯ да извърши всички </w:t>
+      </w:r>
+    </w:p>
+    <w:p>
+      <w:pPr>
+        <w:pStyle w:val="Default"/>
+        <w:tabs>
+          <w:tab w:val="left" w:pos="3870"/>
+        </w:tabs>
+        <w:ind w:left="-180" w:right="-450"/>
+        <w:rPr>
+          <w:rFonts w:asciiTheme="minorHAnsi" w:hAnsiTheme="minorHAnsi" w:cstheme="minorHAnsi"/>
+          <w:sz w:val="20"/>
+          <w:szCs w:val="20"/>
+          <w:lang w:val="bg-BG"/>
+        </w:rPr>
+      </w:pPr>
+      <w:r>
+        <w:rPr>
+          <w:rFonts w:asciiTheme="minorHAnsi" w:hAnsiTheme="minorHAnsi" w:cstheme="minorHAnsi"/>
+          <w:sz w:val="20"/>
+          <w:szCs w:val="20"/>
+          <w:lang w:val="bg-BG"/>
+        </w:rPr>
+        <w:t>д</w:t>
+      </w:r>
+      <w:r>
+        <w:rPr>
+          <w:rFonts w:asciiTheme="minorHAnsi" w:hAnsiTheme="minorHAnsi" w:cstheme="minorHAnsi"/>
+          <w:sz w:val="20"/>
+          <w:szCs w:val="20"/>
+          <w:lang w:val="bg-BG"/>
+        </w:rPr>
+        <w:t>ействия</w:t>
+      </w:r>
+      <w:r>
+        <w:rPr>
+          <w:rFonts w:asciiTheme="minorHAnsi" w:hAnsiTheme="minorHAnsi" w:cstheme="minorHAnsi"/>
+          <w:sz w:val="20"/>
+          <w:szCs w:val="20"/>
+          <w:lang w:val="bg-BG"/>
+        </w:rPr>
+        <w:t xml:space="preserve"> </w:t>
+      </w:r>
+      <w:r>
+        <w:rPr>
+          <w:rFonts w:asciiTheme="minorHAnsi" w:hAnsiTheme="minorHAnsi" w:cstheme="minorHAnsi"/>
+          <w:sz w:val="20"/>
+          <w:szCs w:val="20"/>
+          <w:lang w:val="bg-BG"/>
+        </w:rPr>
+        <w:t>свързани с предмета и изпълнението да възложената услуга. действията на клиента ще се третират</w:t>
+      </w:r>
+    </w:p>
+    <w:p>
+      <w:pPr>
+        <w:pStyle w:val="Default"/>
+        <w:tabs>
+          <w:tab w:val="left" w:pos="3870"/>
+        </w:tabs>
+        <w:ind w:left="-180" w:right="-450"/>
+        <w:rPr>
+          <w:rFonts w:asciiTheme="minorHAnsi" w:hAnsiTheme="minorHAnsi" w:cstheme="minorHAnsi"/>
+          <w:sz w:val="20"/>
+          <w:szCs w:val="20"/>
+          <w:lang w:val="bg-BG"/>
+        </w:rPr>
+      </w:pPr>
+      <w:r>
+        <w:rPr>
+          <w:rFonts w:asciiTheme="minorHAnsi" w:hAnsiTheme="minorHAnsi" w:cstheme="minorHAnsi"/>
+          <w:sz w:val="20"/>
+          <w:szCs w:val="20"/>
+          <w:lang w:val="bg-BG"/>
+        </w:rPr>
+        <w:t>като сериозно нарушение на настоящият договор и ИЗПЪЛНИТЕЛЯТ има правото да се откаже като получи</w:t>
+      </w:r>
+    </w:p>
+    <w:p>
+      <w:pPr>
+        <w:pStyle w:val="Default"/>
+        <w:tabs>
+          <w:tab w:val="left" w:pos="3870"/>
+        </w:tabs>
+        <w:ind w:left="-180" w:right="-450"/>
+        <w:rPr>
+          <w:rFonts w:asciiTheme="minorHAnsi" w:hAnsiTheme="minorHAnsi" w:cstheme="minorHAnsi"/>
+          <w:sz w:val="20"/>
+          <w:szCs w:val="20"/>
+          <w:lang w:val="bg-BG"/>
+        </w:rPr>
+      </w:pPr>
+      <w:r>
+        <w:rPr>
+          <w:rFonts w:asciiTheme="minorHAnsi" w:hAnsiTheme="minorHAnsi" w:cstheme="minorHAnsi"/>
+          <w:sz w:val="20"/>
+          <w:szCs w:val="20"/>
+          <w:lang w:val="bg-BG"/>
+        </w:rPr>
+        <w:t>еквивалента на 50% от Федералния Данък, платен от ВЪЗЛОЖИТЕЛЯ, както е упомената по W2 формата.</w:t>
+      </w:r>
+    </w:p>
+    <w:p>
+      <w:pPr>
+        <w:pStyle w:val="Default"/>
+        <w:tabs>
+          <w:tab w:val="left" w:pos="3870"/>
+        </w:tabs>
+        <w:ind w:left="-180" w:right="-450"/>
+        <w:rPr>
+          <w:rFonts w:asciiTheme="minorHAnsi" w:hAnsiTheme="minorHAnsi" w:cstheme="minorHAnsi"/>
+          <w:sz w:val="20"/>
+          <w:szCs w:val="20"/>
+          <w:lang w:val="bg-BG"/>
+        </w:rPr>
+      </w:pPr>
+      <w:r>
+        <w:rPr>
+          <w:rFonts w:asciiTheme="minorHAnsi" w:hAnsiTheme="minorHAnsi" w:cstheme="minorHAnsi"/>
+          <w:sz w:val="20"/>
+          <w:szCs w:val="20"/>
+          <w:lang w:val="bg-BG"/>
+        </w:rPr>
+        <w:t>Плащането на тази неустойка не е за сметка на плащането на съответното възнаграждение и възстановяване</w:t>
+      </w:r>
+    </w:p>
+    <w:p>
+      <w:pPr>
+        <w:pStyle w:val="Default"/>
+        <w:tabs>
+          <w:tab w:val="left" w:pos="3870"/>
+        </w:tabs>
+        <w:ind w:left="-180" w:right="-450"/>
+        <w:rPr>
+          <w:rFonts w:asciiTheme="minorHAnsi" w:hAnsiTheme="minorHAnsi" w:cstheme="minorHAnsi"/>
+          <w:sz w:val="20"/>
+          <w:szCs w:val="20"/>
+          <w:lang w:val="bg-BG"/>
+        </w:rPr>
+      </w:pPr>
+      <w:r>
+        <w:rPr>
+          <w:rFonts w:asciiTheme="minorHAnsi" w:hAnsiTheme="minorHAnsi" w:cstheme="minorHAnsi"/>
+          <w:sz w:val="20"/>
+          <w:szCs w:val="20"/>
+          <w:lang w:val="bg-BG"/>
+        </w:rPr>
+        <w:t xml:space="preserve">на разходите както са описани в точка (4) и точка(5) от настоящия договор. </w:t>
       </w:r>
     </w:p>
     <w:p>
@@ -2578,7 +3640,7 @@
           <w:szCs w:val="20"/>
           <w:lang w:val="bg-BG"/>
         </w:rPr>
-        <w:t>ВЪЗЛОЖИТЕЛЯТ се съгласява да плати на ИЗПЪЛНИТЕЛЯ възнаграждение за всички дейности свързани с този</w:t>
+        <w:t xml:space="preserve">ВЪЗЛОЖИТЕЛЯТ се съгласява да плати на ИЗПЪЛНИТЕЛЯ възнаграждение за всички дейности </w:t>
       </w:r>
     </w:p>
     <w:p>
@@ -2603,7 +3665,25 @@
           <w:szCs w:val="20"/>
           <w:lang w:val="bg-BG"/>
         </w:rPr>
-        <w:t xml:space="preserve"> договор. Сумата на това възнаграждение се определя и базира на предварително одобрена очаквана сума за</w:t>
+        <w:t>свързани с</w:t>
+      </w:r>
+      <w:r>
+        <w:rPr>
+          <w:rFonts w:asciiTheme="minorHAnsi" w:hAnsiTheme="minorHAnsi" w:cstheme="minorHAnsi"/>
+          <w:sz w:val="20"/>
+          <w:szCs w:val="20"/>
+          <w:lang w:val="bg-BG"/>
+        </w:rPr>
+        <w:t xml:space="preserve"> </w:t>
+      </w:r>
+      <w:r>
+        <w:rPr>
+          <w:rFonts w:asciiTheme="minorHAnsi" w:hAnsiTheme="minorHAnsi" w:cstheme="minorHAnsi"/>
+          <w:sz w:val="20"/>
+          <w:szCs w:val="20"/>
+          <w:lang w:val="bg-BG"/>
+        </w:rPr>
+        <w:t xml:space="preserve">този договор. Сумата на това възнаграждение се определя и базира на предварително </w:t>
       </w:r>
     </w:p>
     <w:p>
@@ -2628,7 +3708,25 @@
           <w:szCs w:val="20"/>
           <w:lang w:val="bg-BG"/>
         </w:rPr>
-        <w:t xml:space="preserve"> възстановяване. Под очаквана сума за възстановяване в този договор се разбира максимално възстановимата</w:t>
+        <w:t>одобрена очаквана</w:t>
+      </w:r>
+      <w:r>
+        <w:rPr>
+          <w:rFonts w:asciiTheme="minorHAnsi" w:hAnsiTheme="minorHAnsi" w:cstheme="minorHAnsi"/>
+          <w:sz w:val="20"/>
+          <w:szCs w:val="20"/>
+          <w:lang w:val="bg-BG"/>
+        </w:rPr>
+        <w:t xml:space="preserve"> </w:t>
+      </w:r>
+      <w:r>
+        <w:rPr>
+          <w:rFonts w:asciiTheme="minorHAnsi" w:hAnsiTheme="minorHAnsi" w:cstheme="minorHAnsi"/>
+          <w:sz w:val="20"/>
+          <w:szCs w:val="20"/>
+          <w:lang w:val="bg-BG"/>
+        </w:rPr>
+        <w:t xml:space="preserve">сума за възстановяване. Под очаквана сума за възстановяване в този договор се </w:t>
       </w:r>
     </w:p>
     <w:p>
@@ -2653,7 +3751,25 @@
           <w:szCs w:val="20"/>
           <w:lang w:val="bg-BG"/>
         </w:rPr>
-        <w:t xml:space="preserve"> сума според подадените от ВЪЗЛОЖИТЕЛЯ документи и направените от ИЗПЪНИТЕЛЯ въз основа на тях</w:t>
+        <w:t>разбира максимално</w:t>
+      </w:r>
+      <w:r>
+        <w:rPr>
+          <w:rFonts w:asciiTheme="minorHAnsi" w:hAnsiTheme="minorHAnsi" w:cstheme="minorHAnsi"/>
+          <w:sz w:val="20"/>
+          <w:szCs w:val="20"/>
+          <w:lang w:val="bg-BG"/>
+        </w:rPr>
+        <w:t xml:space="preserve"> </w:t>
+      </w:r>
+      <w:r>
+        <w:rPr>
+          <w:rFonts w:asciiTheme="minorHAnsi" w:hAnsiTheme="minorHAnsi" w:cstheme="minorHAnsi"/>
+          <w:sz w:val="20"/>
+          <w:szCs w:val="20"/>
+          <w:lang w:val="bg-BG"/>
+        </w:rPr>
+        <w:t xml:space="preserve">възстановимата сума според подадените от ВЪЗЛОЖИТЕЛЯ документи и </w:t>
       </w:r>
     </w:p>
     <w:p>
@@ -2678,7 +3794,43 @@
           <w:szCs w:val="20"/>
           <w:lang w:val="bg-BG"/>
         </w:rPr>
-        <w:t xml:space="preserve"> изчисления и преценки. Максимално възстановимата сума може да бъде изменена в процеса на възстановяване</w:t>
+        <w:t>направените</w:t>
+      </w:r>
+      <w:r>
+        <w:rPr>
+          <w:rFonts w:asciiTheme="minorHAnsi" w:hAnsiTheme="minorHAnsi" w:cstheme="minorHAnsi"/>
+          <w:sz w:val="20"/>
+          <w:szCs w:val="20"/>
+          <w:lang w:val="bg-BG"/>
+        </w:rPr>
+        <w:t xml:space="preserve"> </w:t>
+      </w:r>
+      <w:r>
+        <w:rPr>
+          <w:rFonts w:asciiTheme="minorHAnsi" w:hAnsiTheme="minorHAnsi" w:cstheme="minorHAnsi"/>
+          <w:sz w:val="20"/>
+          <w:szCs w:val="20"/>
+          <w:lang w:val="bg-BG"/>
+        </w:rPr>
+        <w:t>от ИЗПЪНИТЕЛЯ въз</w:t>
+      </w:r>
+      <w:r>
+        <w:rPr>
+          <w:rFonts w:asciiTheme="minorHAnsi" w:hAnsiTheme="minorHAnsi" w:cstheme="minorHAnsi"/>
+          <w:sz w:val="20"/>
+          <w:szCs w:val="20"/>
+          <w:lang w:val="bg-BG"/>
+        </w:rPr>
+        <w:t xml:space="preserve"> </w:t>
+      </w:r>
+      <w:r>
+        <w:rPr>
+          <w:rFonts w:asciiTheme="minorHAnsi" w:hAnsiTheme="minorHAnsi" w:cstheme="minorHAnsi"/>
+          <w:sz w:val="20"/>
+          <w:szCs w:val="20"/>
+          <w:lang w:val="bg-BG"/>
+        </w:rPr>
+        <w:t xml:space="preserve">основа на тях изчисления и преценки. Максимално възстановимата </w:t>
       </w:r>
     </w:p>
     <w:p>
@@ -2703,7 +3855,25 @@
           <w:szCs w:val="20"/>
           <w:lang w:val="bg-BG"/>
         </w:rPr>
-        <w:t xml:space="preserve"> от Данъчните Служби, за което ИЗПЪЛНИТЕЛЯТ не носи отговорност. ИЗПЪЛНИТЕЛЯТ има правото на</w:t>
+        <w:t>сума може да бъде</w:t>
+      </w:r>
+      <w:r>
+        <w:rPr>
+          <w:rFonts w:asciiTheme="minorHAnsi" w:hAnsiTheme="minorHAnsi" w:cstheme="minorHAnsi"/>
+          <w:sz w:val="20"/>
+          <w:szCs w:val="20"/>
+          <w:lang w:val="bg-BG"/>
+        </w:rPr>
+        <w:t xml:space="preserve"> </w:t>
+      </w:r>
+      <w:r>
+        <w:rPr>
+          <w:rFonts w:asciiTheme="minorHAnsi" w:hAnsiTheme="minorHAnsi" w:cstheme="minorHAnsi"/>
+          <w:sz w:val="20"/>
+          <w:szCs w:val="20"/>
+          <w:lang w:val="bg-BG"/>
+        </w:rPr>
+        <w:t xml:space="preserve">изменена в процеса на възстановяване от Данъчните Служби, за което </w:t>
       </w:r>
     </w:p>
     <w:p>
@@ -2728,7 +3898,43 @@
           <w:szCs w:val="20"/>
           <w:lang w:val="bg-BG"/>
         </w:rPr>
-        <w:t xml:space="preserve"> възнаграждение от момента, в който възстановените суми постъпят в банковата сметка. Възнаграждението е</w:t>
+        <w:t>ИЗПЪЛНИТЕЛЯТ не носи отговорност.</w:t>
+      </w:r>
+      <w:r>
+        <w:rPr>
+          <w:rFonts w:asciiTheme="minorHAnsi" w:hAnsiTheme="minorHAnsi" w:cstheme="minorHAnsi"/>
+          <w:sz w:val="20"/>
+          <w:szCs w:val="20"/>
+          <w:lang w:val="bg-BG"/>
+        </w:rPr>
+        <w:t xml:space="preserve"> </w:t>
+      </w:r>
+      <w:r>
+        <w:rPr>
+          <w:rFonts w:asciiTheme="minorHAnsi" w:hAnsiTheme="minorHAnsi" w:cstheme="minorHAnsi"/>
+          <w:sz w:val="20"/>
+          <w:szCs w:val="20"/>
+          <w:lang w:val="bg-BG"/>
+        </w:rPr>
+        <w:t>ИЗПЪЛНИТЕЛЯТ има</w:t>
+      </w:r>
+      <w:r>
+        <w:rPr>
+          <w:rFonts w:asciiTheme="minorHAnsi" w:hAnsiTheme="minorHAnsi" w:cstheme="minorHAnsi"/>
+          <w:sz w:val="20"/>
+          <w:szCs w:val="20"/>
+          <w:lang w:val="bg-BG"/>
+        </w:rPr>
+        <w:t xml:space="preserve"> </w:t>
+      </w:r>
+      <w:r>
+        <w:rPr>
+          <w:rFonts w:asciiTheme="minorHAnsi" w:hAnsiTheme="minorHAnsi" w:cstheme="minorHAnsi"/>
+          <w:sz w:val="20"/>
+          <w:szCs w:val="20"/>
+          <w:lang w:val="bg-BG"/>
+        </w:rPr>
+        <w:t xml:space="preserve">правото на възнаграждение от момента, </w:t>
       </w:r>
     </w:p>
     <w:p>
@@ -2753,7 +3959,25 @@
           <w:szCs w:val="20"/>
           <w:lang w:val="bg-BG"/>
         </w:rPr>
-        <w:t xml:space="preserve"> дължимо само след предоставяне от страна на ИЗПЪЛНИТЕЛЯ копие от чека на съответните данъчни служби. </w:t>
+        <w:t>в който възстановените суми постъпят в банковата сметка.</w:t>
+      </w:r>
+      <w:r>
+        <w:rPr>
+          <w:rFonts w:asciiTheme="minorHAnsi" w:hAnsiTheme="minorHAnsi" w:cstheme="minorHAnsi"/>
+          <w:sz w:val="20"/>
+          <w:szCs w:val="20"/>
+          <w:lang w:val="bg-BG"/>
+        </w:rPr>
+        <w:t xml:space="preserve"> </w:t>
+      </w:r>
+      <w:r>
+        <w:rPr>
+          <w:rFonts w:asciiTheme="minorHAnsi" w:hAnsiTheme="minorHAnsi" w:cstheme="minorHAnsi"/>
+          <w:sz w:val="20"/>
+          <w:szCs w:val="20"/>
+          <w:lang w:val="bg-BG"/>
+        </w:rPr>
+        <w:t>Възнаграждението е дължимо само след</w:t>
       </w:r>
     </w:p>
     <w:p>
@@ -2778,7 +4002,7 @@
           <w:szCs w:val="20"/>
           <w:lang w:val="bg-BG"/>
         </w:rPr>
-        <w:t>b) Ако ВЪЗЛОЖИТЕЛЯТ кандидатства за възстановяване на данъци от 2023 година, комисионната на ИЗПЪЛНИТЕЛЯ</w:t>
+        <w:t xml:space="preserve">предоставяне от страна на ИЗПЪЛНИТЕЛЯ копие от чека на съответните данъчни служби. </w:t>
       </w:r>
     </w:p>
     <w:p>
@@ -2803,7 +4027,7 @@
           <w:szCs w:val="20"/>
           <w:lang w:val="bg-BG"/>
         </w:rPr>
-        <w:t xml:space="preserve"> е в размер на 10% от очакваната сума, но не по-малко от 60(шейсет) щатски долара. </w:t>
+        <w:t>b) Ако ВЪЗЛОЖИТЕЛЯТ кандидатства за възстановяване на данъци от 2023 година, комисионната на</w:t>
       </w:r>
     </w:p>
     <w:p>
@@ -2828,7 +4052,7 @@
           <w:szCs w:val="20"/>
           <w:lang w:val="bg-BG"/>
         </w:rPr>
-        <w:t>c) Ако ВЪЗЛОЖИТЕЛЯТ кандидатства за възстановяване на данъци от година, различна от 2023, то дължимата</w:t>
+        <w:t xml:space="preserve">ИЗПЪЛНИТЕЛЯ е в размер на 10% от очакваната сума, но не по-малко от 60(шейсет) щатски долара. </w:t>
       </w:r>
     </w:p>
     <w:p>
@@ -2853,7 +4077,41 @@
           <w:szCs w:val="20"/>
           <w:lang w:val="bg-BG"/>
         </w:rPr>
-        <w:t xml:space="preserve"> комисионна е 12 % , но не по-малко от 100(сто) щатски долара. </w:t>
+        <w:t>c) Ако ВЪЗЛОЖИТЕЛЯТ кандидатства за възстановяване на данъци от година, различна от 2023, то дължи</w:t>
+      </w:r>
+      <w:r>
+        <w:rPr>
+          <w:rFonts w:asciiTheme="minorHAnsi" w:hAnsiTheme="minorHAnsi" w:cstheme="minorHAnsi"/>
+          <w:sz w:val="20"/>
+          <w:szCs w:val="20"/>
+          <w:lang w:val="bg-BG"/>
+        </w:rPr>
+        <w:t>-</w:t>
+      </w:r>
+    </w:p>
+    <w:p>
+      <w:pPr>
+        <w:pStyle w:val="Default"/>
+        <w:tabs>
+          <w:tab w:val="left" w:pos="3870"/>
+        </w:tabs>
+        <w:spacing w:after="15"/>
+        <w:ind w:left="-180" w:right="-450"/>
+        <w:rPr>
+          <w:rFonts w:asciiTheme="minorHAnsi" w:hAnsiTheme="minorHAnsi" w:cstheme="minorHAnsi"/>
+          <w:sz w:val="20"/>
+          <w:szCs w:val="20"/>
+          <w:lang w:val="bg-BG"/>
+        </w:rPr>
+      </w:pPr>
+      <w:r>
+        <w:rPr>
+          <w:rFonts w:asciiTheme="minorHAnsi" w:hAnsiTheme="minorHAnsi" w:cstheme="minorHAnsi"/>
+          <w:sz w:val="20"/>
+          <w:szCs w:val="20"/>
+          <w:lang w:val="bg-BG"/>
+        </w:rPr>
+        <w:t xml:space="preserve">мата комисионна е 12 % , но не по-малко от 100(сто) щатски долара. </w:t>
       </w:r>
     </w:p>
     <w:p>
@@ -2878,7 +4136,7 @@
           <w:szCs w:val="20"/>
           <w:lang w:val="bg-BG"/>
         </w:rPr>
-        <w:t>d) Процедурата по възстановяването на данъците „FICA” и ”Medicare” отнема около 12 месеца от момента на</w:t>
+        <w:t>d) Процедурата по възстановяването на данъците „FICA” и ”Medicare” отнема около 12 месеца от момента</w:t>
       </w:r>
     </w:p>
     <w:p>
@@ -2903,7 +4161,7 @@
           <w:szCs w:val="20"/>
           <w:lang w:val="bg-BG"/>
         </w:rPr>
-        <w:t xml:space="preserve"> възстановяването на Федералния данък, като за нея се дължи допълнително възнаграждение от 1000 щатски</w:t>
+        <w:t xml:space="preserve">на възстановяването на Федералния данък, като за нея се дължи допълнително възнаграждение от </w:t>
       </w:r>
     </w:p>
     <w:p>
@@ -2928,7 +4186,7 @@
           <w:szCs w:val="20"/>
           <w:lang w:val="bg-BG"/>
         </w:rPr>
-        <w:t xml:space="preserve"> долара. 1. Сумата на комисионната ще бъде автоматично удържана от общата възстановимата сума постъпила в</w:t>
+        <w:t xml:space="preserve">1000 щатски долара. </w:t>
       </w:r>
     </w:p>
     <w:p>
@@ -2953,7 +4211,7 @@
           <w:szCs w:val="20"/>
           <w:lang w:val="bg-BG"/>
         </w:rPr>
-        <w:t xml:space="preserve"> банковата сметка на ВЪЗЛОЖИТЕЛЯ или платена по какъвто и да е друг пожелан от него начин. </w:t>
+        <w:t>1. Сумата на комисионната ще бъде автоматично удържана от общата възстановимата сума постъпила в</w:t>
       </w:r>
     </w:p>
     <w:p>
@@ -2978,7 +4236,7 @@
           <w:szCs w:val="20"/>
           <w:lang w:val="bg-BG"/>
         </w:rPr>
-        <w:t>2. Ако по непровокирана от ИЗПЪЛНИТЕЛЯ причина част от възстановените данъци пристигнат под каквато и да е</w:t>
+        <w:t xml:space="preserve">банковата сметка на ВЪЗЛОЖИТЕЛЯ или платена по какъвто и да е друг пожелан от него начин. </w:t>
       </w:r>
     </w:p>
     <w:p>
@@ -3003,7 +4261,7 @@
           <w:szCs w:val="20"/>
           <w:lang w:val="bg-BG"/>
         </w:rPr>
-        <w:t xml:space="preserve"> форма (поименен чек издаден от Данъчните Служби или по негова сметка) първо при ВЪЗЛОЖИТЕЛЯ, вместо при</w:t>
+        <w:t xml:space="preserve">2. Ако по непровокирана от ИЗПЪЛНИТЕЛЯ причина част от възстановените данъци пристигнат под каквато </w:t>
       </w:r>
     </w:p>
     <w:p>
@@ -3028,7 +4286,8 @@
           <w:szCs w:val="20"/>
           <w:lang w:val="bg-BG"/>
         </w:rPr>
-        <w:t xml:space="preserve"> ИЗПЪЛНИТЕЛЯ и ако друга част от данъците е постъпила към ИЗПЪЛНИТЕЛЯ, то той има правото да си удържи</w:t>
+        <w:lastRenderedPageBreak/>
+        <w:t xml:space="preserve">и да е форма (поименен чек издаден от Данъчните Служби или по негова сметка) първо при </w:t>
       </w:r>
     </w:p>
     <w:p>
@@ -3053,7 +4312,25 @@
           <w:szCs w:val="20"/>
           <w:lang w:val="bg-BG"/>
         </w:rPr>
-        <w:t xml:space="preserve"> дължимото по този договор. Във всички останали случаи, възнаграждението по този договор се дължи на</w:t>
+        <w:t>ВЪЗЛОЖИТЕЛЯ,</w:t>
+      </w:r>
+      <w:r>
+        <w:rPr>
+          <w:rFonts w:asciiTheme="minorHAnsi" w:hAnsiTheme="minorHAnsi" w:cstheme="minorHAnsi"/>
+          <w:sz w:val="20"/>
+          <w:szCs w:val="20"/>
+          <w:lang w:val="bg-BG"/>
+        </w:rPr>
+        <w:t xml:space="preserve"> </w:t>
+      </w:r>
+      <w:r>
+        <w:rPr>
+          <w:rFonts w:asciiTheme="minorHAnsi" w:hAnsiTheme="minorHAnsi" w:cstheme="minorHAnsi"/>
+          <w:sz w:val="20"/>
+          <w:szCs w:val="20"/>
+          <w:lang w:val="bg-BG"/>
+        </w:rPr>
+        <w:t>вместо при ИЗПЪЛНИТЕЛЯ и ако друга част от данъците е постъпила към ИЗПЪЛНИТЕЛЯ,</w:t>
       </w:r>
     </w:p>
     <w:p>
@@ -3078,7 +4355,25 @@
           <w:szCs w:val="20"/>
           <w:lang w:val="bg-BG"/>
         </w:rPr>
-        <w:t xml:space="preserve"> ИЗПЪЛНИТЕЛЯ - ако при него има част от възстановените данъци, то тя ще бъде изплатена или изпратена</w:t>
+        <w:t>то той има правото</w:t>
+      </w:r>
+      <w:r>
+        <w:rPr>
+          <w:rFonts w:asciiTheme="minorHAnsi" w:hAnsiTheme="minorHAnsi" w:cstheme="minorHAnsi"/>
+          <w:sz w:val="20"/>
+          <w:szCs w:val="20"/>
+          <w:lang w:val="bg-BG"/>
+        </w:rPr>
+        <w:t xml:space="preserve"> </w:t>
+      </w:r>
+      <w:r>
+        <w:rPr>
+          <w:rFonts w:asciiTheme="minorHAnsi" w:hAnsiTheme="minorHAnsi" w:cstheme="minorHAnsi"/>
+          <w:sz w:val="20"/>
+          <w:szCs w:val="20"/>
+          <w:lang w:val="bg-BG"/>
+        </w:rPr>
+        <w:t xml:space="preserve">да си удържи дължимото по този договор. Във всички останали случаи, </w:t>
       </w:r>
     </w:p>
     <w:p>
@@ -3103,8 +4398,25 @@
           <w:szCs w:val="20"/>
           <w:lang w:val="bg-BG"/>
         </w:rPr>
-        <w:lastRenderedPageBreak/>
-        <w:t xml:space="preserve"> незабавно само след пълното му удовлетворяване по този договор, а ако в него няма никаква част от</w:t>
+        <w:t>възнаграждението по този договор</w:t>
+      </w:r>
+      <w:r>
+        <w:rPr>
+          <w:rFonts w:asciiTheme="minorHAnsi" w:hAnsiTheme="minorHAnsi" w:cstheme="minorHAnsi"/>
+          <w:sz w:val="20"/>
+          <w:szCs w:val="20"/>
+          <w:lang w:val="bg-BG"/>
+        </w:rPr>
+        <w:t xml:space="preserve"> </w:t>
+      </w:r>
+      <w:r>
+        <w:rPr>
+          <w:rFonts w:asciiTheme="minorHAnsi" w:hAnsiTheme="minorHAnsi" w:cstheme="minorHAnsi"/>
+          <w:sz w:val="20"/>
+          <w:szCs w:val="20"/>
+          <w:lang w:val="bg-BG"/>
+        </w:rPr>
+        <w:t>се дължи на ИЗПЪЛНИТЕЛЯ - ако при него има част от възстановените</w:t>
       </w:r>
     </w:p>
     <w:p>
@@ -3129,7 +4441,25 @@
           <w:szCs w:val="20"/>
           <w:lang w:val="bg-BG"/>
         </w:rPr>
-        <w:t xml:space="preserve"> възстановените данъци, то възнаграждението и разходите по т.(4)и т.(5) от този договор се дължат в срок от 20</w:t>
+        <w:t>данъци, то тя ще бъде изплатена или</w:t>
+      </w:r>
+      <w:r>
+        <w:rPr>
+          <w:rFonts w:asciiTheme="minorHAnsi" w:hAnsiTheme="minorHAnsi" w:cstheme="minorHAnsi"/>
+          <w:sz w:val="20"/>
+          <w:szCs w:val="20"/>
+          <w:lang w:val="bg-BG"/>
+        </w:rPr>
+        <w:t xml:space="preserve"> </w:t>
+      </w:r>
+      <w:r>
+        <w:rPr>
+          <w:rFonts w:asciiTheme="minorHAnsi" w:hAnsiTheme="minorHAnsi" w:cstheme="minorHAnsi"/>
+          <w:sz w:val="20"/>
+          <w:szCs w:val="20"/>
+          <w:lang w:val="bg-BG"/>
+        </w:rPr>
+        <w:t>изпратена незабавно само след пълното му удовлетворяване по този</w:t>
       </w:r>
     </w:p>
     <w:p>
@@ -3154,7 +4484,25 @@
           <w:szCs w:val="20"/>
           <w:lang w:val="bg-BG"/>
         </w:rPr>
-        <w:t xml:space="preserve"> работни дни считани от момента на изпращане на сумите от Американските Данъчни Служби. </w:t>
+        <w:t>договор, а ако в него няма никаква</w:t>
+      </w:r>
+      <w:r>
+        <w:rPr>
+          <w:rFonts w:asciiTheme="minorHAnsi" w:hAnsiTheme="minorHAnsi" w:cstheme="minorHAnsi"/>
+          <w:sz w:val="20"/>
+          <w:szCs w:val="20"/>
+          <w:lang w:val="bg-BG"/>
+        </w:rPr>
+        <w:t xml:space="preserve"> </w:t>
+      </w:r>
+      <w:r>
+        <w:rPr>
+          <w:rFonts w:asciiTheme="minorHAnsi" w:hAnsiTheme="minorHAnsi" w:cstheme="minorHAnsi"/>
+          <w:sz w:val="20"/>
+          <w:szCs w:val="20"/>
+          <w:lang w:val="bg-BG"/>
+        </w:rPr>
+        <w:t xml:space="preserve">част от възстановените данъци, то възнаграждението и разходите </w:t>
       </w:r>
     </w:p>
     <w:p>
@@ -3179,7 +4527,25 @@
           <w:szCs w:val="20"/>
           <w:lang w:val="bg-BG"/>
         </w:rPr>
-        <w:t>3. Правото на възнаграждение на ИЗПЪЛНИТЕЛЯ остава в сила дори ако възстановените данъци или част от тях се</w:t>
+        <w:t>по т.(4)и т.(5) от този договор се дължат</w:t>
+      </w:r>
+      <w:r>
+        <w:rPr>
+          <w:rFonts w:asciiTheme="minorHAnsi" w:hAnsiTheme="minorHAnsi" w:cstheme="minorHAnsi"/>
+          <w:sz w:val="20"/>
+          <w:szCs w:val="20"/>
+          <w:lang w:val="bg-BG"/>
+        </w:rPr>
+        <w:t xml:space="preserve"> </w:t>
+      </w:r>
+      <w:r>
+        <w:rPr>
+          <w:rFonts w:asciiTheme="minorHAnsi" w:hAnsiTheme="minorHAnsi" w:cstheme="minorHAnsi"/>
+          <w:sz w:val="20"/>
+          <w:szCs w:val="20"/>
+          <w:lang w:val="bg-BG"/>
+        </w:rPr>
+        <w:t xml:space="preserve">в срок от 20 работни дни считани от момента на изпращане на </w:t>
       </w:r>
     </w:p>
     <w:p>
@@ -3204,7 +4570,25 @@
           <w:szCs w:val="20"/>
           <w:lang w:val="bg-BG"/>
         </w:rPr>
-        <w:t xml:space="preserve"> получат след изтичането на срока на договора, но само ако ИЗПЪЛНИТЕЛЯ е започнал процедура с Американските</w:t>
+        <w:t>сумите</w:t>
+      </w:r>
+      <w:r>
+        <w:rPr>
+          <w:rFonts w:asciiTheme="minorHAnsi" w:hAnsiTheme="minorHAnsi" w:cstheme="minorHAnsi"/>
+          <w:sz w:val="20"/>
+          <w:szCs w:val="20"/>
+          <w:lang w:val="bg-BG"/>
+        </w:rPr>
+        <w:t xml:space="preserve"> </w:t>
+      </w:r>
+      <w:r>
+        <w:rPr>
+          <w:rFonts w:asciiTheme="minorHAnsi" w:hAnsiTheme="minorHAnsi" w:cstheme="minorHAnsi"/>
+          <w:sz w:val="20"/>
+          <w:szCs w:val="20"/>
+          <w:lang w:val="bg-BG"/>
+        </w:rPr>
+        <w:t xml:space="preserve">от Американските Данъчни Служби. </w:t>
       </w:r>
     </w:p>
     <w:p>
@@ -3229,214 +4613,390 @@
           <w:szCs w:val="20"/>
           <w:lang w:val="bg-BG"/>
         </w:rPr>
-        <w:t xml:space="preserve"> Данъчни Служби по възстановяването. </w:t>
-      </w:r>
-    </w:p>
-    <w:p>
-      <w:pPr>
-        <w:pStyle w:val="Default"/>
-        <w:tabs>
-          <w:tab w:val="left" w:pos="3870"/>
-        </w:tabs>
-        <w:ind w:left="-180" w:right="-450"/>
-        <w:rPr>
-          <w:rFonts w:asciiTheme="minorHAnsi" w:hAnsiTheme="minorHAnsi" w:cstheme="minorHAnsi"/>
-          <w:sz w:val="20"/>
-          <w:szCs w:val="20"/>
-          <w:lang w:val="bg-BG"/>
-        </w:rPr>
-      </w:pPr>
-      <w:r>
-        <w:rPr>
-          <w:rFonts w:asciiTheme="minorHAnsi" w:hAnsiTheme="minorHAnsi" w:cstheme="minorHAnsi"/>
-          <w:sz w:val="20"/>
-          <w:szCs w:val="20"/>
-          <w:lang w:val="bg-BG"/>
-        </w:rPr>
-        <w:t>4. Сумата по възнаграждението не се променя ако ВЪЗЛОЖИТЕЛЯ влезе в отношения на финансови санкции с</w:t>
-      </w:r>
-    </w:p>
-    <w:p>
-      <w:pPr>
-        <w:pStyle w:val="Default"/>
-        <w:tabs>
-          <w:tab w:val="left" w:pos="3870"/>
-        </w:tabs>
-        <w:ind w:left="-180" w:right="-450"/>
-        <w:rPr>
-          <w:rFonts w:asciiTheme="minorHAnsi" w:hAnsiTheme="minorHAnsi" w:cstheme="minorHAnsi"/>
-          <w:sz w:val="20"/>
-          <w:szCs w:val="20"/>
-          <w:lang w:val="bg-BG"/>
-        </w:rPr>
-      </w:pPr>
-      <w:r>
-        <w:rPr>
-          <w:rFonts w:asciiTheme="minorHAnsi" w:hAnsiTheme="minorHAnsi" w:cstheme="minorHAnsi"/>
-          <w:sz w:val="20"/>
-          <w:szCs w:val="20"/>
-          <w:lang w:val="bg-BG"/>
-        </w:rPr>
-        <w:t xml:space="preserve"> Американските или други данъчни институции поради нарушаване на задълженията си по този договор или</w:t>
-      </w:r>
-    </w:p>
-    <w:p>
-      <w:pPr>
-        <w:pStyle w:val="Default"/>
-        <w:tabs>
-          <w:tab w:val="left" w:pos="3870"/>
-        </w:tabs>
-        <w:ind w:left="-180" w:right="-450"/>
-        <w:rPr>
-          <w:rFonts w:asciiTheme="minorHAnsi" w:hAnsiTheme="minorHAnsi" w:cstheme="minorHAnsi"/>
-          <w:sz w:val="20"/>
-          <w:szCs w:val="20"/>
-          <w:lang w:val="bg-BG"/>
-        </w:rPr>
-      </w:pPr>
-      <w:r>
-        <w:rPr>
-          <w:rFonts w:asciiTheme="minorHAnsi" w:hAnsiTheme="minorHAnsi" w:cstheme="minorHAnsi"/>
-          <w:sz w:val="20"/>
-          <w:szCs w:val="20"/>
-          <w:lang w:val="bg-BG"/>
-        </w:rPr>
-        <w:t xml:space="preserve"> поради правни причини от друго естество. </w:t>
-      </w:r>
-    </w:p>
-    <w:p>
-      <w:pPr>
-        <w:pStyle w:val="Default"/>
-        <w:tabs>
-          <w:tab w:val="left" w:pos="3870"/>
-        </w:tabs>
-        <w:ind w:left="-180" w:right="-450"/>
-        <w:rPr>
-          <w:rFonts w:asciiTheme="minorHAnsi" w:hAnsiTheme="minorHAnsi" w:cstheme="minorHAnsi"/>
-          <w:sz w:val="20"/>
-          <w:szCs w:val="20"/>
-          <w:lang w:val="bg-BG"/>
-        </w:rPr>
-      </w:pPr>
-    </w:p>
-    <w:p>
-      <w:pPr>
-        <w:pStyle w:val="Default"/>
-        <w:tabs>
-          <w:tab w:val="left" w:pos="3870"/>
-        </w:tabs>
-        <w:ind w:left="-180" w:right="-450"/>
-        <w:rPr>
-          <w:rFonts w:asciiTheme="minorHAnsi" w:hAnsiTheme="minorHAnsi" w:cstheme="minorHAnsi"/>
-          <w:sz w:val="20"/>
-          <w:szCs w:val="20"/>
-          <w:lang w:val="bg-BG"/>
-        </w:rPr>
-      </w:pPr>
-      <w:r>
-        <w:rPr>
-          <w:rFonts w:asciiTheme="minorHAnsi" w:hAnsiTheme="minorHAnsi" w:cstheme="minorHAnsi"/>
-          <w:sz w:val="20"/>
-          <w:szCs w:val="20"/>
-          <w:lang w:val="bg-BG"/>
-        </w:rPr>
-        <w:t>е) FAST CASH” услуга (парите са на разположение на следващия ден от пристигането на чековете по сметка на</w:t>
-      </w:r>
-    </w:p>
-    <w:p>
-      <w:pPr>
-        <w:pStyle w:val="Default"/>
-        <w:tabs>
-          <w:tab w:val="left" w:pos="3870"/>
-        </w:tabs>
-        <w:ind w:left="-180" w:right="-450"/>
-        <w:rPr>
-          <w:rFonts w:asciiTheme="minorHAnsi" w:hAnsiTheme="minorHAnsi" w:cstheme="minorHAnsi"/>
-          <w:sz w:val="20"/>
-          <w:szCs w:val="20"/>
-          <w:lang w:val="bg-BG"/>
-        </w:rPr>
-      </w:pPr>
-      <w:r>
-        <w:rPr>
-          <w:rFonts w:asciiTheme="minorHAnsi" w:hAnsiTheme="minorHAnsi" w:cstheme="minorHAnsi"/>
-          <w:sz w:val="20"/>
-          <w:szCs w:val="20"/>
-          <w:lang w:val="bg-BG"/>
-        </w:rPr>
-        <w:t xml:space="preserve"> ВЪЗЛОЖИТЕЛЯ) се прилага към всеки ВЪЗЛОЖИТЕЛ, освен ако различно не е договорено в писмен вид. Цената на</w:t>
-      </w:r>
-    </w:p>
-    <w:p>
-      <w:pPr>
-        <w:pStyle w:val="Default"/>
-        <w:tabs>
-          <w:tab w:val="left" w:pos="3870"/>
-        </w:tabs>
-        <w:ind w:left="-180" w:right="-450"/>
-        <w:rPr>
-          <w:rFonts w:asciiTheme="minorHAnsi" w:hAnsiTheme="minorHAnsi" w:cstheme="minorHAnsi"/>
-          <w:sz w:val="20"/>
-          <w:szCs w:val="20"/>
-          <w:lang w:val="bg-BG"/>
-        </w:rPr>
-      </w:pPr>
-      <w:r>
-        <w:rPr>
-          <w:rFonts w:asciiTheme="minorHAnsi" w:hAnsiTheme="minorHAnsi" w:cstheme="minorHAnsi"/>
-          <w:sz w:val="20"/>
-          <w:szCs w:val="20"/>
-          <w:lang w:val="bg-BG"/>
-        </w:rPr>
-        <w:t xml:space="preserve"> услугата е 16(шестнадесет) щатски долара на чек и не е включена в точка b) или съответно c). Ако се изберат</w:t>
-      </w:r>
-    </w:p>
-    <w:p>
-      <w:pPr>
-        <w:pStyle w:val="Default"/>
-        <w:tabs>
-          <w:tab w:val="left" w:pos="3870"/>
-        </w:tabs>
-        <w:ind w:left="-180" w:right="-450"/>
-        <w:rPr>
-          <w:rFonts w:asciiTheme="minorHAnsi" w:hAnsiTheme="minorHAnsi" w:cstheme="minorHAnsi"/>
-          <w:sz w:val="20"/>
-          <w:szCs w:val="20"/>
-          <w:lang w:val="bg-BG"/>
-        </w:rPr>
-      </w:pPr>
-      <w:r>
-        <w:rPr>
-          <w:rFonts w:asciiTheme="minorHAnsi" w:hAnsiTheme="minorHAnsi" w:cstheme="minorHAnsi"/>
-          <w:sz w:val="20"/>
-          <w:szCs w:val="20"/>
-          <w:lang w:val="bg-BG"/>
-        </w:rPr>
-        <w:t xml:space="preserve"> алтернативни методи на плащане, то трансферните разходи или пощенските услуги може да са предмет на</w:t>
-      </w:r>
-    </w:p>
-    <w:p>
-      <w:pPr>
-        <w:pStyle w:val="Default"/>
-        <w:tabs>
-          <w:tab w:val="left" w:pos="3870"/>
-        </w:tabs>
-        <w:ind w:left="-180" w:right="-450"/>
-        <w:rPr>
-          <w:rFonts w:asciiTheme="minorHAnsi" w:hAnsiTheme="minorHAnsi" w:cstheme="minorHAnsi"/>
-          <w:sz w:val="20"/>
-          <w:szCs w:val="20"/>
-          <w:lang w:val="bg-BG"/>
-        </w:rPr>
-      </w:pPr>
-      <w:r>
-        <w:rPr>
-          <w:rFonts w:asciiTheme="minorHAnsi" w:hAnsiTheme="minorHAnsi" w:cstheme="minorHAnsi"/>
-          <w:sz w:val="20"/>
-          <w:szCs w:val="20"/>
-          <w:lang w:val="bg-BG"/>
-        </w:rPr>
-        <w:t xml:space="preserve"> допълнителни разходи. </w:t>
+        <w:t>3. Правото на възнаграждение на ИЗПЪЛНИТЕЛЯ остава в сила дори ако възстановените данъци или част</w:t>
+      </w:r>
+    </w:p>
+    <w:p>
+      <w:pPr>
+        <w:pStyle w:val="Default"/>
+        <w:tabs>
+          <w:tab w:val="left" w:pos="3870"/>
+        </w:tabs>
+        <w:spacing w:after="10"/>
+        <w:ind w:left="-180" w:right="-450"/>
+        <w:rPr>
+          <w:rFonts w:asciiTheme="minorHAnsi" w:hAnsiTheme="minorHAnsi" w:cstheme="minorHAnsi"/>
+          <w:sz w:val="20"/>
+          <w:szCs w:val="20"/>
+          <w:lang w:val="bg-BG"/>
+        </w:rPr>
+      </w:pPr>
+      <w:r>
+        <w:rPr>
+          <w:rFonts w:asciiTheme="minorHAnsi" w:hAnsiTheme="minorHAnsi" w:cstheme="minorHAnsi"/>
+          <w:sz w:val="20"/>
+          <w:szCs w:val="20"/>
+          <w:lang w:val="bg-BG"/>
+        </w:rPr>
+        <w:t>о</w:t>
+      </w:r>
+      <w:r>
+        <w:rPr>
+          <w:rFonts w:asciiTheme="minorHAnsi" w:hAnsiTheme="minorHAnsi" w:cstheme="minorHAnsi"/>
+          <w:sz w:val="20"/>
+          <w:szCs w:val="20"/>
+          <w:lang w:val="bg-BG"/>
+        </w:rPr>
+        <w:t>т тях се получат след изтичането на срока на договора, но само ако ИЗПЪЛНИТЕЛЯ е започнал процедура</w:t>
+      </w:r>
+    </w:p>
+    <w:p>
+      <w:pPr>
+        <w:pStyle w:val="Default"/>
+        <w:tabs>
+          <w:tab w:val="left" w:pos="3870"/>
+        </w:tabs>
+        <w:spacing w:after="10"/>
+        <w:ind w:left="-180" w:right="-450"/>
+        <w:rPr>
+          <w:rFonts w:asciiTheme="minorHAnsi" w:hAnsiTheme="minorHAnsi" w:cstheme="minorHAnsi"/>
+          <w:sz w:val="20"/>
+          <w:szCs w:val="20"/>
+          <w:lang w:val="bg-BG"/>
+        </w:rPr>
+      </w:pPr>
+      <w:r>
+        <w:rPr>
+          <w:rFonts w:asciiTheme="minorHAnsi" w:hAnsiTheme="minorHAnsi" w:cstheme="minorHAnsi"/>
+          <w:sz w:val="20"/>
+          <w:szCs w:val="20"/>
+          <w:lang w:val="bg-BG"/>
+        </w:rPr>
+        <w:t>с</w:t>
+      </w:r>
+      <w:r>
+        <w:rPr>
+          <w:rFonts w:asciiTheme="minorHAnsi" w:hAnsiTheme="minorHAnsi" w:cstheme="minorHAnsi"/>
+          <w:sz w:val="20"/>
+          <w:szCs w:val="20"/>
+          <w:lang w:val="bg-BG"/>
+        </w:rPr>
+        <w:t xml:space="preserve"> </w:t>
+      </w:r>
+      <w:r>
+        <w:rPr>
+          <w:rFonts w:asciiTheme="minorHAnsi" w:hAnsiTheme="minorHAnsi" w:cstheme="minorHAnsi"/>
+          <w:sz w:val="20"/>
+          <w:szCs w:val="20"/>
+          <w:lang w:val="bg-BG"/>
+        </w:rPr>
+        <w:t xml:space="preserve">Американските Данъчни Служби по възстановяването. </w:t>
+      </w:r>
+    </w:p>
+    <w:p>
+      <w:pPr>
+        <w:pStyle w:val="Default"/>
+        <w:tabs>
+          <w:tab w:val="left" w:pos="3870"/>
+        </w:tabs>
+        <w:ind w:left="-180" w:right="-450"/>
+        <w:rPr>
+          <w:rFonts w:asciiTheme="minorHAnsi" w:hAnsiTheme="minorHAnsi" w:cstheme="minorHAnsi"/>
+          <w:sz w:val="20"/>
+          <w:szCs w:val="20"/>
+          <w:lang w:val="bg-BG"/>
+        </w:rPr>
+      </w:pPr>
+      <w:r>
+        <w:rPr>
+          <w:rFonts w:asciiTheme="minorHAnsi" w:hAnsiTheme="minorHAnsi" w:cstheme="minorHAnsi"/>
+          <w:sz w:val="20"/>
+          <w:szCs w:val="20"/>
+          <w:lang w:val="bg-BG"/>
+        </w:rPr>
+        <w:t>4. Сумата по възнаграждението не се променя ако ВЪЗЛОЖИТЕЛЯ влезе в отношения на финансови</w:t>
+      </w:r>
+    </w:p>
+    <w:p>
+      <w:pPr>
+        <w:pStyle w:val="Default"/>
+        <w:tabs>
+          <w:tab w:val="left" w:pos="3870"/>
+        </w:tabs>
+        <w:ind w:left="-180" w:right="-450"/>
+        <w:rPr>
+          <w:rFonts w:asciiTheme="minorHAnsi" w:hAnsiTheme="minorHAnsi" w:cstheme="minorHAnsi"/>
+          <w:sz w:val="20"/>
+          <w:szCs w:val="20"/>
+          <w:lang w:val="bg-BG"/>
+        </w:rPr>
+      </w:pPr>
+      <w:r>
+        <w:rPr>
+          <w:rFonts w:asciiTheme="minorHAnsi" w:hAnsiTheme="minorHAnsi" w:cstheme="minorHAnsi"/>
+          <w:sz w:val="20"/>
+          <w:szCs w:val="20"/>
+          <w:lang w:val="bg-BG"/>
+        </w:rPr>
+        <w:t>с</w:t>
+      </w:r>
+      <w:r>
+        <w:rPr>
+          <w:rFonts w:asciiTheme="minorHAnsi" w:hAnsiTheme="minorHAnsi" w:cstheme="minorHAnsi"/>
+          <w:sz w:val="20"/>
+          <w:szCs w:val="20"/>
+          <w:lang w:val="bg-BG"/>
+        </w:rPr>
+        <w:t>анкции</w:t>
+      </w:r>
+      <w:r>
+        <w:rPr>
+          <w:rFonts w:asciiTheme="minorHAnsi" w:hAnsiTheme="minorHAnsi" w:cstheme="minorHAnsi"/>
+          <w:sz w:val="20"/>
+          <w:szCs w:val="20"/>
+          <w:lang w:val="bg-BG"/>
+        </w:rPr>
+        <w:t xml:space="preserve"> </w:t>
+      </w:r>
+      <w:r>
+        <w:rPr>
+          <w:rFonts w:asciiTheme="minorHAnsi" w:hAnsiTheme="minorHAnsi" w:cstheme="minorHAnsi"/>
+          <w:sz w:val="20"/>
+          <w:szCs w:val="20"/>
+          <w:lang w:val="bg-BG"/>
+        </w:rPr>
+        <w:t>с Американските или други данъчни институции поради нарушаване на задълженията си по</w:t>
+      </w:r>
+    </w:p>
+    <w:p>
+      <w:pPr>
+        <w:pStyle w:val="Default"/>
+        <w:tabs>
+          <w:tab w:val="left" w:pos="3870"/>
+        </w:tabs>
+        <w:ind w:left="-180" w:right="-450"/>
+        <w:rPr>
+          <w:rFonts w:asciiTheme="minorHAnsi" w:hAnsiTheme="minorHAnsi" w:cstheme="minorHAnsi"/>
+          <w:sz w:val="20"/>
+          <w:szCs w:val="20"/>
+          <w:lang w:val="bg-BG"/>
+        </w:rPr>
+      </w:pPr>
+      <w:r>
+        <w:rPr>
+          <w:rFonts w:asciiTheme="minorHAnsi" w:hAnsiTheme="minorHAnsi" w:cstheme="minorHAnsi"/>
+          <w:sz w:val="20"/>
+          <w:szCs w:val="20"/>
+          <w:lang w:val="bg-BG"/>
+        </w:rPr>
+        <w:t>този договор</w:t>
+      </w:r>
+      <w:r>
+        <w:rPr>
+          <w:rFonts w:asciiTheme="minorHAnsi" w:hAnsiTheme="minorHAnsi" w:cstheme="minorHAnsi"/>
+          <w:sz w:val="20"/>
+          <w:szCs w:val="20"/>
+          <w:lang w:val="bg-BG"/>
+        </w:rPr>
+        <w:t xml:space="preserve"> </w:t>
+      </w:r>
+      <w:r>
+        <w:rPr>
+          <w:rFonts w:asciiTheme="minorHAnsi" w:hAnsiTheme="minorHAnsi" w:cstheme="minorHAnsi"/>
+          <w:sz w:val="20"/>
+          <w:szCs w:val="20"/>
+          <w:lang w:val="bg-BG"/>
+        </w:rPr>
+        <w:t xml:space="preserve">или поради правни причини от друго естество. </w:t>
+      </w:r>
+    </w:p>
+    <w:p>
+      <w:pPr>
+        <w:pStyle w:val="Default"/>
+        <w:tabs>
+          <w:tab w:val="left" w:pos="3870"/>
+        </w:tabs>
+        <w:ind w:left="-180" w:right="-450"/>
+        <w:rPr>
+          <w:rFonts w:asciiTheme="minorHAnsi" w:hAnsiTheme="minorHAnsi" w:cstheme="minorHAnsi"/>
+          <w:sz w:val="20"/>
+          <w:szCs w:val="20"/>
+          <w:lang w:val="bg-BG"/>
+        </w:rPr>
+      </w:pPr>
+    </w:p>
+    <w:p>
+      <w:pPr>
+        <w:pStyle w:val="Default"/>
+        <w:tabs>
+          <w:tab w:val="left" w:pos="3870"/>
+        </w:tabs>
+        <w:ind w:left="-180" w:right="-450"/>
+        <w:rPr>
+          <w:rFonts w:asciiTheme="minorHAnsi" w:hAnsiTheme="minorHAnsi" w:cstheme="minorHAnsi"/>
+          <w:sz w:val="20"/>
+          <w:szCs w:val="20"/>
+          <w:lang w:val="bg-BG"/>
+        </w:rPr>
+      </w:pPr>
+      <w:r>
+        <w:rPr>
+          <w:rFonts w:asciiTheme="minorHAnsi" w:hAnsiTheme="minorHAnsi" w:cstheme="minorHAnsi"/>
+          <w:sz w:val="20"/>
+          <w:szCs w:val="20"/>
+          <w:lang w:val="bg-BG"/>
+        </w:rPr>
+        <w:t>е) FAST CASH” услуга (парите са на разположение на следващия ден от пристигането на чековете по</w:t>
+      </w:r>
+    </w:p>
+    <w:p>
+      <w:pPr>
+        <w:pStyle w:val="Default"/>
+        <w:tabs>
+          <w:tab w:val="left" w:pos="3870"/>
+        </w:tabs>
+        <w:ind w:left="-180" w:right="-450"/>
+        <w:rPr>
+          <w:rFonts w:asciiTheme="minorHAnsi" w:hAnsiTheme="minorHAnsi" w:cstheme="minorHAnsi"/>
+          <w:sz w:val="20"/>
+          <w:szCs w:val="20"/>
+          <w:lang w:val="bg-BG"/>
+        </w:rPr>
+      </w:pPr>
+      <w:r>
+        <w:rPr>
+          <w:rFonts w:asciiTheme="minorHAnsi" w:hAnsiTheme="minorHAnsi" w:cstheme="minorHAnsi"/>
+          <w:sz w:val="20"/>
+          <w:szCs w:val="20"/>
+          <w:lang w:val="bg-BG"/>
+        </w:rPr>
+        <w:t>сметка</w:t>
+      </w:r>
+      <w:r>
+        <w:rPr>
+          <w:rFonts w:asciiTheme="minorHAnsi" w:hAnsiTheme="minorHAnsi" w:cstheme="minorHAnsi"/>
+          <w:sz w:val="20"/>
+          <w:szCs w:val="20"/>
+          <w:lang w:val="bg-BG"/>
+        </w:rPr>
+        <w:t xml:space="preserve"> </w:t>
+      </w:r>
+      <w:r>
+        <w:rPr>
+          <w:rFonts w:asciiTheme="minorHAnsi" w:hAnsiTheme="minorHAnsi" w:cstheme="minorHAnsi"/>
+          <w:sz w:val="20"/>
+          <w:szCs w:val="20"/>
+          <w:lang w:val="bg-BG"/>
+        </w:rPr>
+        <w:t>на ВЪЗЛОЖИТЕЛЯ) се прилага към всеки ВЪЗЛОЖИТЕЛ, освен ако различно не е договорено в</w:t>
+      </w:r>
+    </w:p>
+    <w:p>
+      <w:pPr>
+        <w:pStyle w:val="Default"/>
+        <w:tabs>
+          <w:tab w:val="left" w:pos="3870"/>
+        </w:tabs>
+        <w:ind w:left="-180" w:right="-450"/>
+        <w:rPr>
+          <w:rFonts w:asciiTheme="minorHAnsi" w:hAnsiTheme="minorHAnsi" w:cstheme="minorHAnsi"/>
+          <w:sz w:val="20"/>
+          <w:szCs w:val="20"/>
+          <w:lang w:val="bg-BG"/>
+        </w:rPr>
+      </w:pPr>
+      <w:r>
+        <w:rPr>
+          <w:rFonts w:asciiTheme="minorHAnsi" w:hAnsiTheme="minorHAnsi" w:cstheme="minorHAnsi"/>
+          <w:sz w:val="20"/>
+          <w:szCs w:val="20"/>
+          <w:lang w:val="bg-BG"/>
+        </w:rPr>
+        <w:t>писмен вид.</w:t>
+      </w:r>
+      <w:r>
+        <w:rPr>
+          <w:rFonts w:asciiTheme="minorHAnsi" w:hAnsiTheme="minorHAnsi" w:cstheme="minorHAnsi"/>
+          <w:sz w:val="20"/>
+          <w:szCs w:val="20"/>
+          <w:lang w:val="bg-BG"/>
+        </w:rPr>
+        <w:t xml:space="preserve"> </w:t>
+      </w:r>
+      <w:r>
+        <w:rPr>
+          <w:rFonts w:asciiTheme="minorHAnsi" w:hAnsiTheme="minorHAnsi" w:cstheme="minorHAnsi"/>
+          <w:sz w:val="20"/>
+          <w:szCs w:val="20"/>
+          <w:lang w:val="bg-BG"/>
+        </w:rPr>
+        <w:t>Цената на услугата е 16(шестнадесет) щатски долара на чек и не е включена в точка b)</w:t>
+      </w:r>
+    </w:p>
+    <w:p>
+      <w:pPr>
+        <w:pStyle w:val="Default"/>
+        <w:tabs>
+          <w:tab w:val="left" w:pos="3870"/>
+        </w:tabs>
+        <w:ind w:left="-180" w:right="-450"/>
+        <w:rPr>
+          <w:rFonts w:asciiTheme="minorHAnsi" w:hAnsiTheme="minorHAnsi" w:cstheme="minorHAnsi"/>
+          <w:sz w:val="20"/>
+          <w:szCs w:val="20"/>
+          <w:lang w:val="bg-BG"/>
+        </w:rPr>
+      </w:pPr>
+      <w:r>
+        <w:rPr>
+          <w:rFonts w:asciiTheme="minorHAnsi" w:hAnsiTheme="minorHAnsi" w:cstheme="minorHAnsi"/>
+          <w:sz w:val="20"/>
+          <w:szCs w:val="20"/>
+          <w:lang w:val="bg-BG"/>
+        </w:rPr>
+        <w:t>или съответно c). Ако се изберат алтернативни методи на плащане, то трансферните разходи или</w:t>
+      </w:r>
+    </w:p>
+    <w:p>
+      <w:pPr>
+        <w:pStyle w:val="Default"/>
+        <w:tabs>
+          <w:tab w:val="left" w:pos="3870"/>
+        </w:tabs>
+        <w:ind w:left="-180" w:right="-450"/>
+        <w:rPr>
+          <w:rFonts w:asciiTheme="minorHAnsi" w:hAnsiTheme="minorHAnsi" w:cstheme="minorHAnsi"/>
+          <w:sz w:val="20"/>
+          <w:szCs w:val="20"/>
+          <w:lang w:val="bg-BG"/>
+        </w:rPr>
+      </w:pPr>
+      <w:r>
+        <w:rPr>
+          <w:rFonts w:asciiTheme="minorHAnsi" w:hAnsiTheme="minorHAnsi" w:cstheme="minorHAnsi"/>
+          <w:sz w:val="20"/>
+          <w:szCs w:val="20"/>
+          <w:lang w:val="bg-BG"/>
+        </w:rPr>
+        <w:t>пощенските услуги може</w:t>
+      </w:r>
+      <w:r>
+        <w:rPr>
+          <w:rFonts w:asciiTheme="minorHAnsi" w:hAnsiTheme="minorHAnsi" w:cstheme="minorHAnsi"/>
+          <w:sz w:val="20"/>
+          <w:szCs w:val="20"/>
+          <w:lang w:val="bg-BG"/>
+        </w:rPr>
+        <w:t xml:space="preserve"> </w:t>
+      </w:r>
+      <w:r>
+        <w:rPr>
+          <w:rFonts w:asciiTheme="minorHAnsi" w:hAnsiTheme="minorHAnsi" w:cstheme="minorHAnsi"/>
+          <w:sz w:val="20"/>
+          <w:szCs w:val="20"/>
+          <w:lang w:val="bg-BG"/>
+        </w:rPr>
+        <w:t xml:space="preserve">да са предмет на допълнителни разходи. </w:t>
       </w:r>
     </w:p>
     <w:p>
@@ -3526,7 +5086,7 @@
           <w:szCs w:val="20"/>
           <w:lang w:val="bg-BG"/>
         </w:rPr>
-        <w:t>ВЪЗЛОЖИТЕЛЯТ е длъжен да покрие всички непредвидени разходи на ИЗПЪЛНИТЕЛЯ свързани с предмета на</w:t>
+        <w:t xml:space="preserve">ВЪЗЛОЖИТЕЛЯТ е длъжен да покрие всички непредвидени разходи на ИЗПЪЛНИТЕЛЯ свързани с </w:t>
       </w:r>
     </w:p>
     <w:p>
@@ -3551,7 +5111,7 @@
           <w:szCs w:val="20"/>
           <w:lang w:val="bg-BG"/>
         </w:rPr>
-        <w:t xml:space="preserve"> този договор. </w:t>
+        <w:t xml:space="preserve">предмета на този договор. </w:t>
       </w:r>
     </w:p>
     <w:p>
@@ -3780,7 +5340,7 @@
           <w:szCs w:val="20"/>
           <w:lang w:val="bg-BG"/>
         </w:rPr>
-        <w:t>2. Срока на подписания договор е от подписването му до 1 Октомври на последващата година от датата на</w:t>
+        <w:t>2. Срока на подписания договор е от подписването му до 1 Октомври на последващата година от датата</w:t>
       </w:r>
     </w:p>
     <w:p>
@@ -3805,103 +5365,193 @@
           <w:szCs w:val="20"/>
           <w:lang w:val="bg-BG"/>
         </w:rPr>
-        <w:t xml:space="preserve"> подписване. </w:t>
-      </w:r>
-    </w:p>
-    <w:p>
-      <w:pPr>
-        <w:pStyle w:val="Default"/>
-        <w:tabs>
-          <w:tab w:val="left" w:pos="3870"/>
-        </w:tabs>
-        <w:ind w:left="-180" w:right="-450"/>
-        <w:rPr>
-          <w:rFonts w:asciiTheme="minorHAnsi" w:hAnsiTheme="minorHAnsi" w:cstheme="minorHAnsi"/>
-          <w:sz w:val="20"/>
-          <w:szCs w:val="20"/>
-          <w:lang w:val="bg-BG"/>
-        </w:rPr>
-      </w:pPr>
-      <w:r>
-        <w:rPr>
-          <w:rFonts w:asciiTheme="minorHAnsi" w:hAnsiTheme="minorHAnsi" w:cstheme="minorHAnsi"/>
-          <w:sz w:val="20"/>
-          <w:szCs w:val="20"/>
-          <w:lang w:val="bg-BG"/>
-        </w:rPr>
-        <w:t>3. ВЪЗЛОЖИТЕЛЯТ И ИЗПЪЛНИТЕЛЯТ имат право да се откажат от договора по причини и начини описани в</w:t>
-      </w:r>
-    </w:p>
-    <w:p>
-      <w:pPr>
-        <w:pStyle w:val="Default"/>
-        <w:tabs>
-          <w:tab w:val="left" w:pos="3870"/>
-        </w:tabs>
-        <w:ind w:left="-180" w:right="-450"/>
-        <w:rPr>
-          <w:rFonts w:asciiTheme="minorHAnsi" w:hAnsiTheme="minorHAnsi" w:cstheme="minorHAnsi"/>
-          <w:sz w:val="20"/>
-          <w:szCs w:val="20"/>
-          <w:lang w:val="bg-BG"/>
-        </w:rPr>
-      </w:pPr>
-      <w:r>
-        <w:rPr>
-          <w:rFonts w:asciiTheme="minorHAnsi" w:hAnsiTheme="minorHAnsi" w:cstheme="minorHAnsi"/>
-          <w:sz w:val="20"/>
-          <w:szCs w:val="20"/>
-          <w:lang w:val="bg-BG"/>
-        </w:rPr>
-        <w:t xml:space="preserve"> настоящия договор или продиктувани от актуалното законодателство. При условие, че ИЗПЪЛНИТЕЛЯ спазва</w:t>
-      </w:r>
-    </w:p>
-    <w:p>
-      <w:pPr>
-        <w:pStyle w:val="Default"/>
-        <w:tabs>
-          <w:tab w:val="left" w:pos="3870"/>
-        </w:tabs>
-        <w:ind w:left="-180" w:right="-450"/>
-        <w:rPr>
-          <w:rFonts w:asciiTheme="minorHAnsi" w:hAnsiTheme="minorHAnsi" w:cstheme="minorHAnsi"/>
-          <w:sz w:val="20"/>
-          <w:szCs w:val="20"/>
-          <w:lang w:val="bg-BG"/>
-        </w:rPr>
-      </w:pPr>
-      <w:r>
-        <w:rPr>
-          <w:rFonts w:asciiTheme="minorHAnsi" w:hAnsiTheme="minorHAnsi" w:cstheme="minorHAnsi"/>
-          <w:sz w:val="20"/>
-          <w:szCs w:val="20"/>
-          <w:lang w:val="bg-BG"/>
-        </w:rPr>
-        <w:t xml:space="preserve"> клаузите по този договор, то отказа на ВЪЗЛОЖИТЕЛЯ се приема само след писмено уведомление до три дни от</w:t>
-      </w:r>
-    </w:p>
-    <w:p>
-      <w:pPr>
-        <w:pStyle w:val="Default"/>
-        <w:tabs>
-          <w:tab w:val="left" w:pos="3870"/>
-        </w:tabs>
-        <w:ind w:left="-180" w:right="-450"/>
-        <w:rPr>
-          <w:rFonts w:asciiTheme="minorHAnsi" w:hAnsiTheme="minorHAnsi" w:cstheme="minorHAnsi"/>
-          <w:sz w:val="20"/>
-          <w:szCs w:val="20"/>
-          <w:lang w:val="bg-BG"/>
-        </w:rPr>
-      </w:pPr>
-      <w:r>
-        <w:rPr>
-          <w:rFonts w:asciiTheme="minorHAnsi" w:hAnsiTheme="minorHAnsi" w:cstheme="minorHAnsi"/>
-          <w:sz w:val="20"/>
-          <w:szCs w:val="20"/>
-          <w:lang w:val="bg-BG"/>
-        </w:rPr>
-        <w:t xml:space="preserve"> дата на подписване на настоящия договор, а сумите по възнаграждението се дължат. </w:t>
+        <w:t>Н</w:t>
+      </w:r>
+      <w:r>
+        <w:rPr>
+          <w:rFonts w:asciiTheme="minorHAnsi" w:hAnsiTheme="minorHAnsi" w:cstheme="minorHAnsi"/>
+          <w:sz w:val="20"/>
+          <w:szCs w:val="20"/>
+          <w:lang w:val="bg-BG"/>
+        </w:rPr>
+        <w:t>а</w:t>
+      </w:r>
+      <w:r>
+        <w:rPr>
+          <w:rFonts w:asciiTheme="minorHAnsi" w:hAnsiTheme="minorHAnsi" w:cstheme="minorHAnsi"/>
+          <w:sz w:val="20"/>
+          <w:szCs w:val="20"/>
+          <w:lang w:val="bg-BG"/>
+        </w:rPr>
+        <w:t xml:space="preserve"> </w:t>
+      </w:r>
+      <w:r>
+        <w:rPr>
+          <w:rFonts w:asciiTheme="minorHAnsi" w:hAnsiTheme="minorHAnsi" w:cstheme="minorHAnsi"/>
+          <w:sz w:val="20"/>
+          <w:szCs w:val="20"/>
+          <w:lang w:val="bg-BG"/>
+        </w:rPr>
+        <w:t xml:space="preserve">подписване. </w:t>
+      </w:r>
+    </w:p>
+    <w:p>
+      <w:pPr>
+        <w:pStyle w:val="Default"/>
+        <w:tabs>
+          <w:tab w:val="left" w:pos="3870"/>
+        </w:tabs>
+        <w:ind w:left="-180" w:right="-450"/>
+        <w:rPr>
+          <w:rFonts w:asciiTheme="minorHAnsi" w:hAnsiTheme="minorHAnsi" w:cstheme="minorHAnsi"/>
+          <w:sz w:val="20"/>
+          <w:szCs w:val="20"/>
+          <w:lang w:val="bg-BG"/>
+        </w:rPr>
+      </w:pPr>
+      <w:r>
+        <w:rPr>
+          <w:rFonts w:asciiTheme="minorHAnsi" w:hAnsiTheme="minorHAnsi" w:cstheme="minorHAnsi"/>
+          <w:sz w:val="20"/>
+          <w:szCs w:val="20"/>
+          <w:lang w:val="bg-BG"/>
+        </w:rPr>
+        <w:t>3. ВЪЗЛОЖИТЕЛЯТ И ИЗПЪЛНИТЕЛЯТ имат право да се откажат от договора по причини и начини описани</w:t>
+      </w:r>
+    </w:p>
+    <w:p>
+      <w:pPr>
+        <w:pStyle w:val="Default"/>
+        <w:tabs>
+          <w:tab w:val="left" w:pos="3870"/>
+        </w:tabs>
+        <w:ind w:left="-180" w:right="-450"/>
+        <w:rPr>
+          <w:rFonts w:asciiTheme="minorHAnsi" w:hAnsiTheme="minorHAnsi" w:cstheme="minorHAnsi"/>
+          <w:sz w:val="20"/>
+          <w:szCs w:val="20"/>
+          <w:lang w:val="bg-BG"/>
+        </w:rPr>
+      </w:pPr>
+      <w:r>
+        <w:rPr>
+          <w:rFonts w:asciiTheme="minorHAnsi" w:hAnsiTheme="minorHAnsi" w:cstheme="minorHAnsi"/>
+          <w:sz w:val="20"/>
+          <w:szCs w:val="20"/>
+          <w:lang w:val="bg-BG"/>
+        </w:rPr>
+        <w:t>В</w:t>
+      </w:r>
+      <w:r>
+        <w:rPr>
+          <w:rFonts w:asciiTheme="minorHAnsi" w:hAnsiTheme="minorHAnsi" w:cstheme="minorHAnsi"/>
+          <w:sz w:val="20"/>
+          <w:szCs w:val="20"/>
+          <w:lang w:val="bg-BG"/>
+        </w:rPr>
+        <w:t xml:space="preserve"> </w:t>
+      </w:r>
+      <w:r>
+        <w:rPr>
+          <w:rFonts w:asciiTheme="minorHAnsi" w:hAnsiTheme="minorHAnsi" w:cstheme="minorHAnsi"/>
+          <w:sz w:val="20"/>
+          <w:szCs w:val="20"/>
+          <w:lang w:val="bg-BG"/>
+        </w:rPr>
+        <w:t>настоящия договор или продиктувани от актуалното законодателство. При условие, че ИЗПЪЛНИТЕЛЯ</w:t>
+      </w:r>
+    </w:p>
+    <w:p>
+      <w:pPr>
+        <w:pStyle w:val="Default"/>
+        <w:tabs>
+          <w:tab w:val="left" w:pos="3870"/>
+        </w:tabs>
+        <w:ind w:left="-180" w:right="-450"/>
+        <w:rPr>
+          <w:rFonts w:asciiTheme="minorHAnsi" w:hAnsiTheme="minorHAnsi" w:cstheme="minorHAnsi"/>
+          <w:sz w:val="20"/>
+          <w:szCs w:val="20"/>
+          <w:lang w:val="bg-BG"/>
+        </w:rPr>
+      </w:pPr>
+      <w:r>
+        <w:rPr>
+          <w:rFonts w:asciiTheme="minorHAnsi" w:hAnsiTheme="minorHAnsi" w:cstheme="minorHAnsi"/>
+          <w:sz w:val="20"/>
+          <w:szCs w:val="20"/>
+          <w:lang w:val="bg-BG"/>
+        </w:rPr>
+        <w:t>с</w:t>
+      </w:r>
+      <w:r>
+        <w:rPr>
+          <w:rFonts w:asciiTheme="minorHAnsi" w:hAnsiTheme="minorHAnsi" w:cstheme="minorHAnsi"/>
+          <w:sz w:val="20"/>
+          <w:szCs w:val="20"/>
+          <w:lang w:val="bg-BG"/>
+        </w:rPr>
+        <w:t>пазва</w:t>
+      </w:r>
+      <w:r>
+        <w:rPr>
+          <w:rFonts w:asciiTheme="minorHAnsi" w:hAnsiTheme="minorHAnsi" w:cstheme="minorHAnsi"/>
+          <w:sz w:val="20"/>
+          <w:szCs w:val="20"/>
+          <w:lang w:val="bg-BG"/>
+        </w:rPr>
+        <w:t xml:space="preserve"> </w:t>
+      </w:r>
+      <w:r>
+        <w:rPr>
+          <w:rFonts w:asciiTheme="minorHAnsi" w:hAnsiTheme="minorHAnsi" w:cstheme="minorHAnsi"/>
+          <w:sz w:val="20"/>
+          <w:szCs w:val="20"/>
+          <w:lang w:val="bg-BG"/>
+        </w:rPr>
+        <w:t>клаузите по този договор, то отказа на ВЪЗЛОЖИТЕЛЯ се приема само след писмено уведомление</w:t>
+      </w:r>
+    </w:p>
+    <w:p>
+      <w:pPr>
+        <w:pStyle w:val="Default"/>
+        <w:tabs>
+          <w:tab w:val="left" w:pos="3870"/>
+        </w:tabs>
+        <w:ind w:left="-180" w:right="-450"/>
+        <w:rPr>
+          <w:rFonts w:asciiTheme="minorHAnsi" w:hAnsiTheme="minorHAnsi" w:cstheme="minorHAnsi"/>
+          <w:sz w:val="20"/>
+          <w:szCs w:val="20"/>
+          <w:lang w:val="bg-BG"/>
+        </w:rPr>
+      </w:pPr>
+      <w:r>
+        <w:rPr>
+          <w:rFonts w:asciiTheme="minorHAnsi" w:hAnsiTheme="minorHAnsi" w:cstheme="minorHAnsi"/>
+          <w:sz w:val="20"/>
+          <w:szCs w:val="20"/>
+          <w:lang w:val="bg-BG"/>
+        </w:rPr>
+        <w:t>до три дни</w:t>
+      </w:r>
+      <w:r>
+        <w:rPr>
+          <w:rFonts w:asciiTheme="minorHAnsi" w:hAnsiTheme="minorHAnsi" w:cstheme="minorHAnsi"/>
+          <w:sz w:val="20"/>
+          <w:szCs w:val="20"/>
+          <w:lang w:val="bg-BG"/>
+        </w:rPr>
+        <w:t xml:space="preserve"> </w:t>
+      </w:r>
+      <w:r>
+        <w:rPr>
+          <w:rFonts w:asciiTheme="minorHAnsi" w:hAnsiTheme="minorHAnsi" w:cstheme="minorHAnsi"/>
+          <w:sz w:val="20"/>
+          <w:szCs w:val="20"/>
+          <w:lang w:val="bg-BG"/>
+        </w:rPr>
+        <w:t xml:space="preserve">от дата на подписване на настоящия договор, а сумите по възнаграждението се дължат. </w:t>
       </w:r>
     </w:p>
     <w:p>
@@ -3988,47 +5638,59 @@
           <w:szCs w:val="20"/>
           <w:lang w:val="bg-BG"/>
         </w:rPr>
-        <w:t>Всички неуредени въпроси и възникнали спорове се решават по пътя на преговорите, ако това е невъзможно,</w:t>
-      </w:r>
-    </w:p>
-    <w:p>
-      <w:pPr>
-        <w:pStyle w:val="Default"/>
-        <w:tabs>
-          <w:tab w:val="left" w:pos="3870"/>
-        </w:tabs>
-        <w:ind w:left="-180" w:right="-450"/>
-        <w:rPr>
-          <w:rFonts w:asciiTheme="minorHAnsi" w:hAnsiTheme="minorHAnsi" w:cstheme="minorHAnsi"/>
-          <w:sz w:val="20"/>
-          <w:szCs w:val="20"/>
-          <w:lang w:val="bg-BG"/>
-        </w:rPr>
-      </w:pPr>
-      <w:r>
-        <w:rPr>
-          <w:rFonts w:asciiTheme="minorHAnsi" w:hAnsiTheme="minorHAnsi" w:cstheme="minorHAnsi"/>
-          <w:sz w:val="20"/>
-          <w:szCs w:val="20"/>
-          <w:lang w:val="bg-BG"/>
-        </w:rPr>
-        <w:t xml:space="preserve"> споровете се решават в съда в съответсвие с разпоредбите на българското законодателство. </w:t>
-      </w:r>
-    </w:p>
-    <w:p>
-      <w:pPr>
-        <w:pStyle w:val="Default"/>
-        <w:tabs>
-          <w:tab w:val="left" w:pos="3870"/>
-        </w:tabs>
-        <w:ind w:left="-180" w:right="-450"/>
-        <w:rPr>
-          <w:rFonts w:asciiTheme="minorHAnsi" w:hAnsiTheme="minorHAnsi" w:cstheme="minorHAnsi"/>
-          <w:sz w:val="20"/>
-          <w:szCs w:val="20"/>
-          <w:lang w:val="bg-BG"/>
-        </w:rPr>
-      </w:pPr>
+        <w:t>Всички неуредени въпроси и възникнали спорове се решават по пътя на преговорите, ако това е невъз</w:t>
+      </w:r>
+      <w:r>
+        <w:rPr>
+          <w:rFonts w:asciiTheme="minorHAnsi" w:hAnsiTheme="minorHAnsi" w:cstheme="minorHAnsi"/>
+          <w:sz w:val="20"/>
+          <w:szCs w:val="20"/>
+          <w:lang w:val="bg-BG"/>
+        </w:rPr>
+        <w:t>-</w:t>
+      </w:r>
+    </w:p>
+    <w:p>
+      <w:pPr>
+        <w:pStyle w:val="Default"/>
+        <w:tabs>
+          <w:tab w:val="left" w:pos="3870"/>
+        </w:tabs>
+        <w:ind w:left="-180" w:right="-450"/>
+        <w:rPr>
+          <w:rFonts w:asciiTheme="minorHAnsi" w:hAnsiTheme="minorHAnsi" w:cstheme="minorHAnsi"/>
+          <w:sz w:val="20"/>
+          <w:szCs w:val="20"/>
+          <w:lang w:val="bg-BG"/>
+        </w:rPr>
+      </w:pPr>
+      <w:r>
+        <w:rPr>
+          <w:rFonts w:asciiTheme="minorHAnsi" w:hAnsiTheme="minorHAnsi" w:cstheme="minorHAnsi"/>
+          <w:sz w:val="20"/>
+          <w:szCs w:val="20"/>
+          <w:lang w:val="bg-BG"/>
+        </w:rPr>
+        <w:t>можно,</w:t>
+      </w:r>
+      <w:r>
+        <w:rPr>
+          <w:rFonts w:asciiTheme="minorHAnsi" w:hAnsiTheme="minorHAnsi" w:cstheme="minorHAnsi"/>
+          <w:sz w:val="20"/>
+          <w:szCs w:val="20"/>
+          <w:lang w:val="bg-BG"/>
+        </w:rPr>
+        <w:t xml:space="preserve"> </w:t>
+      </w:r>
+      <w:r>
+        <w:rPr>
+          <w:rFonts w:asciiTheme="minorHAnsi" w:hAnsiTheme="minorHAnsi" w:cstheme="minorHAnsi"/>
+          <w:sz w:val="20"/>
+          <w:szCs w:val="20"/>
+          <w:lang w:val="bg-BG"/>
+        </w:rPr>
+        <w:t xml:space="preserve">споровете се решават в съда в съответсвие с разпоредбите на българското законодателство. </w:t>
+      </w:r>
     </w:p>
     <w:p>
       <w:pPr>
@@ -4161,180 +5823,180 @@
           <w:szCs w:val="20"/>
           <w:lang w:val="bg-BG"/>
         </w:rPr>
+        <w:t xml:space="preserve">               </w:t>
+      </w:r>
+      <w:r>
+        <w:rPr>
+          <w:rFonts w:asciiTheme="minorHAnsi" w:hAnsiTheme="minorHAnsi" w:cstheme="minorHAnsi"/>
+          <w:sz w:val="20"/>
+          <w:szCs w:val="20"/>
+          <w:lang w:val="bg-BG"/>
+        </w:rPr>
+        <w:t xml:space="preserve">                   </w:t>
+      </w:r>
+      <w:r>
+        <w:rPr>
+          <w:rFonts w:asciiTheme="minorHAnsi" w:hAnsiTheme="minorHAnsi" w:cstheme="minorHAnsi"/>
+          <w:sz w:val="20"/>
+          <w:szCs w:val="20"/>
+          <w:lang w:val="bg-BG"/>
+        </w:rPr>
+        <w:t>…………………………...........</w:t>
+      </w:r>
+    </w:p>
+    <w:p>
+      <w:pPr>
+        <w:pStyle w:val="Default"/>
+        <w:tabs>
+          <w:tab w:val="left" w:pos="3870"/>
+        </w:tabs>
+        <w:ind w:left="-180" w:right="-450"/>
+        <w:rPr>
+          <w:rFonts w:asciiTheme="minorHAnsi" w:hAnsiTheme="minorHAnsi" w:cstheme="minorHAnsi"/>
+          <w:sz w:val="20"/>
+          <w:szCs w:val="20"/>
+          <w:lang w:val="bg-BG"/>
+        </w:rPr>
+      </w:pPr>
+      <w:r>
+        <w:rPr>
+          <w:rFonts w:asciiTheme="minorHAnsi" w:hAnsiTheme="minorHAnsi" w:cstheme="minorHAnsi"/>
+          <w:sz w:val="20"/>
+          <w:szCs w:val="20"/>
+          <w:lang w:val="bg-BG"/>
+        </w:rPr>
+        <w:t xml:space="preserve">       </w:t>
+      </w:r>
+      <w:r>
+        <w:rPr>
+          <w:rFonts w:asciiTheme="minorHAnsi" w:hAnsiTheme="minorHAnsi" w:cstheme="minorHAnsi"/>
+          <w:sz w:val="20"/>
+          <w:szCs w:val="20"/>
+          <w:lang w:val="bg-BG"/>
+        </w:rPr>
+        <w:t xml:space="preserve">Кирил Атанасов                                                                          </w:t>
+      </w:r>
+      <w:r>
+        <w:rPr>
+          <w:rFonts w:asciiTheme="minorHAnsi" w:hAnsiTheme="minorHAnsi" w:cstheme="minorHAnsi"/>
+          <w:sz w:val="20"/>
+          <w:szCs w:val="20"/>
+          <w:lang w:val="bg-BG"/>
+        </w:rPr>
+        <w:t xml:space="preserve">      </w:t>
+      </w:r>
+      <w:r>
+        <w:rPr>
+          <w:rFonts w:asciiTheme="minorHAnsi" w:hAnsiTheme="minorHAnsi" w:cstheme="minorHAnsi"/>
+          <w:sz w:val="20"/>
+          <w:szCs w:val="20"/>
+          <w:lang w:val="bg-BG"/>
+        </w:rPr>
+        <w:t xml:space="preserve">      </w:t>
+      </w:r>
+      <w:r>
+        <w:rPr>
+          <w:rFonts w:asciiTheme="minorHAnsi" w:hAnsiTheme="minorHAnsi" w:cstheme="minorHAnsi"/>
+          <w:sz w:val="20"/>
+          <w:szCs w:val="20"/>
+          <w:lang w:val="bg-BG"/>
+        </w:rPr>
+        <w:t xml:space="preserve"> {{ </w:t>
+      </w:r>
+      <w:r>
+        <w:rPr>
+          <w:rFonts w:asciiTheme="minorHAnsi" w:hAnsiTheme="minorHAnsi" w:cstheme="minorHAnsi"/>
+          <w:sz w:val="20"/>
+          <w:szCs w:val="20"/>
+          <w:lang w:val="bg-BG"/>
+        </w:rPr>
+        <w:t>contract_data</w:t>
+      </w:r>
+      <w:r>
+        <w:rPr>
+          <w:rFonts w:asciiTheme="minorHAnsi" w:hAnsiTheme="minorHAnsi" w:cstheme="minorHAnsi"/>
+          <w:sz w:val="20"/>
+          <w:szCs w:val="20"/>
+          <w:lang w:val="bg-BG"/>
+        </w:rPr>
+        <w:t>.first_name }} {{</w:t>
+      </w:r>
+      <w:r>
+        <w:rPr>
+          <w:rFonts w:asciiTheme="minorHAnsi" w:hAnsiTheme="minorHAnsi" w:cstheme="minorHAnsi"/>
+          <w:sz w:val="20"/>
+          <w:szCs w:val="20"/>
+          <w:lang w:val="bg-BG"/>
+        </w:rPr>
+        <w:t>contract_data</w:t>
+      </w:r>
+      <w:r>
+        <w:rPr>
+          <w:rFonts w:asciiTheme="minorHAnsi" w:hAnsiTheme="minorHAnsi" w:cstheme="minorHAnsi"/>
+          <w:sz w:val="20"/>
+          <w:szCs w:val="20"/>
+          <w:lang w:val="bg-BG"/>
+        </w:rPr>
+        <w:t>.family_name }}</w:t>
+      </w:r>
+    </w:p>
+    <w:p>
+      <w:pPr>
+        <w:tabs>
+          <w:tab w:val="left" w:pos="3870"/>
+        </w:tabs>
+        <w:ind w:left="-180" w:right="-450"/>
+        <w:rPr>
+          <w:rFonts w:cstheme="minorHAnsi"/>
+          <w:sz w:val="20"/>
+          <w:szCs w:val="20"/>
+          <w:lang w:val="bg-BG"/>
+        </w:rPr>
+      </w:pPr>
+      <w:r>
+        <w:rPr>
+          <w:rFonts w:cstheme="minorHAnsi"/>
+          <w:sz w:val="20"/>
+          <w:szCs w:val="20"/>
+          <w:lang w:val="bg-BG"/>
+        </w:rPr>
+        <w:t xml:space="preserve">     </w:t>
+      </w:r>
+      <w:r>
+        <w:rPr>
+          <w:rFonts w:cstheme="minorHAnsi"/>
+          <w:sz w:val="20"/>
+          <w:szCs w:val="20"/>
+          <w:lang w:val="bg-BG"/>
+        </w:rPr>
+        <w:t>/ИЗПЪЛНИТЕЛ/</w:t>
+      </w:r>
+      <w:r>
+        <w:rPr>
+          <w:rFonts w:cstheme="minorHAnsi"/>
+          <w:sz w:val="20"/>
+          <w:szCs w:val="20"/>
+          <w:lang w:val="bg-BG"/>
+        </w:rPr>
+        <w:t xml:space="preserve"> </w:t>
+      </w:r>
+      <w:r>
+        <w:rPr>
+          <w:rFonts w:cstheme="minorHAnsi"/>
+          <w:sz w:val="20"/>
+          <w:szCs w:val="20"/>
+          <w:lang w:val="bg-BG"/>
+        </w:rPr>
+        <w:t xml:space="preserve">                                                  </w:t>
+      </w:r>
+      <w:r>
+        <w:rPr>
+          <w:rFonts w:cstheme="minorHAnsi"/>
+          <w:sz w:val="20"/>
+          <w:szCs w:val="20"/>
+          <w:lang w:val="bg-BG"/>
+        </w:rPr>
         <w:t xml:space="preserve">                    </w:t>
-      </w:r>
-      <w:r>
-        <w:rPr>
-          <w:rFonts w:asciiTheme="minorHAnsi" w:hAnsiTheme="minorHAnsi" w:cstheme="minorHAnsi"/>
-          <w:sz w:val="20"/>
-          <w:szCs w:val="20"/>
-          <w:lang w:val="bg-BG"/>
-        </w:rPr>
-        <w:t xml:space="preserve">                    </w:t>
-      </w:r>
-      <w:r>
-        <w:rPr>
-          <w:rFonts w:asciiTheme="minorHAnsi" w:hAnsiTheme="minorHAnsi" w:cstheme="minorHAnsi"/>
-          <w:sz w:val="20"/>
-          <w:szCs w:val="20"/>
-          <w:lang w:val="bg-BG"/>
-        </w:rPr>
-        <w:t>…………………………...........</w:t>
-      </w:r>
-    </w:p>
-    <w:p>
-      <w:pPr>
-        <w:pStyle w:val="Default"/>
-        <w:tabs>
-          <w:tab w:val="left" w:pos="3870"/>
-        </w:tabs>
-        <w:ind w:left="-180" w:right="-450"/>
-        <w:rPr>
-          <w:rFonts w:asciiTheme="minorHAnsi" w:hAnsiTheme="minorHAnsi" w:cstheme="minorHAnsi"/>
-          <w:sz w:val="20"/>
-          <w:szCs w:val="20"/>
-          <w:lang w:val="bg-BG"/>
-        </w:rPr>
-      </w:pPr>
-      <w:r>
-        <w:rPr>
-          <w:rFonts w:asciiTheme="minorHAnsi" w:hAnsiTheme="minorHAnsi" w:cstheme="minorHAnsi"/>
-          <w:sz w:val="20"/>
-          <w:szCs w:val="20"/>
-          <w:lang w:val="bg-BG"/>
-        </w:rPr>
-        <w:t xml:space="preserve">       </w:t>
-      </w:r>
-      <w:r>
-        <w:rPr>
-          <w:rFonts w:asciiTheme="minorHAnsi" w:hAnsiTheme="minorHAnsi" w:cstheme="minorHAnsi"/>
-          <w:sz w:val="20"/>
-          <w:szCs w:val="20"/>
-          <w:lang w:val="bg-BG"/>
-        </w:rPr>
-        <w:t xml:space="preserve">Кирил Атанасов                                                                                  </w:t>
-      </w:r>
-      <w:r>
-        <w:rPr>
-          <w:rFonts w:asciiTheme="minorHAnsi" w:hAnsiTheme="minorHAnsi" w:cstheme="minorHAnsi"/>
-          <w:sz w:val="20"/>
-          <w:szCs w:val="20"/>
-          <w:lang w:val="bg-BG"/>
-        </w:rPr>
-        <w:t xml:space="preserve">       </w:t>
-      </w:r>
-      <w:r>
-        <w:rPr>
-          <w:rFonts w:asciiTheme="minorHAnsi" w:hAnsiTheme="minorHAnsi" w:cstheme="minorHAnsi"/>
-          <w:sz w:val="20"/>
-          <w:szCs w:val="20"/>
-          <w:lang w:val="bg-BG"/>
-        </w:rPr>
-        <w:t xml:space="preserve">      </w:t>
-      </w:r>
-      <w:r>
-        <w:rPr>
-          <w:rFonts w:asciiTheme="minorHAnsi" w:hAnsiTheme="minorHAnsi" w:cstheme="minorHAnsi"/>
-          <w:sz w:val="20"/>
-          <w:szCs w:val="20"/>
-          <w:lang w:val="bg-BG"/>
-        </w:rPr>
-        <w:t xml:space="preserve"> {{ </w:t>
-      </w:r>
-      <w:r>
-        <w:rPr>
-          <w:rFonts w:asciiTheme="minorHAnsi" w:hAnsiTheme="minorHAnsi" w:cstheme="minorHAnsi"/>
-          <w:sz w:val="20"/>
-          <w:szCs w:val="20"/>
-          <w:lang w:val="bg-BG"/>
-        </w:rPr>
-        <w:t>contract_data</w:t>
-      </w:r>
-      <w:r>
-        <w:rPr>
-          <w:rFonts w:asciiTheme="minorHAnsi" w:hAnsiTheme="minorHAnsi" w:cstheme="minorHAnsi"/>
-          <w:sz w:val="20"/>
-          <w:szCs w:val="20"/>
-          <w:lang w:val="bg-BG"/>
-        </w:rPr>
-        <w:t>.first_name }} {{</w:t>
-      </w:r>
-      <w:r>
-        <w:rPr>
-          <w:rFonts w:asciiTheme="minorHAnsi" w:hAnsiTheme="minorHAnsi" w:cstheme="minorHAnsi"/>
-          <w:sz w:val="20"/>
-          <w:szCs w:val="20"/>
-          <w:lang w:val="bg-BG"/>
-        </w:rPr>
-        <w:t>contract_data</w:t>
-      </w:r>
-      <w:r>
-        <w:rPr>
-          <w:rFonts w:asciiTheme="minorHAnsi" w:hAnsiTheme="minorHAnsi" w:cstheme="minorHAnsi"/>
-          <w:sz w:val="20"/>
-          <w:szCs w:val="20"/>
-          <w:lang w:val="bg-BG"/>
-        </w:rPr>
-        <w:t>.family_name }}</w:t>
-      </w:r>
-    </w:p>
-    <w:p>
-      <w:pPr>
-        <w:tabs>
-          <w:tab w:val="left" w:pos="3870"/>
-        </w:tabs>
-        <w:ind w:left="-180" w:right="-450"/>
-        <w:rPr>
-          <w:rFonts w:cstheme="minorHAnsi"/>
-          <w:sz w:val="20"/>
-          <w:szCs w:val="20"/>
-          <w:lang w:val="bg-BG"/>
-        </w:rPr>
-      </w:pPr>
-      <w:r>
-        <w:rPr>
-          <w:rFonts w:cstheme="minorHAnsi"/>
-          <w:sz w:val="20"/>
-          <w:szCs w:val="20"/>
-          <w:lang w:val="bg-BG"/>
-        </w:rPr>
-        <w:t xml:space="preserve">     </w:t>
-      </w:r>
-      <w:r>
-        <w:rPr>
-          <w:rFonts w:cstheme="minorHAnsi"/>
-          <w:sz w:val="20"/>
-          <w:szCs w:val="20"/>
-          <w:lang w:val="bg-BG"/>
-        </w:rPr>
-        <w:t>/ИЗПЪЛНИТЕЛ/</w:t>
-      </w:r>
-      <w:r>
-        <w:rPr>
-          <w:rFonts w:cstheme="minorHAnsi"/>
-          <w:sz w:val="20"/>
-          <w:szCs w:val="20"/>
-          <w:lang w:val="bg-BG"/>
-        </w:rPr>
-        <w:t xml:space="preserve"> </w:t>
-      </w:r>
-      <w:r>
-        <w:rPr>
-          <w:rFonts w:cstheme="minorHAnsi"/>
-          <w:sz w:val="20"/>
-          <w:szCs w:val="20"/>
-          <w:lang w:val="bg-BG"/>
-        </w:rPr>
-        <w:t xml:space="preserve">                                                    </w:t>
-      </w:r>
-      <w:r>
-        <w:rPr>
-          <w:rFonts w:cstheme="minorHAnsi"/>
-          <w:sz w:val="20"/>
-          <w:szCs w:val="20"/>
-          <w:lang w:val="bg-BG"/>
-        </w:rPr>
-        <w:t xml:space="preserve">                        </w:t>
       </w:r>
       <w:r>
         <w:rPr>
@@ -4371,7 +6033,7 @@
     </w:p>
     <w:sectPr>
       <w:pgSz w:w="12240" w:h="15840"/>
-      <w:pgMar w:top="810" w:right="1440" w:bottom="810" w:left="1440" w:header="720" w:footer="720" w:gutter="0"/>
+      <w:pgMar w:top="810" w:right="1620" w:bottom="720" w:left="1440" w:header="720" w:footer="720" w:gutter="0"/>
       <w:cols w:space="720"/>
       <w:docGrid w:linePitch="360"/>
     </w:sectPr>

</xml_diff>